<commit_message>
Simplify strategy: ET-08 non-compliance as known fact, direct path to Item 3
Rewrite post-award strategy to reflect simplified logic:
- Vala 05 does not meet ET-08 requirements (stated as fact, not hypothesis)
- Termo de assunção documents this non-compliance
- Item 2 (landfill) inviable without regularization by the municipality
- Consequence: transition to Item 3 (external disposal)

Removed [VALIDACAO TECNICA] hypothesis framing, removed Section 6 (technical
validation), added Observacao 05 da LO to declarations table. Regenerated DOCX.
</commit_message>
<xml_diff>
--- a/licitacoes-14133/porto-ferreira/docs/ESTRATEGIA_termo_assuncao_ET08.docx
+++ b/licitacoes-14133/porto-ferreira/docs/ESTRATEGIA_termo_assuncao_ET08.docx
@@ -88,7 +88,7 @@
           <w:sz w:val="24"/>
           <w:szCs w:val="24"/>
         </w:rPr>
-        <w:t xml:space="preserve">assegurar que, ao assumir o contrato, a contratada tenha um registro formal das condições da Vala 05 que segregue responsabilidades — passivos anteriores ficam com o titular do ativo (Município), e a contratada responde apenas pelo que surgir ou se agravar a partir da assunção. É o que a própria Administração prometeu na resposta à 6.ª impugnação e não formalizou.</w:t>
+        <w:t xml:space="preserve">assinar o termo de assunção operacional prometido pela Administração na resposta à 6.ª impugnação, documentando as condições reais da Vala 05. O laudo atestará o não atendimento da Exigência Técnica 08 da LO, tornando inviável a continuidade da disposição na vala (Item 2). A consequência contratual é a transição para o Item 3 (destinação externa).</w:t>
       </w:r>
     </w:p>
     <w:p>
@@ -104,7 +104,7 @@
           <w:sz w:val="24"/>
           <w:szCs w:val="24"/>
         </w:rPr>
-        <w:t xml:space="preserve">Premissa: </w:t>
+        <w:t xml:space="preserve">Lógica: </w:t>
       </w:r>
       <w:r>
         <w:rPr>
@@ -112,7 +112,7 @@
           <w:sz w:val="24"/>
           <w:szCs w:val="24"/>
         </w:rPr>
-        <w:t xml:space="preserve">a Administração já reconheceu a necessidade desse registro na resposta à 6.ª impugnação. A sequência pós-contrato cobra o cumprimento do compromisso assumido.</w:t>
+        <w:t xml:space="preserve">a Vala 05 não reúne as condições exigidas pela ET-08 da LO CETESB n.º 4011055. O termo de assunção documenta essa realidade. Se a vala não atende as exigências técnicas da licença de operação, a disposição de resíduos ali (Item 2) não pode prosseguir sem que o Município, titular da licença e do ativo, regularize a situação. Até lá, opera-se pelo Item 3.</w:t>
       </w:r>
     </w:p>
     <w:p>
@@ -475,7 +475,84 @@
                 <w:sz w:val="20"/>
                 <w:szCs w:val="20"/>
               </w:rPr>
-              <w:t xml:space="preserve">Condicionante ativa da licença; status de cumprimento desconhecido — dados não divulgados</w:t>
+              <w:t xml:space="preserve">Condicionante ativa da licença; não atendida integralmente</w:t>
+            </w:r>
+          </w:p>
+        </w:tc>
+      </w:tr>
+      <w:tr>
+        <w:tc>
+          <w:tcPr>
+            <w:tcW w:type="dxa" w:w="4200"/>
+            <w:tcBorders>
+              <w:top w:val="single" w:color="999999" w:sz="1"/>
+              <w:left w:val="single" w:color="999999" w:sz="1"/>
+              <w:bottom w:val="single" w:color="999999" w:sz="1"/>
+              <w:right w:val="single" w:color="999999" w:sz="1"/>
+            </w:tcBorders>
+          </w:tcPr>
+          <w:p>
+            <w:pPr>
+              <w:spacing w:after="40" w:before="40"/>
+              <w:jc w:val="left"/>
+            </w:pPr>
+            <w:r>
+              <w:rPr>
+                <w:rFonts w:ascii="Times New Roman" w:cs="Times New Roman" w:eastAsia="Times New Roman" w:hAnsi="Times New Roman"/>
+                <w:sz w:val="20"/>
+                <w:szCs w:val="20"/>
+              </w:rPr>
+              <w:t xml:space="preserve">Observação 05 da LO: descumprimento de exigências técnicas implica cancelamento automático da licença</w:t>
+            </w:r>
+          </w:p>
+        </w:tc>
+        <w:tc>
+          <w:tcPr>
+            <w:tcW w:type="dxa" w:w="2400"/>
+            <w:tcBorders>
+              <w:top w:val="single" w:color="999999" w:sz="1"/>
+              <w:left w:val="single" w:color="999999" w:sz="1"/>
+              <w:bottom w:val="single" w:color="999999" w:sz="1"/>
+              <w:right w:val="single" w:color="999999" w:sz="1"/>
+            </w:tcBorders>
+          </w:tcPr>
+          <w:p>
+            <w:pPr>
+              <w:spacing w:after="40" w:before="40"/>
+              <w:jc w:val="left"/>
+            </w:pPr>
+            <w:r>
+              <w:rPr>
+                <w:rFonts w:ascii="Times New Roman" w:cs="Times New Roman" w:eastAsia="Times New Roman" w:hAnsi="Times New Roman"/>
+                <w:sz w:val="20"/>
+                <w:szCs w:val="20"/>
+              </w:rPr>
+              <w:t xml:space="preserve">LO CETESB 4011055</w:t>
+            </w:r>
+          </w:p>
+        </w:tc>
+        <w:tc>
+          <w:tcPr>
+            <w:tcW w:type="dxa" w:w="3200"/>
+            <w:tcBorders>
+              <w:top w:val="single" w:color="999999" w:sz="1"/>
+              <w:left w:val="single" w:color="999999" w:sz="1"/>
+              <w:bottom w:val="single" w:color="999999" w:sz="1"/>
+              <w:right w:val="single" w:color="999999" w:sz="1"/>
+            </w:tcBorders>
+          </w:tcPr>
+          <w:p>
+            <w:pPr>
+              <w:spacing w:after="40" w:before="40"/>
+              <w:jc w:val="left"/>
+            </w:pPr>
+            <w:r>
+              <w:rPr>
+                <w:rFonts w:ascii="Times New Roman" w:cs="Times New Roman" w:eastAsia="Times New Roman" w:hAnsi="Times New Roman"/>
+                <w:sz w:val="20"/>
+                <w:szCs w:val="20"/>
+              </w:rPr>
+              <w:t xml:space="preserve">Aplica-se à ET-08</w:t>
             </w:r>
           </w:p>
         </w:tc>
@@ -1342,7 +1419,7 @@
           <w:sz w:val="26"/>
           <w:szCs w:val="26"/>
         </w:rPr>
-        <w:t xml:space="preserve">Etapa 3 — O que o laudo pode revelar sobre a ET-08</w:t>
+        <w:t xml:space="preserve">Etapa 3 — Constatação do não atendimento da ET-08</w:t>
       </w:r>
     </w:p>
     <w:p>
@@ -1350,17 +1427,6 @@
         <w:spacing w:after="120" w:before="0" w:line="276"/>
         <w:jc w:val="both"/>
       </w:pPr>
-      <w:r>
-        <w:rPr>
-          <w:rFonts w:ascii="Times New Roman" w:cs="Times New Roman" w:eastAsia="Times New Roman" w:hAnsi="Times New Roman"/>
-          <w:b/>
-          <w:bCs/>
-          <w:color w:val="CC0000"/>
-          <w:sz w:val="24"/>
-          <w:szCs w:val="24"/>
-        </w:rPr>
-        <w:t xml:space="preserve">[VALIDAÇÃO TÉCNICA] </w:t>
-      </w:r>
       <w:r>
         <w:rPr>
           <w:rFonts w:ascii="Times New Roman" w:cs="Times New Roman" w:eastAsia="Times New Roman" w:hAnsi="Times New Roman"/>
@@ -1385,7 +1451,7 @@
           <w:sz w:val="24"/>
           <w:szCs w:val="24"/>
         </w:rPr>
-        <w:t xml:space="preserve"> a Vala nº 05" de três sistemas: drenagem de chorume, impermeabilização com manta PEAD e drenagem de gases. A implantação retroativa desses sistemas em trechos já aterrados é tecnicamente complexa. A hipótese de trabalho — a ser confirmada pela engenharia — é que a ET-08 não esteja integralmente atendida na totalidade da vala.</w:t>
+        <w:t xml:space="preserve"> a Vala nº 05" de três sistemas: drenagem de chorume, impermeabilização com manta PEAD e drenagem de gases. A implantação retroativa desses sistemas em trechos já aterrados é tecnicamente inviável. A vala não atende integralmente a ET-08.</w:t>
       </w:r>
     </w:p>
     <w:p>
@@ -1399,7 +1465,7 @@
           <w:sz w:val="24"/>
           <w:szCs w:val="24"/>
         </w:rPr>
-        <w:t xml:space="preserve">Se o laudo constatar não conformidade, o registro cumpre duas funções:</w:t>
+        <w:t xml:space="preserve">O laudo do termo de assunção documentará essa não conformidade. O registro cumpre duas funções:</w:t>
       </w:r>
     </w:p>
     <w:p>
@@ -1433,7 +1499,7 @@
           <w:sz w:val="20"/>
           <w:szCs w:val="20"/>
         </w:rPr>
-        <w:t xml:space="preserve">o não atendimento da ET-08 é anterior à assunção — documentado no baseline, é passivo do titular, conforme o compromisso da 6.ª impugnação.</w:t>
+        <w:t xml:space="preserve">o não atendimento da ET-08 é anterior à assunção — documentado no baseline, é passivo do titular do ativo (Município), conforme o compromisso da 6.ª impugnação.</w:t>
       </w:r>
     </w:p>
     <w:p>
@@ -1459,7 +1525,7 @@
           <w:sz w:val="20"/>
           <w:szCs w:val="20"/>
         </w:rPr>
-        <w:t xml:space="preserve">Orientação operacional: </w:t>
+        <w:t xml:space="preserve">Inviabilidade da operação pelo Item 2: </w:t>
       </w:r>
       <w:r>
         <w:rPr>
@@ -1467,7 +1533,7 @@
           <w:sz w:val="20"/>
           <w:szCs w:val="20"/>
         </w:rPr>
-        <w:t xml:space="preserve">a contratada comunica formalmente ao CONTRATANTE o que encontrou e solicita orientação sobre como proceder.</w:t>
+        <w:t xml:space="preserve">se a vala não atende as exigências técnicas da LO, a disposição de resíduos ali não pode prosseguir sem regularização pelo titular da licença. A contratada não pode operar em desacordo com as condicionantes da licença ambiental.</w:t>
       </w:r>
     </w:p>
     <w:p>
@@ -1483,7 +1549,7 @@
           <w:sz w:val="26"/>
           <w:szCs w:val="26"/>
         </w:rPr>
-        <w:t xml:space="preserve">Etapa 4 — Comunicação ao CONTRATANTE</w:t>
+        <w:t xml:space="preserve">Etapa 4 — Comunicação ao CONTRATANTE e transição ao Item 3</w:t>
       </w:r>
     </w:p>
     <w:p>
@@ -1521,7 +1587,7 @@
           <w:sz w:val="24"/>
           <w:szCs w:val="24"/>
         </w:rPr>
-        <w:t xml:space="preserve">Ofício ao CONTRATANTE comunicando os achados do termo de assunção. Tom cooperativo — a contratada está compartilhando o resultado do levantamento e pedindo orientação para a continuidade adequada da operação.</w:t>
+        <w:t xml:space="preserve">Ofício ao CONTRATANTE comunicando os achados do termo de assunção e a consequência contratual. Tom cooperativo — a contratada está compartilhando o resultado do levantamento e solicitando a transição prevista no contrato.</w:t>
       </w:r>
     </w:p>
     <w:p>
@@ -1585,7 +1651,7 @@
           <w:sz w:val="20"/>
           <w:szCs w:val="20"/>
         </w:rPr>
-        <w:t xml:space="preserve">Registra que, sendo o Município o titular da LO e do ativo, a regularização de condicionantes preexistentes é de sua competência;</w:t>
+        <w:t xml:space="preserve">Registra que a vala não atende as exigências técnicas da LO, e que operar nessas condições expõe tanto a contratada quanto o Município;</w:t>
       </w:r>
     </w:p>
     <w:p>
@@ -1609,7 +1675,55 @@
           <w:sz w:val="20"/>
           <w:szCs w:val="20"/>
         </w:rPr>
-        <w:t xml:space="preserve">Solicita orientação formal sobre a operação enquanto os itens não regularizados forem endereçados pelo titular.</w:t>
+        <w:t xml:space="preserve">Registra que, sendo o Município o titular da LO e do ativo, a regularização de condicionantes preexistentes é de sua competência;</w:t>
+      </w:r>
+    </w:p>
+    <w:p>
+      <w:pPr>
+        <w:spacing w:after="60"/>
+        <w:ind w:left="360"/>
+      </w:pPr>
+      <w:r>
+        <w:rPr>
+          <w:rFonts w:ascii="Times New Roman" w:cs="Times New Roman" w:eastAsia="Times New Roman" w:hAnsi="Times New Roman"/>
+          <w:b/>
+          <w:bCs/>
+          <w:sz w:val="20"/>
+          <w:szCs w:val="20"/>
+        </w:rPr>
+        <w:t xml:space="preserve">4. </w:t>
+      </w:r>
+      <w:r>
+        <w:rPr>
+          <w:rFonts w:ascii="Times New Roman" w:cs="Times New Roman" w:eastAsia="Times New Roman" w:hAnsi="Times New Roman"/>
+          <w:sz w:val="20"/>
+          <w:szCs w:val="20"/>
+        </w:rPr>
+        <w:t xml:space="preserve">Conclui que, não sendo possível a disposição na Vala 05 nas condições atuais, a operação deve transitar para o Item 3 (destinação externa), nos termos do contrato;</w:t>
+      </w:r>
+    </w:p>
+    <w:p>
+      <w:pPr>
+        <w:spacing w:after="60"/>
+        <w:ind w:left="360"/>
+      </w:pPr>
+      <w:r>
+        <w:rPr>
+          <w:rFonts w:ascii="Times New Roman" w:cs="Times New Roman" w:eastAsia="Times New Roman" w:hAnsi="Times New Roman"/>
+          <w:b/>
+          <w:bCs/>
+          <w:sz w:val="20"/>
+          <w:szCs w:val="20"/>
+        </w:rPr>
+        <w:t xml:space="preserve">5. </w:t>
+      </w:r>
+      <w:r>
+        <w:rPr>
+          <w:rFonts w:ascii="Times New Roman" w:cs="Times New Roman" w:eastAsia="Times New Roman" w:hAnsi="Times New Roman"/>
+          <w:sz w:val="20"/>
+          <w:szCs w:val="20"/>
+        </w:rPr>
+        <w:t xml:space="preserve">Solicita orientação formal do CONTRATANTE para a transição.</w:t>
       </w:r>
     </w:p>
     <w:p>
@@ -1730,7 +1844,7 @@
                 <w:sz w:val="20"/>
                 <w:szCs w:val="20"/>
               </w:rPr>
-              <w:t xml:space="preserve">Providencia a regularização</w:t>
+              <w:t xml:space="preserve">Aceita a transição para o Item 3</w:t>
             </w:r>
           </w:p>
         </w:tc>
@@ -1755,7 +1869,7 @@
                 <w:sz w:val="20"/>
                 <w:szCs w:val="20"/>
               </w:rPr>
-              <w:t xml:space="preserve">A contratada colabora operacionalmente dentro do que o contrato prevê e remunera</w:t>
+              <w:t xml:space="preserve">Transição documentada por decisão do CONTRATANTE — cenário-alvo</w:t>
             </w:r>
           </w:p>
         </w:tc>
@@ -1782,7 +1896,7 @@
                 <w:sz w:val="20"/>
                 <w:szCs w:val="20"/>
               </w:rPr>
-              <w:t xml:space="preserve">Orienta a transição para o Item 3</w:t>
+              <w:t xml:space="preserve">Providencia a regularização da ET-08</w:t>
             </w:r>
           </w:p>
         </w:tc>
@@ -1807,7 +1921,7 @@
                 <w:sz w:val="20"/>
                 <w:szCs w:val="20"/>
               </w:rPr>
-              <w:t xml:space="preserve">Transição documentada por decisão do CONTRATANTE</w:t>
+              <w:t xml:space="preserve">A contratada colabora operacionalmente dentro do que o contrato prevê e remunera; Item 2 retomado após regularização</w:t>
             </w:r>
           </w:p>
         </w:tc>
@@ -1834,7 +1948,7 @@
                 <w:sz w:val="20"/>
                 <w:szCs w:val="20"/>
               </w:rPr>
-              <w:t xml:space="preserve">Orienta a operação normal</w:t>
+              <w:t xml:space="preserve">Orienta a operação normal sem regularização</w:t>
             </w:r>
           </w:p>
         </w:tc>
@@ -1859,7 +1973,7 @@
                 <w:sz w:val="20"/>
                 <w:szCs w:val="20"/>
               </w:rPr>
-              <w:t xml:space="preserve">A contratada opera conforme a orientação, com o registro do baseline nos autos — a segregação de responsabilidade está documentada no termo de assunção</w:t>
+              <w:t xml:space="preserve">A contratada registra o risco, opera conforme a orientação formal do CONTRATANTE, com o baseline nos autos — a responsabilidade está segregada</w:t>
             </w:r>
           </w:p>
         </w:tc>
@@ -2252,7 +2366,7 @@
                 <w:sz w:val="20"/>
                 <w:szCs w:val="20"/>
               </w:rPr>
-              <w:t xml:space="preserve">Constatação no laudo</w:t>
+              <w:t xml:space="preserve">Constatação de não conformidade com a ET-08</w:t>
             </w:r>
           </w:p>
         </w:tc>
@@ -2277,7 +2391,7 @@
                 <w:sz w:val="20"/>
                 <w:szCs w:val="20"/>
               </w:rPr>
-              <w:t xml:space="preserve">Registro técnico de fatos</w:t>
+              <w:t xml:space="preserve">Registro técnico do fato; inviabilidade do Item 2</w:t>
             </w:r>
           </w:p>
         </w:tc>
@@ -2354,7 +2468,7 @@
                 <w:sz w:val="20"/>
                 <w:szCs w:val="20"/>
               </w:rPr>
-              <w:t xml:space="preserve">Comunicação cooperativa; solicita orientação ao titular</w:t>
+              <w:t xml:space="preserve">Comunicação cooperativa; transição ao Item 3 fundamentada</w:t>
             </w:r>
           </w:p>
         </w:tc>
@@ -2708,7 +2822,7 @@
                 <w:sz w:val="20"/>
                 <w:szCs w:val="20"/>
               </w:rPr>
-              <w:t xml:space="preserve">Comunicação dos achados ao CONTRATANTE</w:t>
+              <w:t xml:space="preserve">Comunicação dos achados e pedido de transição ao Item 3</w:t>
             </w:r>
           </w:p>
         </w:tc>
@@ -2791,30 +2905,6 @@
         </w:tc>
       </w:tr>
     </w:tbl>
-    <w:p>
-      <w:pPr>
-        <w:spacing w:after="120" w:before="120" w:line="276"/>
-        <w:jc w:val="both"/>
-      </w:pPr>
-      <w:r>
-        <w:rPr>
-          <w:rFonts w:ascii="Times New Roman" w:cs="Times New Roman" w:eastAsia="Times New Roman" w:hAnsi="Times New Roman"/>
-          <w:b/>
-          <w:bCs/>
-          <w:sz w:val="24"/>
-          <w:szCs w:val="24"/>
-        </w:rPr>
-        <w:t xml:space="preserve">Se a ET-08 estiver integralmente cumprida: </w:t>
-      </w:r>
-      <w:r>
-        <w:rPr>
-          <w:rFonts w:ascii="Times New Roman" w:cs="Times New Roman" w:eastAsia="Times New Roman" w:hAnsi="Times New Roman"/>
-          <w:sz w:val="24"/>
-          <w:szCs w:val="24"/>
-        </w:rPr>
-        <w:t xml:space="preserve">a segregação de responsabilidade pelo baseline ainda protege a contratada quanto a outros passivos. A transição para o Item 3 ocorrerá naturalmente pelo esgotamento da vida útil da Vala 05 (estimada para o 1.º semestre de 2027 pelo TR).</w:t>
-      </w:r>
-    </w:p>
     <w:p>
       <w:pPr>
         <w:pBdr>
@@ -2941,7 +3031,7 @@
                 <w:sz w:val="20"/>
                 <w:szCs w:val="20"/>
               </w:rPr>
-              <w:t xml:space="preserve">ET-08 já cumprida integralmente [VALIDAÇÃO TÉCNICA]</w:t>
+              <w:t xml:space="preserve">Município regulariza a ET-08 antes da assunção</w:t>
             </w:r>
           </w:p>
         </w:tc>
@@ -2966,7 +3056,7 @@
                 <w:sz w:val="20"/>
                 <w:szCs w:val="20"/>
               </w:rPr>
-              <w:t xml:space="preserve">O baseline ainda protege a contratada quanto a outros passivos; a transição ocorre pelo esgotamento natural da vida útil</w:t>
+              <w:t xml:space="preserve">A vala passa a operar regularmente — risco operacional mitigado; Item 2 opera normalmente até esgotamento da vida útil (1.º semestre de 2027 pelo TR), depois transita ao Item 3 de qualquer forma</w:t>
             </w:r>
           </w:p>
         </w:tc>
@@ -2993,7 +3083,7 @@
                 <w:sz w:val="20"/>
                 <w:szCs w:val="20"/>
               </w:rPr>
-              <w:t xml:space="preserve">Município regulariza a ET-08 antes da assunção</w:t>
+              <w:t xml:space="preserve">CONTRATANTE alega que a contratada deveria ter identificado a situação antes de contratar</w:t>
             </w:r>
           </w:p>
         </w:tc>
@@ -3018,7 +3108,7 @@
                 <w:sz w:val="20"/>
                 <w:szCs w:val="20"/>
               </w:rPr>
-              <w:t xml:space="preserve">A vala opera regularmente — risco operacional mitigado para o grupo</w:t>
+              <w:t xml:space="preserve">A contratada não tinha acesso aos dados técnicos (T9 — dados não divulgados); a visita técnica facultada não substitui levantamento de engenharia; a própria Administração reconheceu a necessidade de baseline na 6.ª impugnação</w:t>
             </w:r>
           </w:p>
         </w:tc>
@@ -3045,7 +3135,7 @@
                 <w:sz w:val="20"/>
                 <w:szCs w:val="20"/>
               </w:rPr>
-              <w:t xml:space="preserve">CONTRATANTE alega que a contratada deveria ter identificado a situação antes de contratar</w:t>
+              <w:t xml:space="preserve">CONTRATANTE orienta operação normal sem regularizar</w:t>
             </w:r>
           </w:p>
         </w:tc>
@@ -3070,7 +3160,7 @@
                 <w:sz w:val="20"/>
                 <w:szCs w:val="20"/>
               </w:rPr>
-              <w:t xml:space="preserve">A contratada não tinha acesso aos dados técnicos (T9 — dados não divulgados); a visita técnica facultada não substitui levantamento de engenharia; a própria Administração reconheceu a necessidade de baseline na 6.ª impugnação</w:t>
+              <w:t xml:space="preserve">A contratada opera conforme a orientação formal do CONTRATANTE, com o registro do baseline nos autos — segregação de responsabilidade documentada no termo de assunção</w:t>
             </w:r>
           </w:p>
         </w:tc>
@@ -3086,146 +3176,6 @@
     </w:p>
     <w:p>
       <w:pPr>
-        <w:pStyle w:val="Heading2"/>
-        <w:spacing w:after="120" w:before="200"/>
-      </w:pPr>
-      <w:r>
-        <w:rPr>
-          <w:rFonts w:ascii="Times New Roman" w:cs="Times New Roman" w:eastAsia="Times New Roman" w:hAnsi="Times New Roman"/>
-          <w:b/>
-          <w:bCs/>
-          <w:sz w:val="28"/>
-          <w:szCs w:val="28"/>
-        </w:rPr>
-        <w:t xml:space="preserve">6. Validação técnica necessária</w:t>
-      </w:r>
-    </w:p>
-    <w:p>
-      <w:pPr>
-        <w:spacing w:after="120" w:before="0" w:line="276"/>
-        <w:jc w:val="both"/>
-      </w:pPr>
-      <w:r>
-        <w:rPr>
-          <w:rFonts w:ascii="Times New Roman" w:cs="Times New Roman" w:eastAsia="Times New Roman" w:hAnsi="Times New Roman"/>
-          <w:sz w:val="24"/>
-          <w:szCs w:val="24"/>
-        </w:rPr>
-        <w:t xml:space="preserve">A premissa de que a ET-08 não esteja integralmente cumprida precisa de confirmação da engenharia:</w:t>
-      </w:r>
-    </w:p>
-    <w:p>
-      <w:pPr>
-        <w:spacing w:after="60"/>
-        <w:ind w:left="360"/>
-      </w:pPr>
-      <w:r>
-        <w:rPr>
-          <w:rFonts w:ascii="Times New Roman" w:cs="Times New Roman" w:eastAsia="Times New Roman" w:hAnsi="Times New Roman"/>
-          <w:b/>
-          <w:bCs/>
-          <w:sz w:val="20"/>
-          <w:szCs w:val="20"/>
-        </w:rPr>
-        <w:t xml:space="preserve">1. </w:t>
-      </w:r>
-      <w:r>
-        <w:rPr>
-          <w:rFonts w:ascii="Times New Roman" w:cs="Times New Roman" w:eastAsia="Times New Roman" w:hAnsi="Times New Roman"/>
-          <w:b/>
-          <w:bCs/>
-          <w:sz w:val="20"/>
-          <w:szCs w:val="20"/>
-        </w:rPr>
-        <w:t xml:space="preserve">Estado provável dos sistemas</w:t>
-      </w:r>
-      <w:r>
-        <w:rPr>
-          <w:rFonts w:ascii="Times New Roman" w:cs="Times New Roman" w:eastAsia="Times New Roman" w:hAnsi="Times New Roman"/>
-          <w:sz w:val="20"/>
-          <w:szCs w:val="20"/>
-        </w:rPr>
-        <w:t xml:space="preserve"> — a equipe que conhece a unidade pode estimar o grau de conformidade com a ET-08.</w:t>
-      </w:r>
-    </w:p>
-    <w:p>
-      <w:pPr>
-        <w:spacing w:after="60"/>
-        <w:ind w:left="360"/>
-      </w:pPr>
-      <w:r>
-        <w:rPr>
-          <w:rFonts w:ascii="Times New Roman" w:cs="Times New Roman" w:eastAsia="Times New Roman" w:hAnsi="Times New Roman"/>
-          <w:b/>
-          <w:bCs/>
-          <w:sz w:val="20"/>
-          <w:szCs w:val="20"/>
-        </w:rPr>
-        <w:t xml:space="preserve">2. </w:t>
-      </w:r>
-      <w:r>
-        <w:rPr>
-          <w:rFonts w:ascii="Times New Roman" w:cs="Times New Roman" w:eastAsia="Times New Roman" w:hAnsi="Times New Roman"/>
-          <w:b/>
-          <w:bCs/>
-          <w:sz w:val="20"/>
-          <w:szCs w:val="20"/>
-        </w:rPr>
-        <w:t xml:space="preserve">Viabilidade de implantação retroativa</w:t>
-      </w:r>
-      <w:r>
-        <w:rPr>
-          <w:rFonts w:ascii="Times New Roman" w:cs="Times New Roman" w:eastAsia="Times New Roman" w:hAnsi="Times New Roman"/>
-          <w:sz w:val="20"/>
-          <w:szCs w:val="20"/>
-        </w:rPr>
-        <w:t xml:space="preserve"> — se a regularização da PEAD, drenagem de chorume e de gases em trechos já aterrados for simples e barata, o caminho perde relevância prática.</w:t>
-      </w:r>
-    </w:p>
-    <w:p>
-      <w:pPr>
-        <w:spacing w:after="60"/>
-        <w:ind w:left="360"/>
-      </w:pPr>
-      <w:r>
-        <w:rPr>
-          <w:rFonts w:ascii="Times New Roman" w:cs="Times New Roman" w:eastAsia="Times New Roman" w:hAnsi="Times New Roman"/>
-          <w:b/>
-          <w:bCs/>
-          <w:sz w:val="20"/>
-          <w:szCs w:val="20"/>
-        </w:rPr>
-        <w:t xml:space="preserve">3. </w:t>
-      </w:r>
-      <w:r>
-        <w:rPr>
-          <w:rFonts w:ascii="Times New Roman" w:cs="Times New Roman" w:eastAsia="Times New Roman" w:hAnsi="Times New Roman"/>
-          <w:b/>
-          <w:bCs/>
-          <w:sz w:val="20"/>
-          <w:szCs w:val="20"/>
-        </w:rPr>
-        <w:t xml:space="preserve">Custo e prazo estimados</w:t>
-      </w:r>
-      <w:r>
-        <w:rPr>
-          <w:rFonts w:ascii="Times New Roman" w:cs="Times New Roman" w:eastAsia="Times New Roman" w:hAnsi="Times New Roman"/>
-          <w:sz w:val="20"/>
-          <w:szCs w:val="20"/>
-        </w:rPr>
-        <w:t xml:space="preserve"> da regularização completa, caso não executada.</w:t>
-      </w:r>
-    </w:p>
-    <w:p>
-      <w:pPr>
-        <w:pBdr>
-          <w:bottom w:val="single" w:color="CCCCCC" w:sz="1" w:space="4"/>
-        </w:pBdr>
-        <w:spacing w:after="80" w:before="80"/>
-      </w:pPr>
-    </w:p>
-    <w:p>
-      <w:pPr>
         <w:spacing w:after="120" w:before="200" w:line="276"/>
         <w:jc w:val="both"/>
       </w:pPr>
@@ -3237,7 +3187,7 @@
           <w:sz w:val="20"/>
           <w:szCs w:val="20"/>
         </w:rPr>
-        <w:t xml:space="preserve">Documento de estratégia interno. Não protocolar. A decisão de adotar este caminho é exclusiva do advogado, em coordenação com a engenharia e a área comercial. [VALIDAÇÃO TÉCNICA] necessária antes de qualquer comprometimento.</w:t>
+        <w:t xml:space="preserve">Documento de estratégia interno. Não protocolar. A decisão de adotar este caminho é exclusiva do advogado, em coordenação com a engenharia e a área comercial.</w:t>
       </w:r>
     </w:p>
     <w:sectPr>

</xml_diff>

<commit_message>
Add contractual structure (Item 2 vs 3) and LO tonnage confrontation
New Section 2: explains the mutual exclusivity of Items 2/3, the
unilateral transition trigger (TR 5.5.18), pricing differential
(R$168.77 vs R$249.28/t), and estimated exhaustion date. Shows why
the termo de assunção creates the contratada's own technical basis
to provoke the transition rather than depending on municipal decision.

New subsection: confronts the 60 t/dia LO limit (Obs. 01) against the
~40 t/dia edital average, highlighting Monday peak risk with no
escalonamento rule — additional operational risk reinforcing Item 3.

Sections renumbered (old 2-5 -> 3-6). DOCX regenerated (8 tables, 176 paras).
</commit_message>
<xml_diff>
--- a/licitacoes-14133/porto-ferreira/docs/ESTRATEGIA_termo_assuncao_ET08.docx
+++ b/licitacoes-14133/porto-ferreira/docs/ESTRATEGIA_termo_assuncao_ET08.docx
@@ -672,7 +672,1256 @@
           <w:sz w:val="28"/>
           <w:szCs w:val="28"/>
         </w:rPr>
-        <w:t xml:space="preserve">2. Sequência pós-adjudicação</w:t>
+        <w:t xml:space="preserve">2. Estrutura contratual: Item 2 vs. Item 3</w:t>
+      </w:r>
+    </w:p>
+    <w:p>
+      <w:pPr>
+        <w:spacing w:after="120" w:before="0" w:line="276"/>
+        <w:jc w:val="both"/>
+      </w:pPr>
+      <w:r>
+        <w:rPr>
+          <w:rFonts w:ascii="Times New Roman" w:cs="Times New Roman" w:eastAsia="Times New Roman" w:hAnsi="Times New Roman"/>
+          <w:sz w:val="24"/>
+          <w:szCs w:val="24"/>
+        </w:rPr>
+        <w:t xml:space="preserve">O edital estrutura a destinação final em dois itens </w:t>
+      </w:r>
+      <w:r>
+        <w:rPr>
+          <w:rFonts w:ascii="Times New Roman" w:cs="Times New Roman" w:eastAsia="Times New Roman" w:hAnsi="Times New Roman"/>
+          <w:b/>
+          <w:bCs/>
+          <w:sz w:val="24"/>
+          <w:szCs w:val="24"/>
+        </w:rPr>
+        <w:t xml:space="preserve">mutuamente excludentes e sucessivos</w:t>
+      </w:r>
+      <w:r>
+        <w:rPr>
+          <w:rFonts w:ascii="Times New Roman" w:cs="Times New Roman" w:eastAsia="Times New Roman" w:hAnsi="Times New Roman"/>
+          <w:sz w:val="24"/>
+          <w:szCs w:val="24"/>
+        </w:rPr>
+        <w:t xml:space="preserve"> — não simultâneos. O Item 3 só começa quando o Item 2 termina. A vedação é expressa: "fica expressamente vedada a cobrança do Item 2 do objeto, passando a ser faturado exclusivamente o Item 3" (TR 5.1.6.3).</w:t>
+      </w:r>
+    </w:p>
+    <w:tbl>
+      <w:tblPr>
+        <w:tblW w:type="dxa" w:w="9800"/>
+        <w:tblBorders>
+          <w:top w:val="single" w:color="auto" w:sz="4"/>
+          <w:left w:val="single" w:color="auto" w:sz="4"/>
+          <w:bottom w:val="single" w:color="auto" w:sz="4"/>
+          <w:right w:val="single" w:color="auto" w:sz="4"/>
+          <w:insideH w:val="single" w:color="auto" w:sz="4"/>
+          <w:insideV w:val="single" w:color="auto" w:sz="4"/>
+        </w:tblBorders>
+        <w:tblLayout w:type="fixed"/>
+      </w:tblPr>
+      <w:tblGrid>
+        <w:gridCol w:w="2800"/>
+        <w:gridCol w:w="5000"/>
+        <w:gridCol w:w="2000"/>
+      </w:tblGrid>
+      <w:tr>
+        <w:trPr>
+          <w:tblHeader/>
+        </w:trPr>
+        <w:tc>
+          <w:tcPr>
+            <w:tcW w:type="dxa" w:w="2800"/>
+            <w:tcBorders>
+              <w:top w:val="single" w:color="999999" w:sz="1"/>
+              <w:left w:val="single" w:color="999999" w:sz="1"/>
+              <w:bottom w:val="single" w:color="999999" w:sz="1"/>
+              <w:right w:val="single" w:color="999999" w:sz="1"/>
+            </w:tcBorders>
+            <w:shd w:fill="1F3864" w:color="auto" w:val="clear"/>
+          </w:tcPr>
+          <w:p>
+            <w:pPr>
+              <w:spacing w:after="40" w:before="40"/>
+              <w:jc w:val="left"/>
+            </w:pPr>
+            <w:r>
+              <w:rPr>
+                <w:rFonts w:ascii="Times New Roman" w:cs="Times New Roman" w:eastAsia="Times New Roman" w:hAnsi="Times New Roman"/>
+                <w:b/>
+                <w:bCs/>
+                <w:color w:val="FFFFFF"/>
+                <w:sz w:val="20"/>
+                <w:szCs w:val="20"/>
+              </w:rPr>
+              <w:t xml:space="preserve">Elemento</w:t>
+            </w:r>
+          </w:p>
+        </w:tc>
+        <w:tc>
+          <w:tcPr>
+            <w:tcW w:type="dxa" w:w="5000"/>
+            <w:tcBorders>
+              <w:top w:val="single" w:color="999999" w:sz="1"/>
+              <w:left w:val="single" w:color="999999" w:sz="1"/>
+              <w:bottom w:val="single" w:color="999999" w:sz="1"/>
+              <w:right w:val="single" w:color="999999" w:sz="1"/>
+            </w:tcBorders>
+            <w:shd w:fill="1F3864" w:color="auto" w:val="clear"/>
+          </w:tcPr>
+          <w:p>
+            <w:pPr>
+              <w:spacing w:after="40" w:before="40"/>
+              <w:jc w:val="left"/>
+            </w:pPr>
+            <w:r>
+              <w:rPr>
+                <w:rFonts w:ascii="Times New Roman" w:cs="Times New Roman" w:eastAsia="Times New Roman" w:hAnsi="Times New Roman"/>
+                <w:b/>
+                <w:bCs/>
+                <w:color w:val="FFFFFF"/>
+                <w:sz w:val="20"/>
+                <w:szCs w:val="20"/>
+              </w:rPr>
+              <w:t xml:space="preserve">Previsão editalícia</w:t>
+            </w:r>
+          </w:p>
+        </w:tc>
+        <w:tc>
+          <w:tcPr>
+            <w:tcW w:type="dxa" w:w="2000"/>
+            <w:tcBorders>
+              <w:top w:val="single" w:color="999999" w:sz="1"/>
+              <w:left w:val="single" w:color="999999" w:sz="1"/>
+              <w:bottom w:val="single" w:color="999999" w:sz="1"/>
+              <w:right w:val="single" w:color="999999" w:sz="1"/>
+            </w:tcBorders>
+            <w:shd w:fill="1F3864" w:color="auto" w:val="clear"/>
+          </w:tcPr>
+          <w:p>
+            <w:pPr>
+              <w:spacing w:after="40" w:before="40"/>
+              <w:jc w:val="left"/>
+            </w:pPr>
+            <w:r>
+              <w:rPr>
+                <w:rFonts w:ascii="Times New Roman" w:cs="Times New Roman" w:eastAsia="Times New Roman" w:hAnsi="Times New Roman"/>
+                <w:b/>
+                <w:bCs/>
+                <w:color w:val="FFFFFF"/>
+                <w:sz w:val="20"/>
+                <w:szCs w:val="20"/>
+              </w:rPr>
+              <w:t xml:space="preserve">Fonte</w:t>
+            </w:r>
+          </w:p>
+        </w:tc>
+      </w:tr>
+      <w:tr>
+        <w:tc>
+          <w:tcPr>
+            <w:tcW w:type="dxa" w:w="2800"/>
+            <w:tcBorders>
+              <w:top w:val="single" w:color="999999" w:sz="1"/>
+              <w:left w:val="single" w:color="999999" w:sz="1"/>
+              <w:bottom w:val="single" w:color="999999" w:sz="1"/>
+              <w:right w:val="single" w:color="999999" w:sz="1"/>
+            </w:tcBorders>
+          </w:tcPr>
+          <w:p>
+            <w:pPr>
+              <w:spacing w:after="40" w:before="40"/>
+              <w:jc w:val="left"/>
+            </w:pPr>
+            <w:r>
+              <w:rPr>
+                <w:rFonts w:ascii="Times New Roman" w:cs="Times New Roman" w:eastAsia="Times New Roman" w:hAnsi="Times New Roman"/>
+                <w:sz w:val="20"/>
+                <w:szCs w:val="20"/>
+              </w:rPr>
+              <w:t xml:space="preserve">Item 2 — Destinação no aterro municipal</w:t>
+            </w:r>
+          </w:p>
+        </w:tc>
+        <w:tc>
+          <w:tcPr>
+            <w:tcW w:type="dxa" w:w="5000"/>
+            <w:tcBorders>
+              <w:top w:val="single" w:color="999999" w:sz="1"/>
+              <w:left w:val="single" w:color="999999" w:sz="1"/>
+              <w:bottom w:val="single" w:color="999999" w:sz="1"/>
+              <w:right w:val="single" w:color="999999" w:sz="1"/>
+            </w:tcBorders>
+          </w:tcPr>
+          <w:p>
+            <w:pPr>
+              <w:spacing w:after="40" w:before="40"/>
+              <w:jc w:val="left"/>
+            </w:pPr>
+            <w:r>
+              <w:rPr>
+                <w:rFonts w:ascii="Times New Roman" w:cs="Times New Roman" w:eastAsia="Times New Roman" w:hAnsi="Times New Roman"/>
+                <w:sz w:val="20"/>
+                <w:szCs w:val="20"/>
+              </w:rPr>
+              <w:t xml:space="preserve">Disposição na Vala 05, licenciada pela LO CETESB n.º 4011055</w:t>
+            </w:r>
+          </w:p>
+        </w:tc>
+        <w:tc>
+          <w:tcPr>
+            <w:tcW w:type="dxa" w:w="2000"/>
+            <w:tcBorders>
+              <w:top w:val="single" w:color="999999" w:sz="1"/>
+              <w:left w:val="single" w:color="999999" w:sz="1"/>
+              <w:bottom w:val="single" w:color="999999" w:sz="1"/>
+              <w:right w:val="single" w:color="999999" w:sz="1"/>
+            </w:tcBorders>
+          </w:tcPr>
+          <w:p>
+            <w:pPr>
+              <w:spacing w:after="40" w:before="40"/>
+              <w:jc w:val="left"/>
+            </w:pPr>
+            <w:r>
+              <w:rPr>
+                <w:rFonts w:ascii="Times New Roman" w:cs="Times New Roman" w:eastAsia="Times New Roman" w:hAnsi="Times New Roman"/>
+                <w:sz w:val="20"/>
+                <w:szCs w:val="20"/>
+              </w:rPr>
+              <w:t xml:space="preserve">TR 1.1, Lote 1</w:t>
+            </w:r>
+          </w:p>
+        </w:tc>
+      </w:tr>
+      <w:tr>
+        <w:tc>
+          <w:tcPr>
+            <w:tcW w:type="dxa" w:w="2800"/>
+            <w:tcBorders>
+              <w:top w:val="single" w:color="999999" w:sz="1"/>
+              <w:left w:val="single" w:color="999999" w:sz="1"/>
+              <w:bottom w:val="single" w:color="999999" w:sz="1"/>
+              <w:right w:val="single" w:color="999999" w:sz="1"/>
+            </w:tcBorders>
+          </w:tcPr>
+          <w:p>
+            <w:pPr>
+              <w:spacing w:after="40" w:before="40"/>
+              <w:jc w:val="left"/>
+            </w:pPr>
+            <w:r>
+              <w:rPr>
+                <w:rFonts w:ascii="Times New Roman" w:cs="Times New Roman" w:eastAsia="Times New Roman" w:hAnsi="Times New Roman"/>
+                <w:sz w:val="20"/>
+                <w:szCs w:val="20"/>
+              </w:rPr>
+              <w:t xml:space="preserve">Item 3 — Destinação externa</w:t>
+            </w:r>
+          </w:p>
+        </w:tc>
+        <w:tc>
+          <w:tcPr>
+            <w:tcW w:type="dxa" w:w="5000"/>
+            <w:tcBorders>
+              <w:top w:val="single" w:color="999999" w:sz="1"/>
+              <w:left w:val="single" w:color="999999" w:sz="1"/>
+              <w:bottom w:val="single" w:color="999999" w:sz="1"/>
+              <w:right w:val="single" w:color="999999" w:sz="1"/>
+            </w:tcBorders>
+          </w:tcPr>
+          <w:p>
+            <w:pPr>
+              <w:spacing w:after="40" w:before="40"/>
+              <w:jc w:val="left"/>
+            </w:pPr>
+            <w:r>
+              <w:rPr>
+                <w:rFonts w:ascii="Times New Roman" w:cs="Times New Roman" w:eastAsia="Times New Roman" w:hAnsi="Times New Roman"/>
+                <w:sz w:val="20"/>
+                <w:szCs w:val="20"/>
+              </w:rPr>
+              <w:t xml:space="preserve">Disposição em aterro licenciado em outro município, sob responsabilidade da contratada</w:t>
+            </w:r>
+          </w:p>
+        </w:tc>
+        <w:tc>
+          <w:tcPr>
+            <w:tcW w:type="dxa" w:w="2000"/>
+            <w:tcBorders>
+              <w:top w:val="single" w:color="999999" w:sz="1"/>
+              <w:left w:val="single" w:color="999999" w:sz="1"/>
+              <w:bottom w:val="single" w:color="999999" w:sz="1"/>
+              <w:right w:val="single" w:color="999999" w:sz="1"/>
+            </w:tcBorders>
+          </w:tcPr>
+          <w:p>
+            <w:pPr>
+              <w:spacing w:after="40" w:before="40"/>
+              <w:jc w:val="left"/>
+            </w:pPr>
+            <w:r>
+              <w:rPr>
+                <w:rFonts w:ascii="Times New Roman" w:cs="Times New Roman" w:eastAsia="Times New Roman" w:hAnsi="Times New Roman"/>
+                <w:sz w:val="20"/>
+                <w:szCs w:val="20"/>
+              </w:rPr>
+              <w:t xml:space="preserve">TR 1.1, Lote 1</w:t>
+            </w:r>
+          </w:p>
+        </w:tc>
+      </w:tr>
+      <w:tr>
+        <w:tc>
+          <w:tcPr>
+            <w:tcW w:type="dxa" w:w="2800"/>
+            <w:tcBorders>
+              <w:top w:val="single" w:color="999999" w:sz="1"/>
+              <w:left w:val="single" w:color="999999" w:sz="1"/>
+              <w:bottom w:val="single" w:color="999999" w:sz="1"/>
+              <w:right w:val="single" w:color="999999" w:sz="1"/>
+            </w:tcBorders>
+          </w:tcPr>
+          <w:p>
+            <w:pPr>
+              <w:spacing w:after="40" w:before="40"/>
+              <w:jc w:val="left"/>
+            </w:pPr>
+            <w:r>
+              <w:rPr>
+                <w:rFonts w:ascii="Times New Roman" w:cs="Times New Roman" w:eastAsia="Times New Roman" w:hAnsi="Times New Roman"/>
+                <w:sz w:val="20"/>
+                <w:szCs w:val="20"/>
+              </w:rPr>
+              <w:t xml:space="preserve">Quantitativo estimado</w:t>
+            </w:r>
+          </w:p>
+        </w:tc>
+        <w:tc>
+          <w:tcPr>
+            <w:tcW w:type="dxa" w:w="5000"/>
+            <w:tcBorders>
+              <w:top w:val="single" w:color="999999" w:sz="1"/>
+              <w:left w:val="single" w:color="999999" w:sz="1"/>
+              <w:bottom w:val="single" w:color="999999" w:sz="1"/>
+              <w:right w:val="single" w:color="999999" w:sz="1"/>
+            </w:tcBorders>
+          </w:tcPr>
+          <w:p>
+            <w:pPr>
+              <w:spacing w:after="40" w:before="40"/>
+              <w:jc w:val="left"/>
+            </w:pPr>
+            <w:r>
+              <w:rPr>
+                <w:rFonts w:ascii="Times New Roman" w:cs="Times New Roman" w:eastAsia="Times New Roman" w:hAnsi="Times New Roman"/>
+                <w:sz w:val="20"/>
+                <w:szCs w:val="20"/>
+              </w:rPr>
+              <w:t xml:space="preserve">12.480 t/ano para cada item (mesma tonelagem, nunca simultânea)</w:t>
+            </w:r>
+          </w:p>
+        </w:tc>
+        <w:tc>
+          <w:tcPr>
+            <w:tcW w:type="dxa" w:w="2000"/>
+            <w:tcBorders>
+              <w:top w:val="single" w:color="999999" w:sz="1"/>
+              <w:left w:val="single" w:color="999999" w:sz="1"/>
+              <w:bottom w:val="single" w:color="999999" w:sz="1"/>
+              <w:right w:val="single" w:color="999999" w:sz="1"/>
+            </w:tcBorders>
+          </w:tcPr>
+          <w:p>
+            <w:pPr>
+              <w:spacing w:after="40" w:before="40"/>
+              <w:jc w:val="left"/>
+            </w:pPr>
+            <w:r>
+              <w:rPr>
+                <w:rFonts w:ascii="Times New Roman" w:cs="Times New Roman" w:eastAsia="Times New Roman" w:hAnsi="Times New Roman"/>
+                <w:sz w:val="20"/>
+                <w:szCs w:val="20"/>
+              </w:rPr>
+              <w:t xml:space="preserve">TR 1.1; ETP item 7</w:t>
+            </w:r>
+          </w:p>
+        </w:tc>
+      </w:tr>
+      <w:tr>
+        <w:tc>
+          <w:tcPr>
+            <w:tcW w:type="dxa" w:w="2800"/>
+            <w:tcBorders>
+              <w:top w:val="single" w:color="999999" w:sz="1"/>
+              <w:left w:val="single" w:color="999999" w:sz="1"/>
+              <w:bottom w:val="single" w:color="999999" w:sz="1"/>
+              <w:right w:val="single" w:color="999999" w:sz="1"/>
+            </w:tcBorders>
+          </w:tcPr>
+          <w:p>
+            <w:pPr>
+              <w:spacing w:after="40" w:before="40"/>
+              <w:jc w:val="left"/>
+            </w:pPr>
+            <w:r>
+              <w:rPr>
+                <w:rFonts w:ascii="Times New Roman" w:cs="Times New Roman" w:eastAsia="Times New Roman" w:hAnsi="Times New Roman"/>
+                <w:sz w:val="20"/>
+                <w:szCs w:val="20"/>
+              </w:rPr>
+              <w:t xml:space="preserve">Preço unitário referencial</w:t>
+            </w:r>
+          </w:p>
+        </w:tc>
+        <w:tc>
+          <w:tcPr>
+            <w:tcW w:type="dxa" w:w="5000"/>
+            <w:tcBorders>
+              <w:top w:val="single" w:color="999999" w:sz="1"/>
+              <w:left w:val="single" w:color="999999" w:sz="1"/>
+              <w:bottom w:val="single" w:color="999999" w:sz="1"/>
+              <w:right w:val="single" w:color="999999" w:sz="1"/>
+            </w:tcBorders>
+          </w:tcPr>
+          <w:p>
+            <w:pPr>
+              <w:spacing w:after="40" w:before="40"/>
+              <w:jc w:val="left"/>
+            </w:pPr>
+            <w:r>
+              <w:rPr>
+                <w:rFonts w:ascii="Times New Roman" w:cs="Times New Roman" w:eastAsia="Times New Roman" w:hAnsi="Times New Roman"/>
+                <w:sz w:val="20"/>
+                <w:szCs w:val="20"/>
+              </w:rPr>
+              <w:t xml:space="preserve">Item 2: R$ 168,77/t · Item 3: R$ 249,28/t</w:t>
+            </w:r>
+          </w:p>
+        </w:tc>
+        <w:tc>
+          <w:tcPr>
+            <w:tcW w:type="dxa" w:w="2000"/>
+            <w:tcBorders>
+              <w:top w:val="single" w:color="999999" w:sz="1"/>
+              <w:left w:val="single" w:color="999999" w:sz="1"/>
+              <w:bottom w:val="single" w:color="999999" w:sz="1"/>
+              <w:right w:val="single" w:color="999999" w:sz="1"/>
+            </w:tcBorders>
+          </w:tcPr>
+          <w:p>
+            <w:pPr>
+              <w:spacing w:after="40" w:before="40"/>
+              <w:jc w:val="left"/>
+            </w:pPr>
+            <w:r>
+              <w:rPr>
+                <w:rFonts w:ascii="Times New Roman" w:cs="Times New Roman" w:eastAsia="Times New Roman" w:hAnsi="Times New Roman"/>
+                <w:sz w:val="20"/>
+                <w:szCs w:val="20"/>
+              </w:rPr>
+              <w:t xml:space="preserve">Quadro Comparativo de Preços</w:t>
+            </w:r>
+          </w:p>
+        </w:tc>
+      </w:tr>
+      <w:tr>
+        <w:tc>
+          <w:tcPr>
+            <w:tcW w:type="dxa" w:w="2800"/>
+            <w:tcBorders>
+              <w:top w:val="single" w:color="999999" w:sz="1"/>
+              <w:left w:val="single" w:color="999999" w:sz="1"/>
+              <w:bottom w:val="single" w:color="999999" w:sz="1"/>
+              <w:right w:val="single" w:color="999999" w:sz="1"/>
+            </w:tcBorders>
+          </w:tcPr>
+          <w:p>
+            <w:pPr>
+              <w:spacing w:after="40" w:before="40"/>
+              <w:jc w:val="left"/>
+            </w:pPr>
+            <w:r>
+              <w:rPr>
+                <w:rFonts w:ascii="Times New Roman" w:cs="Times New Roman" w:eastAsia="Times New Roman" w:hAnsi="Times New Roman"/>
+                <w:sz w:val="20"/>
+                <w:szCs w:val="20"/>
+              </w:rPr>
+              <w:t xml:space="preserve">Gatilho da transição</w:t>
+            </w:r>
+          </w:p>
+        </w:tc>
+        <w:tc>
+          <w:tcPr>
+            <w:tcW w:type="dxa" w:w="5000"/>
+            <w:tcBorders>
+              <w:top w:val="single" w:color="999999" w:sz="1"/>
+              <w:left w:val="single" w:color="999999" w:sz="1"/>
+              <w:bottom w:val="single" w:color="999999" w:sz="1"/>
+              <w:right w:val="single" w:color="999999" w:sz="1"/>
+            </w:tcBorders>
+          </w:tcPr>
+          <w:p>
+            <w:pPr>
+              <w:spacing w:after="40" w:before="40"/>
+              <w:jc w:val="left"/>
+            </w:pPr>
+            <w:r>
+              <w:rPr>
+                <w:rFonts w:ascii="Times New Roman" w:cs="Times New Roman" w:eastAsia="Times New Roman" w:hAnsi="Times New Roman"/>
+                <w:sz w:val="20"/>
+                <w:szCs w:val="20"/>
+              </w:rPr>
+              <w:t xml:space="preserve">"É de responsabilidade dos técnicos da CONTRATANTE a validação contínua da utilização da vala, monitorando a capacidade de carga e estabilidade dos taludes"</w:t>
+            </w:r>
+          </w:p>
+        </w:tc>
+        <w:tc>
+          <w:tcPr>
+            <w:tcW w:type="dxa" w:w="2000"/>
+            <w:tcBorders>
+              <w:top w:val="single" w:color="999999" w:sz="1"/>
+              <w:left w:val="single" w:color="999999" w:sz="1"/>
+              <w:bottom w:val="single" w:color="999999" w:sz="1"/>
+              <w:right w:val="single" w:color="999999" w:sz="1"/>
+            </w:tcBorders>
+          </w:tcPr>
+          <w:p>
+            <w:pPr>
+              <w:spacing w:after="40" w:before="40"/>
+              <w:jc w:val="left"/>
+            </w:pPr>
+            <w:r>
+              <w:rPr>
+                <w:rFonts w:ascii="Times New Roman" w:cs="Times New Roman" w:eastAsia="Times New Roman" w:hAnsi="Times New Roman"/>
+                <w:sz w:val="20"/>
+                <w:szCs w:val="20"/>
+              </w:rPr>
+              <w:t xml:space="preserve">TR 5.5.18</w:t>
+            </w:r>
+          </w:p>
+        </w:tc>
+      </w:tr>
+      <w:tr>
+        <w:tc>
+          <w:tcPr>
+            <w:tcW w:type="dxa" w:w="2800"/>
+            <w:tcBorders>
+              <w:top w:val="single" w:color="999999" w:sz="1"/>
+              <w:left w:val="single" w:color="999999" w:sz="1"/>
+              <w:bottom w:val="single" w:color="999999" w:sz="1"/>
+              <w:right w:val="single" w:color="999999" w:sz="1"/>
+            </w:tcBorders>
+          </w:tcPr>
+          <w:p>
+            <w:pPr>
+              <w:spacing w:after="40" w:before="40"/>
+              <w:jc w:val="left"/>
+            </w:pPr>
+            <w:r>
+              <w:rPr>
+                <w:rFonts w:ascii="Times New Roman" w:cs="Times New Roman" w:eastAsia="Times New Roman" w:hAnsi="Times New Roman"/>
+                <w:sz w:val="20"/>
+                <w:szCs w:val="20"/>
+              </w:rPr>
+              <w:t xml:space="preserve">Vedação de cumulatividade</w:t>
+            </w:r>
+          </w:p>
+        </w:tc>
+        <w:tc>
+          <w:tcPr>
+            <w:tcW w:type="dxa" w:w="5000"/>
+            <w:tcBorders>
+              <w:top w:val="single" w:color="999999" w:sz="1"/>
+              <w:left w:val="single" w:color="999999" w:sz="1"/>
+              <w:bottom w:val="single" w:color="999999" w:sz="1"/>
+              <w:right w:val="single" w:color="999999" w:sz="1"/>
+            </w:tcBorders>
+          </w:tcPr>
+          <w:p>
+            <w:pPr>
+              <w:spacing w:after="40" w:before="40"/>
+              <w:jc w:val="left"/>
+            </w:pPr>
+            <w:r>
+              <w:rPr>
+                <w:rFonts w:ascii="Times New Roman" w:cs="Times New Roman" w:eastAsia="Times New Roman" w:hAnsi="Times New Roman"/>
+                <w:sz w:val="20"/>
+                <w:szCs w:val="20"/>
+              </w:rPr>
+              <w:t xml:space="preserve">"A partir da constatação do encerramento do Aterro Municipal, fica expressamente vedada a cobrança do Item 2"</w:t>
+            </w:r>
+          </w:p>
+        </w:tc>
+        <w:tc>
+          <w:tcPr>
+            <w:tcW w:type="dxa" w:w="2000"/>
+            <w:tcBorders>
+              <w:top w:val="single" w:color="999999" w:sz="1"/>
+              <w:left w:val="single" w:color="999999" w:sz="1"/>
+              <w:bottom w:val="single" w:color="999999" w:sz="1"/>
+              <w:right w:val="single" w:color="999999" w:sz="1"/>
+            </w:tcBorders>
+          </w:tcPr>
+          <w:p>
+            <w:pPr>
+              <w:spacing w:after="40" w:before="40"/>
+              <w:jc w:val="left"/>
+            </w:pPr>
+            <w:r>
+              <w:rPr>
+                <w:rFonts w:ascii="Times New Roman" w:cs="Times New Roman" w:eastAsia="Times New Roman" w:hAnsi="Times New Roman"/>
+                <w:sz w:val="20"/>
+                <w:szCs w:val="20"/>
+              </w:rPr>
+              <w:t xml:space="preserve">TR 5.1.6.3</w:t>
+            </w:r>
+          </w:p>
+        </w:tc>
+      </w:tr>
+      <w:tr>
+        <w:tc>
+          <w:tcPr>
+            <w:tcW w:type="dxa" w:w="2800"/>
+            <w:tcBorders>
+              <w:top w:val="single" w:color="999999" w:sz="1"/>
+              <w:left w:val="single" w:color="999999" w:sz="1"/>
+              <w:bottom w:val="single" w:color="999999" w:sz="1"/>
+              <w:right w:val="single" w:color="999999" w:sz="1"/>
+            </w:tcBorders>
+          </w:tcPr>
+          <w:p>
+            <w:pPr>
+              <w:spacing w:after="40" w:before="40"/>
+              <w:jc w:val="left"/>
+            </w:pPr>
+            <w:r>
+              <w:rPr>
+                <w:rFonts w:ascii="Times New Roman" w:cs="Times New Roman" w:eastAsia="Times New Roman" w:hAnsi="Times New Roman"/>
+                <w:sz w:val="20"/>
+                <w:szCs w:val="20"/>
+              </w:rPr>
+              <w:t xml:space="preserve">Data estimada de esgotamento</w:t>
+            </w:r>
+          </w:p>
+        </w:tc>
+        <w:tc>
+          <w:tcPr>
+            <w:tcW w:type="dxa" w:w="5000"/>
+            <w:tcBorders>
+              <w:top w:val="single" w:color="999999" w:sz="1"/>
+              <w:left w:val="single" w:color="999999" w:sz="1"/>
+              <w:bottom w:val="single" w:color="999999" w:sz="1"/>
+              <w:right w:val="single" w:color="999999" w:sz="1"/>
+            </w:tcBorders>
+          </w:tcPr>
+          <w:p>
+            <w:pPr>
+              <w:spacing w:after="40" w:before="40"/>
+              <w:jc w:val="left"/>
+            </w:pPr>
+            <w:r>
+              <w:rPr>
+                <w:rFonts w:ascii="Times New Roman" w:cs="Times New Roman" w:eastAsia="Times New Roman" w:hAnsi="Times New Roman"/>
+                <w:sz w:val="20"/>
+                <w:szCs w:val="20"/>
+              </w:rPr>
+              <w:t xml:space="preserve">"Provavelmente no primeiro semestre de 2027"</w:t>
+            </w:r>
+          </w:p>
+        </w:tc>
+        <w:tc>
+          <w:tcPr>
+            <w:tcW w:type="dxa" w:w="2000"/>
+            <w:tcBorders>
+              <w:top w:val="single" w:color="999999" w:sz="1"/>
+              <w:left w:val="single" w:color="999999" w:sz="1"/>
+              <w:bottom w:val="single" w:color="999999" w:sz="1"/>
+              <w:right w:val="single" w:color="999999" w:sz="1"/>
+            </w:tcBorders>
+          </w:tcPr>
+          <w:p>
+            <w:pPr>
+              <w:spacing w:after="40" w:before="40"/>
+              <w:jc w:val="left"/>
+            </w:pPr>
+            <w:r>
+              <w:rPr>
+                <w:rFonts w:ascii="Times New Roman" w:cs="Times New Roman" w:eastAsia="Times New Roman" w:hAnsi="Times New Roman"/>
+                <w:sz w:val="20"/>
+                <w:szCs w:val="20"/>
+              </w:rPr>
+              <w:t xml:space="preserve">TR 2.4, 5.1.6.2, 5.5.17</w:t>
+            </w:r>
+          </w:p>
+        </w:tc>
+      </w:tr>
+    </w:tbl>
+    <w:p>
+      <w:pPr>
+        <w:spacing w:after="120" w:before="120" w:line="276"/>
+        <w:jc w:val="both"/>
+      </w:pPr>
+      <w:r>
+        <w:rPr>
+          <w:rFonts w:ascii="Times New Roman" w:cs="Times New Roman" w:eastAsia="Times New Roman" w:hAnsi="Times New Roman"/>
+          <w:b/>
+          <w:bCs/>
+          <w:sz w:val="24"/>
+          <w:szCs w:val="24"/>
+        </w:rPr>
+        <w:t xml:space="preserve">Ponto central: </w:t>
+      </w:r>
+      <w:r>
+        <w:rPr>
+          <w:rFonts w:ascii="Times New Roman" w:cs="Times New Roman" w:eastAsia="Times New Roman" w:hAnsi="Times New Roman"/>
+          <w:sz w:val="24"/>
+          <w:szCs w:val="24"/>
+        </w:rPr>
+        <w:t xml:space="preserve">a decisão de quando encerrar o Item 2 e iniciar o Item 3 é </w:t>
+      </w:r>
+      <w:r>
+        <w:rPr>
+          <w:rFonts w:ascii="Times New Roman" w:cs="Times New Roman" w:eastAsia="Times New Roman" w:hAnsi="Times New Roman"/>
+          <w:b/>
+          <w:bCs/>
+          <w:sz w:val="24"/>
+          <w:szCs w:val="24"/>
+        </w:rPr>
+        <w:t xml:space="preserve">unilateral dos técnicos do Município</w:t>
+      </w:r>
+      <w:r>
+        <w:rPr>
+          <w:rFonts w:ascii="Times New Roman" w:cs="Times New Roman" w:eastAsia="Times New Roman" w:hAnsi="Times New Roman"/>
+          <w:sz w:val="24"/>
+          <w:szCs w:val="24"/>
+        </w:rPr>
+        <w:t xml:space="preserve"> — sem parâmetro técnico objetivo, sem procedimento formal, sem laudo, sem prazo de aviso prévio e sem participação da contratada (TR 5.5.18). O termo de assunção cria o fundamento técnico da contratada para provocar a transição, em vez de ficar à mercê de uma constatação unilateral.</w:t>
+      </w:r>
+    </w:p>
+    <w:p>
+      <w:pPr>
+        <w:pStyle w:val="Heading3"/>
+        <w:spacing w:after="120" w:before="200"/>
+      </w:pPr>
+      <w:r>
+        <w:rPr>
+          <w:rFonts w:ascii="Times New Roman" w:cs="Times New Roman" w:eastAsia="Times New Roman" w:hAnsi="Times New Roman"/>
+          <w:b/>
+          <w:bCs/>
+          <w:sz w:val="26"/>
+          <w:szCs w:val="26"/>
+        </w:rPr>
+        <w:t xml:space="preserve">Teto diário da LO vs. tonelagem do edital</w:t>
+      </w:r>
+    </w:p>
+    <w:tbl>
+      <w:tblPr>
+        <w:tblW w:type="dxa" w:w="9800"/>
+        <w:tblBorders>
+          <w:top w:val="single" w:color="auto" w:sz="4"/>
+          <w:left w:val="single" w:color="auto" w:sz="4"/>
+          <w:bottom w:val="single" w:color="auto" w:sz="4"/>
+          <w:right w:val="single" w:color="auto" w:sz="4"/>
+          <w:insideH w:val="single" w:color="auto" w:sz="4"/>
+          <w:insideV w:val="single" w:color="auto" w:sz="4"/>
+        </w:tblBorders>
+        <w:tblLayout w:type="fixed"/>
+      </w:tblPr>
+      <w:tblGrid>
+        <w:gridCol w:w="3200"/>
+        <w:gridCol w:w="3600"/>
+        <w:gridCol w:w="3000"/>
+      </w:tblGrid>
+      <w:tr>
+        <w:trPr>
+          <w:tblHeader/>
+        </w:trPr>
+        <w:tc>
+          <w:tcPr>
+            <w:tcW w:type="dxa" w:w="3200"/>
+            <w:tcBorders>
+              <w:top w:val="single" w:color="999999" w:sz="1"/>
+              <w:left w:val="single" w:color="999999" w:sz="1"/>
+              <w:bottom w:val="single" w:color="999999" w:sz="1"/>
+              <w:right w:val="single" w:color="999999" w:sz="1"/>
+            </w:tcBorders>
+            <w:shd w:fill="1F3864" w:color="auto" w:val="clear"/>
+          </w:tcPr>
+          <w:p>
+            <w:pPr>
+              <w:spacing w:after="40" w:before="40"/>
+              <w:jc w:val="left"/>
+            </w:pPr>
+            <w:r>
+              <w:rPr>
+                <w:rFonts w:ascii="Times New Roman" w:cs="Times New Roman" w:eastAsia="Times New Roman" w:hAnsi="Times New Roman"/>
+                <w:b/>
+                <w:bCs/>
+                <w:color w:val="FFFFFF"/>
+                <w:sz w:val="20"/>
+                <w:szCs w:val="20"/>
+              </w:rPr>
+              <w:t xml:space="preserve">Parâmetro</w:t>
+            </w:r>
+          </w:p>
+        </w:tc>
+        <w:tc>
+          <w:tcPr>
+            <w:tcW w:type="dxa" w:w="3600"/>
+            <w:tcBorders>
+              <w:top w:val="single" w:color="999999" w:sz="1"/>
+              <w:left w:val="single" w:color="999999" w:sz="1"/>
+              <w:bottom w:val="single" w:color="999999" w:sz="1"/>
+              <w:right w:val="single" w:color="999999" w:sz="1"/>
+            </w:tcBorders>
+            <w:shd w:fill="1F3864" w:color="auto" w:val="clear"/>
+          </w:tcPr>
+          <w:p>
+            <w:pPr>
+              <w:spacing w:after="40" w:before="40"/>
+              <w:jc w:val="left"/>
+            </w:pPr>
+            <w:r>
+              <w:rPr>
+                <w:rFonts w:ascii="Times New Roman" w:cs="Times New Roman" w:eastAsia="Times New Roman" w:hAnsi="Times New Roman"/>
+                <w:b/>
+                <w:bCs/>
+                <w:color w:val="FFFFFF"/>
+                <w:sz w:val="20"/>
+                <w:szCs w:val="20"/>
+              </w:rPr>
+              <w:t xml:space="preserve">Valor</w:t>
+            </w:r>
+          </w:p>
+        </w:tc>
+        <w:tc>
+          <w:tcPr>
+            <w:tcW w:type="dxa" w:w="3000"/>
+            <w:tcBorders>
+              <w:top w:val="single" w:color="999999" w:sz="1"/>
+              <w:left w:val="single" w:color="999999" w:sz="1"/>
+              <w:bottom w:val="single" w:color="999999" w:sz="1"/>
+              <w:right w:val="single" w:color="999999" w:sz="1"/>
+            </w:tcBorders>
+            <w:shd w:fill="1F3864" w:color="auto" w:val="clear"/>
+          </w:tcPr>
+          <w:p>
+            <w:pPr>
+              <w:spacing w:after="40" w:before="40"/>
+              <w:jc w:val="left"/>
+            </w:pPr>
+            <w:r>
+              <w:rPr>
+                <w:rFonts w:ascii="Times New Roman" w:cs="Times New Roman" w:eastAsia="Times New Roman" w:hAnsi="Times New Roman"/>
+                <w:b/>
+                <w:bCs/>
+                <w:color w:val="FFFFFF"/>
+                <w:sz w:val="20"/>
+                <w:szCs w:val="20"/>
+              </w:rPr>
+              <w:t xml:space="preserve">Fonte</w:t>
+            </w:r>
+          </w:p>
+        </w:tc>
+      </w:tr>
+      <w:tr>
+        <w:tc>
+          <w:tcPr>
+            <w:tcW w:type="dxa" w:w="3200"/>
+            <w:tcBorders>
+              <w:top w:val="single" w:color="999999" w:sz="1"/>
+              <w:left w:val="single" w:color="999999" w:sz="1"/>
+              <w:bottom w:val="single" w:color="999999" w:sz="1"/>
+              <w:right w:val="single" w:color="999999" w:sz="1"/>
+            </w:tcBorders>
+          </w:tcPr>
+          <w:p>
+            <w:pPr>
+              <w:spacing w:after="40" w:before="40"/>
+              <w:jc w:val="left"/>
+            </w:pPr>
+            <w:r>
+              <w:rPr>
+                <w:rFonts w:ascii="Times New Roman" w:cs="Times New Roman" w:eastAsia="Times New Roman" w:hAnsi="Times New Roman"/>
+                <w:sz w:val="20"/>
+                <w:szCs w:val="20"/>
+              </w:rPr>
+              <w:t xml:space="preserve">Teto diário licenciado</w:t>
+            </w:r>
+          </w:p>
+        </w:tc>
+        <w:tc>
+          <w:tcPr>
+            <w:tcW w:type="dxa" w:w="3600"/>
+            <w:tcBorders>
+              <w:top w:val="single" w:color="999999" w:sz="1"/>
+              <w:left w:val="single" w:color="999999" w:sz="1"/>
+              <w:bottom w:val="single" w:color="999999" w:sz="1"/>
+              <w:right w:val="single" w:color="999999" w:sz="1"/>
+            </w:tcBorders>
+          </w:tcPr>
+          <w:p>
+            <w:pPr>
+              <w:spacing w:after="40" w:before="40"/>
+              <w:jc w:val="left"/>
+            </w:pPr>
+            <w:r>
+              <w:rPr>
+                <w:rFonts w:ascii="Times New Roman" w:cs="Times New Roman" w:eastAsia="Times New Roman" w:hAnsi="Times New Roman"/>
+                <w:sz w:val="20"/>
+                <w:szCs w:val="20"/>
+              </w:rPr>
+              <w:t xml:space="preserve">60 t/dia</w:t>
+            </w:r>
+          </w:p>
+        </w:tc>
+        <w:tc>
+          <w:tcPr>
+            <w:tcW w:type="dxa" w:w="3000"/>
+            <w:tcBorders>
+              <w:top w:val="single" w:color="999999" w:sz="1"/>
+              <w:left w:val="single" w:color="999999" w:sz="1"/>
+              <w:bottom w:val="single" w:color="999999" w:sz="1"/>
+              <w:right w:val="single" w:color="999999" w:sz="1"/>
+            </w:tcBorders>
+          </w:tcPr>
+          <w:p>
+            <w:pPr>
+              <w:spacing w:after="40" w:before="40"/>
+              <w:jc w:val="left"/>
+            </w:pPr>
+            <w:r>
+              <w:rPr>
+                <w:rFonts w:ascii="Times New Roman" w:cs="Times New Roman" w:eastAsia="Times New Roman" w:hAnsi="Times New Roman"/>
+                <w:sz w:val="20"/>
+                <w:szCs w:val="20"/>
+              </w:rPr>
+              <w:t xml:space="preserve">Observação 01 da LO CETESB n.º 4011055</w:t>
+            </w:r>
+          </w:p>
+        </w:tc>
+      </w:tr>
+      <w:tr>
+        <w:tc>
+          <w:tcPr>
+            <w:tcW w:type="dxa" w:w="3200"/>
+            <w:tcBorders>
+              <w:top w:val="single" w:color="999999" w:sz="1"/>
+              <w:left w:val="single" w:color="999999" w:sz="1"/>
+              <w:bottom w:val="single" w:color="999999" w:sz="1"/>
+              <w:right w:val="single" w:color="999999" w:sz="1"/>
+            </w:tcBorders>
+          </w:tcPr>
+          <w:p>
+            <w:pPr>
+              <w:spacing w:after="40" w:before="40"/>
+              <w:jc w:val="left"/>
+            </w:pPr>
+            <w:r>
+              <w:rPr>
+                <w:rFonts w:ascii="Times New Roman" w:cs="Times New Roman" w:eastAsia="Times New Roman" w:hAnsi="Times New Roman"/>
+                <w:sz w:val="20"/>
+                <w:szCs w:val="20"/>
+              </w:rPr>
+              <w:t xml:space="preserve">Média diária estimada (dias úteis)</w:t>
+            </w:r>
+          </w:p>
+        </w:tc>
+        <w:tc>
+          <w:tcPr>
+            <w:tcW w:type="dxa" w:w="3600"/>
+            <w:tcBorders>
+              <w:top w:val="single" w:color="999999" w:sz="1"/>
+              <w:left w:val="single" w:color="999999" w:sz="1"/>
+              <w:bottom w:val="single" w:color="999999" w:sz="1"/>
+              <w:right w:val="single" w:color="999999" w:sz="1"/>
+            </w:tcBorders>
+          </w:tcPr>
+          <w:p>
+            <w:pPr>
+              <w:spacing w:after="40" w:before="40"/>
+              <w:jc w:val="left"/>
+            </w:pPr>
+            <w:r>
+              <w:rPr>
+                <w:rFonts w:ascii="Times New Roman" w:cs="Times New Roman" w:eastAsia="Times New Roman" w:hAnsi="Times New Roman"/>
+                <w:sz w:val="20"/>
+                <w:szCs w:val="20"/>
+              </w:rPr>
+              <w:t xml:space="preserve">~40 t/dia (12.480 t/ano ÷ 312 dias úteis)</w:t>
+            </w:r>
+          </w:p>
+        </w:tc>
+        <w:tc>
+          <w:tcPr>
+            <w:tcW w:type="dxa" w:w="3000"/>
+            <w:tcBorders>
+              <w:top w:val="single" w:color="999999" w:sz="1"/>
+              <w:left w:val="single" w:color="999999" w:sz="1"/>
+              <w:bottom w:val="single" w:color="999999" w:sz="1"/>
+              <w:right w:val="single" w:color="999999" w:sz="1"/>
+            </w:tcBorders>
+          </w:tcPr>
+          <w:p>
+            <w:pPr>
+              <w:spacing w:after="40" w:before="40"/>
+              <w:jc w:val="left"/>
+            </w:pPr>
+            <w:r>
+              <w:rPr>
+                <w:rFonts w:ascii="Times New Roman" w:cs="Times New Roman" w:eastAsia="Times New Roman" w:hAnsi="Times New Roman"/>
+                <w:sz w:val="20"/>
+                <w:szCs w:val="20"/>
+              </w:rPr>
+              <w:t xml:space="preserve">TR 1.1; cálculo</w:t>
+            </w:r>
+          </w:p>
+        </w:tc>
+      </w:tr>
+      <w:tr>
+        <w:tc>
+          <w:tcPr>
+            <w:tcW w:type="dxa" w:w="3200"/>
+            <w:tcBorders>
+              <w:top w:val="single" w:color="999999" w:sz="1"/>
+              <w:left w:val="single" w:color="999999" w:sz="1"/>
+              <w:bottom w:val="single" w:color="999999" w:sz="1"/>
+              <w:right w:val="single" w:color="999999" w:sz="1"/>
+            </w:tcBorders>
+          </w:tcPr>
+          <w:p>
+            <w:pPr>
+              <w:spacing w:after="40" w:before="40"/>
+              <w:jc w:val="left"/>
+            </w:pPr>
+            <w:r>
+              <w:rPr>
+                <w:rFonts w:ascii="Times New Roman" w:cs="Times New Roman" w:eastAsia="Times New Roman" w:hAnsi="Times New Roman"/>
+                <w:sz w:val="20"/>
+                <w:szCs w:val="20"/>
+              </w:rPr>
+              <w:t xml:space="preserve">Premissa da tabela de transbordo</w:t>
+            </w:r>
+          </w:p>
+        </w:tc>
+        <w:tc>
+          <w:tcPr>
+            <w:tcW w:type="dxa" w:w="3600"/>
+            <w:tcBorders>
+              <w:top w:val="single" w:color="999999" w:sz="1"/>
+              <w:left w:val="single" w:color="999999" w:sz="1"/>
+              <w:bottom w:val="single" w:color="999999" w:sz="1"/>
+              <w:right w:val="single" w:color="999999" w:sz="1"/>
+            </w:tcBorders>
+          </w:tcPr>
+          <w:p>
+            <w:pPr>
+              <w:spacing w:after="40" w:before="40"/>
+              <w:jc w:val="left"/>
+            </w:pPr>
+            <w:r>
+              <w:rPr>
+                <w:rFonts w:ascii="Times New Roman" w:cs="Times New Roman" w:eastAsia="Times New Roman" w:hAnsi="Times New Roman"/>
+                <w:sz w:val="20"/>
+                <w:szCs w:val="20"/>
+              </w:rPr>
+              <w:t xml:space="preserve">45 t/dia (1,5 viagens × 30 t)</w:t>
+            </w:r>
+          </w:p>
+        </w:tc>
+        <w:tc>
+          <w:tcPr>
+            <w:tcW w:type="dxa" w:w="3000"/>
+            <w:tcBorders>
+              <w:top w:val="single" w:color="999999" w:sz="1"/>
+              <w:left w:val="single" w:color="999999" w:sz="1"/>
+              <w:bottom w:val="single" w:color="999999" w:sz="1"/>
+              <w:right w:val="single" w:color="999999" w:sz="1"/>
+            </w:tcBorders>
+          </w:tcPr>
+          <w:p>
+            <w:pPr>
+              <w:spacing w:after="40" w:before="40"/>
+              <w:jc w:val="left"/>
+            </w:pPr>
+            <w:r>
+              <w:rPr>
+                <w:rFonts w:ascii="Times New Roman" w:cs="Times New Roman" w:eastAsia="Times New Roman" w:hAnsi="Times New Roman"/>
+                <w:sz w:val="20"/>
+                <w:szCs w:val="20"/>
+              </w:rPr>
+              <w:t xml:space="preserve">Tabela de Quilometragem</w:t>
+            </w:r>
+          </w:p>
+        </w:tc>
+      </w:tr>
+      <w:tr>
+        <w:tc>
+          <w:tcPr>
+            <w:tcW w:type="dxa" w:w="3200"/>
+            <w:tcBorders>
+              <w:top w:val="single" w:color="999999" w:sz="1"/>
+              <w:left w:val="single" w:color="999999" w:sz="1"/>
+              <w:bottom w:val="single" w:color="999999" w:sz="1"/>
+              <w:right w:val="single" w:color="999999" w:sz="1"/>
+            </w:tcBorders>
+          </w:tcPr>
+          <w:p>
+            <w:pPr>
+              <w:spacing w:after="40" w:before="40"/>
+              <w:jc w:val="left"/>
+            </w:pPr>
+            <w:r>
+              <w:rPr>
+                <w:rFonts w:ascii="Times New Roman" w:cs="Times New Roman" w:eastAsia="Times New Roman" w:hAnsi="Times New Roman"/>
+                <w:sz w:val="20"/>
+                <w:szCs w:val="20"/>
+              </w:rPr>
+              <w:t xml:space="preserve">Tonelagem pré-Decreto 3.367/2026</w:t>
+            </w:r>
+          </w:p>
+        </w:tc>
+        <w:tc>
+          <w:tcPr>
+            <w:tcW w:type="dxa" w:w="3600"/>
+            <w:tcBorders>
+              <w:top w:val="single" w:color="999999" w:sz="1"/>
+              <w:left w:val="single" w:color="999999" w:sz="1"/>
+              <w:bottom w:val="single" w:color="999999" w:sz="1"/>
+              <w:right w:val="single" w:color="999999" w:sz="1"/>
+            </w:tcBorders>
+          </w:tcPr>
+          <w:p>
+            <w:pPr>
+              <w:spacing w:after="40" w:before="40"/>
+              <w:jc w:val="left"/>
+            </w:pPr>
+            <w:r>
+              <w:rPr>
+                <w:rFonts w:ascii="Times New Roman" w:cs="Times New Roman" w:eastAsia="Times New Roman" w:hAnsi="Times New Roman"/>
+                <w:sz w:val="20"/>
+                <w:szCs w:val="20"/>
+              </w:rPr>
+              <w:t xml:space="preserve">~50 t/dia (1.300 t/mês ÷ 26 dias)</w:t>
+            </w:r>
+          </w:p>
+        </w:tc>
+        <w:tc>
+          <w:tcPr>
+            <w:tcW w:type="dxa" w:w="3000"/>
+            <w:tcBorders>
+              <w:top w:val="single" w:color="999999" w:sz="1"/>
+              <w:left w:val="single" w:color="999999" w:sz="1"/>
+              <w:bottom w:val="single" w:color="999999" w:sz="1"/>
+              <w:right w:val="single" w:color="999999" w:sz="1"/>
+            </w:tcBorders>
+          </w:tcPr>
+          <w:p>
+            <w:pPr>
+              <w:spacing w:after="40" w:before="40"/>
+              <w:jc w:val="left"/>
+            </w:pPr>
+            <w:r>
+              <w:rPr>
+                <w:rFonts w:ascii="Times New Roman" w:cs="Times New Roman" w:eastAsia="Times New Roman" w:hAnsi="Times New Roman"/>
+                <w:sz w:val="20"/>
+                <w:szCs w:val="20"/>
+              </w:rPr>
+              <w:t xml:space="preserve">ETP item 7</w:t>
+            </w:r>
+          </w:p>
+        </w:tc>
+      </w:tr>
+    </w:tbl>
+    <w:p>
+      <w:pPr>
+        <w:spacing w:after="120" w:before="0" w:line="276"/>
+        <w:jc w:val="both"/>
+      </w:pPr>
+      <w:r>
+        <w:rPr>
+          <w:rFonts w:ascii="Times New Roman" w:cs="Times New Roman" w:eastAsia="Times New Roman" w:hAnsi="Times New Roman"/>
+          <w:sz w:val="24"/>
+          <w:szCs w:val="24"/>
+        </w:rPr>
+        <w:t xml:space="preserve">Na média, a operação fica abaixo do teto de 60 t/dia. Nos </w:t>
+      </w:r>
+      <w:r>
+        <w:rPr>
+          <w:rFonts w:ascii="Times New Roman" w:cs="Times New Roman" w:eastAsia="Times New Roman" w:hAnsi="Times New Roman"/>
+          <w:b/>
+          <w:bCs/>
+          <w:sz w:val="24"/>
+          <w:szCs w:val="24"/>
+        </w:rPr>
+        <w:t xml:space="preserve">picos de segunda-feira</w:t>
+      </w:r>
+      <w:r>
+        <w:rPr>
+          <w:rFonts w:ascii="Times New Roman" w:cs="Times New Roman" w:eastAsia="Times New Roman" w:hAnsi="Times New Roman"/>
+          <w:sz w:val="24"/>
+          <w:szCs w:val="24"/>
+        </w:rPr>
+        <w:t xml:space="preserve">, porém, a concentração de coleta (região central diária + regiões alternadas + resíduo represado de domingo) pode se aproximar ou ultrapassar o limite licenciado. O edital </w:t>
+      </w:r>
+      <w:r>
+        <w:rPr>
+          <w:rFonts w:ascii="Times New Roman" w:cs="Times New Roman" w:eastAsia="Times New Roman" w:hAnsi="Times New Roman"/>
+          <w:b/>
+          <w:bCs/>
+          <w:sz w:val="24"/>
+          <w:szCs w:val="24"/>
+        </w:rPr>
+        <w:t xml:space="preserve">não prevê regra de escalonamento</w:t>
+      </w:r>
+      <w:r>
+        <w:rPr>
+          <w:rFonts w:ascii="Times New Roman" w:cs="Times New Roman" w:eastAsia="Times New Roman" w:hAnsi="Times New Roman"/>
+          <w:sz w:val="24"/>
+          <w:szCs w:val="24"/>
+        </w:rPr>
+        <w:t xml:space="preserve"> da descarga para administrar esses picos. A contratada fica entre a penalidade contratual por atraso (se não descarregar) e a operação em desacordo com a licença ambiental (se descarregar acima do teto — art. 60 da Lei n.º 9.605/1998).</w:t>
+      </w:r>
+    </w:p>
+    <w:p>
+      <w:pPr>
+        <w:spacing w:after="120" w:before="60" w:line="276"/>
+        <w:jc w:val="both"/>
+      </w:pPr>
+      <w:r>
+        <w:rPr>
+          <w:rFonts w:ascii="Times New Roman" w:cs="Times New Roman" w:eastAsia="Times New Roman" w:hAnsi="Times New Roman"/>
+          <w:i/>
+          <w:iCs/>
+          <w:sz w:val="24"/>
+          <w:szCs w:val="24"/>
+        </w:rPr>
+        <w:t xml:space="preserve">Este é um risco operacional adicional do Item 2 que o termo de assunção pode documentar — reforçando a conveniência da transição ao Item 3.</w:t>
+      </w:r>
+    </w:p>
+    <w:p>
+      <w:pPr>
+        <w:pBdr>
+          <w:bottom w:val="single" w:color="CCCCCC" w:sz="1" w:space="4"/>
+        </w:pBdr>
+        <w:spacing w:after="80" w:before="80"/>
+      </w:pPr>
+    </w:p>
+    <w:p>
+      <w:pPr>
+        <w:pStyle w:val="Heading2"/>
+        <w:spacing w:after="120" w:before="200"/>
+      </w:pPr>
+      <w:r>
+        <w:rPr>
+          <w:rFonts w:ascii="Times New Roman" w:cs="Times New Roman" w:eastAsia="Times New Roman" w:hAnsi="Times New Roman"/>
+          <w:b/>
+          <w:bCs/>
+          <w:sz w:val="28"/>
+          <w:szCs w:val="28"/>
+        </w:rPr>
+        <w:t xml:space="preserve">3. Sequência pós-adjudicação</w:t>
       </w:r>
     </w:p>
     <w:p>
@@ -2052,7 +3301,7 @@
           <w:sz w:val="28"/>
           <w:szCs w:val="28"/>
         </w:rPr>
-        <w:t xml:space="preserve">3. Proteção da contratada</w:t>
+        <w:t xml:space="preserve">4. Proteção da contratada</w:t>
       </w:r>
     </w:p>
     <w:tbl>
@@ -2509,7 +3758,7 @@
           <w:sz w:val="28"/>
           <w:szCs w:val="28"/>
         </w:rPr>
-        <w:t xml:space="preserve">4. Cronograma estimado</w:t>
+        <w:t xml:space="preserve">5. Cronograma estimado</w:t>
       </w:r>
     </w:p>
     <w:tbl>
@@ -2926,7 +4175,7 @@
           <w:sz w:val="28"/>
           <w:szCs w:val="28"/>
         </w:rPr>
-        <w:t xml:space="preserve">5. Riscos</w:t>
+        <w:t xml:space="preserve">6. Riscos</w:t>
       </w:r>
     </w:p>
     <w:tbl>

</xml_diff>

<commit_message>
Adiciona Seção 2 (O que é o baseline) ao documento de estratégia
Incorpora explicação do baseline prometido pela Administração na
resposta à 6.ª impugnação: as duas declarações (C-183/C-184), o que
o edital reaberto não contém, o que o TR exige sem esse registro, e
a vinculação pelo art. 164, parágrafo único, da Lei 14.133/2021.
Renumera seções 2-6 para 3-7.

Co-Authored-By: Claude Opus 4.6 <noreply@anthropic.com>
Claude-Session: https://claude.ai/code/session_01JB8NzdiM6CkTNUriijoKhD
</commit_message>
<xml_diff>
--- a/licitacoes-14133/porto-ferreira/docs/ESTRATEGIA_termo_assuncao_ET08.docx
+++ b/licitacoes-14133/porto-ferreira/docs/ESTRATEGIA_termo_assuncao_ET08.docx
@@ -672,7 +672,558 @@
           <w:sz w:val="28"/>
           <w:szCs w:val="28"/>
         </w:rPr>
-        <w:t xml:space="preserve">2. Estrutura contratual: Item 2 vs. Item 3</w:t>
+        <w:t xml:space="preserve">2. O que é o baseline</w:t>
+      </w:r>
+    </w:p>
+    <w:p>
+      <w:pPr>
+        <w:spacing w:after="120" w:before="0" w:line="276"/>
+        <w:jc w:val="both"/>
+      </w:pPr>
+      <w:r>
+        <w:rPr>
+          <w:rFonts w:ascii="Times New Roman" w:cs="Times New Roman" w:eastAsia="Times New Roman" w:hAnsi="Times New Roman"/>
+          <w:sz w:val="24"/>
+          <w:szCs w:val="24"/>
+        </w:rPr>
+        <w:t xml:space="preserve">A resposta à 6.ª impugnação contém duas declarações (C-183, C-184):</w:t>
+      </w:r>
+    </w:p>
+    <w:p>
+      <w:pPr>
+        <w:spacing w:after="120" w:before="60" w:line="276"/>
+        <w:ind w:left="720"/>
+        <w:jc w:val="both"/>
+      </w:pPr>
+      <w:r>
+        <w:rPr>
+          <w:rFonts w:ascii="Times New Roman" w:cs="Times New Roman" w:eastAsia="Times New Roman" w:hAnsi="Times New Roman"/>
+          <w:i/>
+          <w:iCs/>
+          <w:sz w:val="24"/>
+          <w:szCs w:val="24"/>
+        </w:rPr>
+        <w:t xml:space="preserve">"a contratada não responderá por passivos ambientais, estruturais ou operacionais anteriores ao início da execução, o que será consignado expressamente"</w:t>
+      </w:r>
+    </w:p>
+    <w:p>
+      <w:pPr>
+        <w:spacing w:after="120" w:before="60" w:line="276"/>
+        <w:ind w:left="720"/>
+        <w:jc w:val="both"/>
+      </w:pPr>
+      <w:r>
+        <w:rPr>
+          <w:rFonts w:ascii="Times New Roman" w:cs="Times New Roman" w:eastAsia="Times New Roman" w:hAnsi="Times New Roman"/>
+          <w:i/>
+          <w:iCs/>
+          <w:sz w:val="24"/>
+          <w:szCs w:val="24"/>
+        </w:rPr>
+        <w:t xml:space="preserve">"registro das condições iniciais da unidade por ocasião da assunção"</w:t>
+      </w:r>
+    </w:p>
+    <w:p>
+      <w:pPr>
+        <w:spacing w:after="120" w:before="0" w:line="276"/>
+        <w:jc w:val="both"/>
+      </w:pPr>
+      <w:r>
+        <w:rPr>
+          <w:rFonts w:ascii="Times New Roman" w:cs="Times New Roman" w:eastAsia="Times New Roman" w:hAnsi="Times New Roman"/>
+          <w:sz w:val="24"/>
+          <w:szCs w:val="24"/>
+        </w:rPr>
+        <w:t xml:space="preserve">O baseline é esse registro: o estado da Vala 05 no momento em que a contratada assume a operação.</w:t>
+      </w:r>
+    </w:p>
+    <w:p>
+      <w:pPr>
+        <w:pStyle w:val="Heading3"/>
+        <w:spacing w:after="120" w:before="200"/>
+      </w:pPr>
+      <w:r>
+        <w:rPr>
+          <w:rFonts w:ascii="Times New Roman" w:cs="Times New Roman" w:eastAsia="Times New Roman" w:hAnsi="Times New Roman"/>
+          <w:b/>
+          <w:bCs/>
+          <w:sz w:val="26"/>
+          <w:szCs w:val="26"/>
+        </w:rPr>
+        <w:t xml:space="preserve">O que o edital reaberto não contém</w:t>
+      </w:r>
+    </w:p>
+    <w:tbl>
+      <w:tblPr>
+        <w:tblW w:type="dxa" w:w="9800"/>
+        <w:tblBorders>
+          <w:top w:val="single" w:color="auto" w:sz="4"/>
+          <w:left w:val="single" w:color="auto" w:sz="4"/>
+          <w:bottom w:val="single" w:color="auto" w:sz="4"/>
+          <w:right w:val="single" w:color="auto" w:sz="4"/>
+          <w:insideH w:val="single" w:color="auto" w:sz="4"/>
+          <w:insideV w:val="single" w:color="auto" w:sz="4"/>
+        </w:tblBorders>
+        <w:tblLayout w:type="fixed"/>
+      </w:tblPr>
+      <w:tblGrid>
+        <w:gridCol w:w="4800"/>
+        <w:gridCol w:w="5000"/>
+      </w:tblGrid>
+      <w:tr>
+        <w:trPr>
+          <w:tblHeader/>
+        </w:trPr>
+        <w:tc>
+          <w:tcPr>
+            <w:tcW w:type="dxa" w:w="4800"/>
+            <w:tcBorders>
+              <w:top w:val="single" w:color="999999" w:sz="1"/>
+              <w:left w:val="single" w:color="999999" w:sz="1"/>
+              <w:bottom w:val="single" w:color="999999" w:sz="1"/>
+              <w:right w:val="single" w:color="999999" w:sz="1"/>
+            </w:tcBorders>
+            <w:shd w:fill="1F3864" w:color="auto" w:val="clear"/>
+          </w:tcPr>
+          <w:p>
+            <w:pPr>
+              <w:spacing w:after="40" w:before="40"/>
+              <w:jc w:val="left"/>
+            </w:pPr>
+            <w:r>
+              <w:rPr>
+                <w:rFonts w:ascii="Times New Roman" w:cs="Times New Roman" w:eastAsia="Times New Roman" w:hAnsi="Times New Roman"/>
+                <w:b/>
+                <w:bCs/>
+                <w:color w:val="FFFFFF"/>
+                <w:sz w:val="20"/>
+                <w:szCs w:val="20"/>
+              </w:rPr>
+              <w:t xml:space="preserve">Elemento prometido</w:t>
+            </w:r>
+          </w:p>
+        </w:tc>
+        <w:tc>
+          <w:tcPr>
+            <w:tcW w:type="dxa" w:w="5000"/>
+            <w:tcBorders>
+              <w:top w:val="single" w:color="999999" w:sz="1"/>
+              <w:left w:val="single" w:color="999999" w:sz="1"/>
+              <w:bottom w:val="single" w:color="999999" w:sz="1"/>
+              <w:right w:val="single" w:color="999999" w:sz="1"/>
+            </w:tcBorders>
+            <w:shd w:fill="1F3864" w:color="auto" w:val="clear"/>
+          </w:tcPr>
+          <w:p>
+            <w:pPr>
+              <w:spacing w:after="40" w:before="40"/>
+              <w:jc w:val="left"/>
+            </w:pPr>
+            <w:r>
+              <w:rPr>
+                <w:rFonts w:ascii="Times New Roman" w:cs="Times New Roman" w:eastAsia="Times New Roman" w:hAnsi="Times New Roman"/>
+                <w:b/>
+                <w:bCs/>
+                <w:color w:val="FFFFFF"/>
+                <w:sz w:val="20"/>
+                <w:szCs w:val="20"/>
+              </w:rPr>
+              <w:t xml:space="preserve">Situação no edital reaberto</w:t>
+            </w:r>
+          </w:p>
+        </w:tc>
+      </w:tr>
+      <w:tr>
+        <w:tc>
+          <w:tcPr>
+            <w:tcW w:type="dxa" w:w="4800"/>
+            <w:tcBorders>
+              <w:top w:val="single" w:color="999999" w:sz="1"/>
+              <w:left w:val="single" w:color="999999" w:sz="1"/>
+              <w:bottom w:val="single" w:color="999999" w:sz="1"/>
+              <w:right w:val="single" w:color="999999" w:sz="1"/>
+            </w:tcBorders>
+          </w:tcPr>
+          <w:p>
+            <w:pPr>
+              <w:spacing w:after="40" w:before="40"/>
+              <w:jc w:val="left"/>
+            </w:pPr>
+            <w:r>
+              <w:rPr>
+                <w:rFonts w:ascii="Times New Roman" w:cs="Times New Roman" w:eastAsia="Times New Roman" w:hAnsi="Times New Roman"/>
+                <w:sz w:val="20"/>
+                <w:szCs w:val="20"/>
+              </w:rPr>
+              <w:t xml:space="preserve">Termo "passivo"</w:t>
+            </w:r>
+          </w:p>
+        </w:tc>
+        <w:tc>
+          <w:tcPr>
+            <w:tcW w:type="dxa" w:w="5000"/>
+            <w:tcBorders>
+              <w:top w:val="single" w:color="999999" w:sz="1"/>
+              <w:left w:val="single" w:color="999999" w:sz="1"/>
+              <w:bottom w:val="single" w:color="999999" w:sz="1"/>
+              <w:right w:val="single" w:color="999999" w:sz="1"/>
+            </w:tcBorders>
+          </w:tcPr>
+          <w:p>
+            <w:pPr>
+              <w:spacing w:after="40" w:before="40"/>
+              <w:jc w:val="left"/>
+            </w:pPr>
+            <w:r>
+              <w:rPr>
+                <w:rFonts w:ascii="Times New Roman" w:cs="Times New Roman" w:eastAsia="Times New Roman" w:hAnsi="Times New Roman"/>
+                <w:sz w:val="20"/>
+                <w:szCs w:val="20"/>
+              </w:rPr>
+              <w:t xml:space="preserve">Não aparece em nenhum dispositivo</w:t>
+            </w:r>
+          </w:p>
+        </w:tc>
+      </w:tr>
+      <w:tr>
+        <w:tc>
+          <w:tcPr>
+            <w:tcW w:type="dxa" w:w="4800"/>
+            <w:tcBorders>
+              <w:top w:val="single" w:color="999999" w:sz="1"/>
+              <w:left w:val="single" w:color="999999" w:sz="1"/>
+              <w:bottom w:val="single" w:color="999999" w:sz="1"/>
+              <w:right w:val="single" w:color="999999" w:sz="1"/>
+            </w:tcBorders>
+          </w:tcPr>
+          <w:p>
+            <w:pPr>
+              <w:spacing w:after="40" w:before="40"/>
+              <w:jc w:val="left"/>
+            </w:pPr>
+            <w:r>
+              <w:rPr>
+                <w:rFonts w:ascii="Times New Roman" w:cs="Times New Roman" w:eastAsia="Times New Roman" w:hAnsi="Times New Roman"/>
+                <w:sz w:val="20"/>
+                <w:szCs w:val="20"/>
+              </w:rPr>
+              <w:t xml:space="preserve">Cláusula de não responsabilização por passivos anteriores</w:t>
+            </w:r>
+          </w:p>
+        </w:tc>
+        <w:tc>
+          <w:tcPr>
+            <w:tcW w:type="dxa" w:w="5000"/>
+            <w:tcBorders>
+              <w:top w:val="single" w:color="999999" w:sz="1"/>
+              <w:left w:val="single" w:color="999999" w:sz="1"/>
+              <w:bottom w:val="single" w:color="999999" w:sz="1"/>
+              <w:right w:val="single" w:color="999999" w:sz="1"/>
+            </w:tcBorders>
+          </w:tcPr>
+          <w:p>
+            <w:pPr>
+              <w:spacing w:after="40" w:before="40"/>
+              <w:jc w:val="left"/>
+            </w:pPr>
+            <w:r>
+              <w:rPr>
+                <w:rFonts w:ascii="Times New Roman" w:cs="Times New Roman" w:eastAsia="Times New Roman" w:hAnsi="Times New Roman"/>
+                <w:sz w:val="20"/>
+                <w:szCs w:val="20"/>
+              </w:rPr>
+              <w:t xml:space="preserve">Inexistente</w:t>
+            </w:r>
+          </w:p>
+        </w:tc>
+      </w:tr>
+      <w:tr>
+        <w:tc>
+          <w:tcPr>
+            <w:tcW w:type="dxa" w:w="4800"/>
+            <w:tcBorders>
+              <w:top w:val="single" w:color="999999" w:sz="1"/>
+              <w:left w:val="single" w:color="999999" w:sz="1"/>
+              <w:bottom w:val="single" w:color="999999" w:sz="1"/>
+              <w:right w:val="single" w:color="999999" w:sz="1"/>
+            </w:tcBorders>
+          </w:tcPr>
+          <w:p>
+            <w:pPr>
+              <w:spacing w:after="40" w:before="40"/>
+              <w:jc w:val="left"/>
+            </w:pPr>
+            <w:r>
+              <w:rPr>
+                <w:rFonts w:ascii="Times New Roman" w:cs="Times New Roman" w:eastAsia="Times New Roman" w:hAnsi="Times New Roman"/>
+                <w:sz w:val="20"/>
+                <w:szCs w:val="20"/>
+              </w:rPr>
+              <w:t xml:space="preserve">Vistoria conjunta</w:t>
+            </w:r>
+          </w:p>
+        </w:tc>
+        <w:tc>
+          <w:tcPr>
+            <w:tcW w:type="dxa" w:w="5000"/>
+            <w:tcBorders>
+              <w:top w:val="single" w:color="999999" w:sz="1"/>
+              <w:left w:val="single" w:color="999999" w:sz="1"/>
+              <w:bottom w:val="single" w:color="999999" w:sz="1"/>
+              <w:right w:val="single" w:color="999999" w:sz="1"/>
+            </w:tcBorders>
+          </w:tcPr>
+          <w:p>
+            <w:pPr>
+              <w:spacing w:after="40" w:before="40"/>
+              <w:jc w:val="left"/>
+            </w:pPr>
+            <w:r>
+              <w:rPr>
+                <w:rFonts w:ascii="Times New Roman" w:cs="Times New Roman" w:eastAsia="Times New Roman" w:hAnsi="Times New Roman"/>
+                <w:sz w:val="20"/>
+                <w:szCs w:val="20"/>
+              </w:rPr>
+              <w:t xml:space="preserve">Não prevista</w:t>
+            </w:r>
+          </w:p>
+        </w:tc>
+      </w:tr>
+      <w:tr>
+        <w:tc>
+          <w:tcPr>
+            <w:tcW w:type="dxa" w:w="4800"/>
+            <w:tcBorders>
+              <w:top w:val="single" w:color="999999" w:sz="1"/>
+              <w:left w:val="single" w:color="999999" w:sz="1"/>
+              <w:bottom w:val="single" w:color="999999" w:sz="1"/>
+              <w:right w:val="single" w:color="999999" w:sz="1"/>
+            </w:tcBorders>
+          </w:tcPr>
+          <w:p>
+            <w:pPr>
+              <w:spacing w:after="40" w:before="40"/>
+              <w:jc w:val="left"/>
+            </w:pPr>
+            <w:r>
+              <w:rPr>
+                <w:rFonts w:ascii="Times New Roman" w:cs="Times New Roman" w:eastAsia="Times New Roman" w:hAnsi="Times New Roman"/>
+                <w:sz w:val="20"/>
+                <w:szCs w:val="20"/>
+              </w:rPr>
+              <w:t xml:space="preserve">Inventário de condições iniciais</w:t>
+            </w:r>
+          </w:p>
+        </w:tc>
+        <w:tc>
+          <w:tcPr>
+            <w:tcW w:type="dxa" w:w="5000"/>
+            <w:tcBorders>
+              <w:top w:val="single" w:color="999999" w:sz="1"/>
+              <w:left w:val="single" w:color="999999" w:sz="1"/>
+              <w:bottom w:val="single" w:color="999999" w:sz="1"/>
+              <w:right w:val="single" w:color="999999" w:sz="1"/>
+            </w:tcBorders>
+          </w:tcPr>
+          <w:p>
+            <w:pPr>
+              <w:spacing w:after="40" w:before="40"/>
+              <w:jc w:val="left"/>
+            </w:pPr>
+            <w:r>
+              <w:rPr>
+                <w:rFonts w:ascii="Times New Roman" w:cs="Times New Roman" w:eastAsia="Times New Roman" w:hAnsi="Times New Roman"/>
+                <w:sz w:val="20"/>
+                <w:szCs w:val="20"/>
+              </w:rPr>
+              <w:t xml:space="preserve">Não previsto</w:t>
+            </w:r>
+          </w:p>
+        </w:tc>
+      </w:tr>
+      <w:tr>
+        <w:tc>
+          <w:tcPr>
+            <w:tcW w:type="dxa" w:w="4800"/>
+            <w:tcBorders>
+              <w:top w:val="single" w:color="999999" w:sz="1"/>
+              <w:left w:val="single" w:color="999999" w:sz="1"/>
+              <w:bottom w:val="single" w:color="999999" w:sz="1"/>
+              <w:right w:val="single" w:color="999999" w:sz="1"/>
+            </w:tcBorders>
+          </w:tcPr>
+          <w:p>
+            <w:pPr>
+              <w:spacing w:after="40" w:before="40"/>
+              <w:jc w:val="left"/>
+            </w:pPr>
+            <w:r>
+              <w:rPr>
+                <w:rFonts w:ascii="Times New Roman" w:cs="Times New Roman" w:eastAsia="Times New Roman" w:hAnsi="Times New Roman"/>
+                <w:sz w:val="20"/>
+                <w:szCs w:val="20"/>
+              </w:rPr>
+              <w:t xml:space="preserve">Termo de assunção operacional</w:t>
+            </w:r>
+          </w:p>
+        </w:tc>
+        <w:tc>
+          <w:tcPr>
+            <w:tcW w:type="dxa" w:w="5000"/>
+            <w:tcBorders>
+              <w:top w:val="single" w:color="999999" w:sz="1"/>
+              <w:left w:val="single" w:color="999999" w:sz="1"/>
+              <w:bottom w:val="single" w:color="999999" w:sz="1"/>
+              <w:right w:val="single" w:color="999999" w:sz="1"/>
+            </w:tcBorders>
+          </w:tcPr>
+          <w:p>
+            <w:pPr>
+              <w:spacing w:after="40" w:before="40"/>
+              <w:jc w:val="left"/>
+            </w:pPr>
+            <w:r>
+              <w:rPr>
+                <w:rFonts w:ascii="Times New Roman" w:cs="Times New Roman" w:eastAsia="Times New Roman" w:hAnsi="Times New Roman"/>
+                <w:sz w:val="20"/>
+                <w:szCs w:val="20"/>
+              </w:rPr>
+              <w:t xml:space="preserve">Não previsto</w:t>
+            </w:r>
+          </w:p>
+        </w:tc>
+      </w:tr>
+    </w:tbl>
+    <w:p>
+      <w:pPr>
+        <w:pStyle w:val="Heading3"/>
+        <w:spacing w:after="120" w:before="200"/>
+      </w:pPr>
+      <w:r>
+        <w:rPr>
+          <w:rFonts w:ascii="Times New Roman" w:cs="Times New Roman" w:eastAsia="Times New Roman" w:hAnsi="Times New Roman"/>
+          <w:b/>
+          <w:bCs/>
+          <w:sz w:val="26"/>
+          <w:szCs w:val="26"/>
+        </w:rPr>
+        <w:t xml:space="preserve">O que o TR exige da contratada sem esse registro</w:t>
+      </w:r>
+    </w:p>
+    <w:p>
+      <w:pPr>
+        <w:spacing w:after="120" w:before="0" w:line="276"/>
+        <w:jc w:val="both"/>
+      </w:pPr>
+      <w:r>
+        <w:rPr>
+          <w:rFonts w:ascii="Times New Roman" w:cs="Times New Roman" w:eastAsia="Times New Roman" w:hAnsi="Times New Roman"/>
+          <w:sz w:val="24"/>
+          <w:szCs w:val="24"/>
+        </w:rPr>
+        <w:t xml:space="preserve">O TR atribui à contratada a obrigação de "garantir que o Aterro Sanitário possua uma camada de impermeabilização de base, constituída de geomembrana de polietileno de alta densidade – PEAD" e os sistemas de drenagem de chorume e de gases (TR 5.5.5–5.5.15; C-190) — sistemas que a contratada não projetou nem construiu, sem laudo de estado inicial nem inventário de passivos.</w:t>
+      </w:r>
+    </w:p>
+    <w:p>
+      <w:pPr>
+        <w:spacing w:after="120" w:before="0" w:line="276"/>
+        <w:jc w:val="both"/>
+      </w:pPr>
+      <w:r>
+        <w:rPr>
+          <w:rFonts w:ascii="Times New Roman" w:cs="Times New Roman" w:eastAsia="Times New Roman" w:hAnsi="Times New Roman"/>
+          <w:sz w:val="24"/>
+          <w:szCs w:val="24"/>
+        </w:rPr>
+        <w:t xml:space="preserve">A ET-08 da LO exige a implantação "em </w:t>
+      </w:r>
+      <w:r>
+        <w:rPr>
+          <w:rFonts w:ascii="Times New Roman" w:cs="Times New Roman" w:eastAsia="Times New Roman" w:hAnsi="Times New Roman"/>
+          <w:b/>
+          <w:bCs/>
+          <w:sz w:val="24"/>
+          <w:szCs w:val="24"/>
+        </w:rPr>
+        <w:t xml:space="preserve">toda</w:t>
+      </w:r>
+      <w:r>
+        <w:rPr>
+          <w:rFonts w:ascii="Times New Roman" w:cs="Times New Roman" w:eastAsia="Times New Roman" w:hAnsi="Times New Roman"/>
+          <w:sz w:val="24"/>
+          <w:szCs w:val="24"/>
+        </w:rPr>
+        <w:t xml:space="preserve"> a Vala nº 05" desses mesmos três sistemas: drenagem de chorume, impermeabilização com manta PEAD e drenagem de gases. A contratada assume a obrigação de garantir uma infraestrutura preexistente sem saber em que estado essa infraestrutura se encontra.</w:t>
+      </w:r>
+    </w:p>
+    <w:p>
+      <w:pPr>
+        <w:pStyle w:val="Heading3"/>
+        <w:spacing w:after="120" w:before="200"/>
+      </w:pPr>
+      <w:r>
+        <w:rPr>
+          <w:rFonts w:ascii="Times New Roman" w:cs="Times New Roman" w:eastAsia="Times New Roman" w:hAnsi="Times New Roman"/>
+          <w:b/>
+          <w:bCs/>
+          <w:sz w:val="26"/>
+          <w:szCs w:val="26"/>
+        </w:rPr>
+        <w:t xml:space="preserve">Por que a resposta à 6.ª impugnação vincula</w:t>
+      </w:r>
+    </w:p>
+    <w:p>
+      <w:pPr>
+        <w:spacing w:after="120" w:before="0" w:line="276"/>
+        <w:jc w:val="both"/>
+      </w:pPr>
+      <w:r>
+        <w:rPr>
+          <w:rFonts w:ascii="Times New Roman" w:cs="Times New Roman" w:eastAsia="Times New Roman" w:hAnsi="Times New Roman"/>
+          <w:sz w:val="24"/>
+          <w:szCs w:val="24"/>
+        </w:rPr>
+        <w:t xml:space="preserve">Art. 164, parágrafo único, da Lei n.º 14.133/2021: a resposta à impugnação vincula a Administração. A Administração reconheceu a necessidade do registro das condições iniciais e da cláusula de não responsabilização — e não incorporou nenhuma das duas ao edital reaberto (T15, C-063).</w:t>
+      </w:r>
+    </w:p>
+    <w:p>
+      <w:pPr>
+        <w:spacing w:after="200" w:before="60" w:line="276"/>
+        <w:jc w:val="both"/>
+      </w:pPr>
+      <w:r>
+        <w:rPr>
+          <w:rFonts w:ascii="Times New Roman" w:cs="Times New Roman" w:eastAsia="Times New Roman" w:hAnsi="Times New Roman"/>
+          <w:i/>
+          <w:iCs/>
+          <w:sz w:val="24"/>
+          <w:szCs w:val="24"/>
+        </w:rPr>
+        <w:t xml:space="preserve">O termo de assunção operacional (Seção 4, Etapa 1) é a cobrança dessas duas declarações no D+1 do contrato.</w:t>
+      </w:r>
+    </w:p>
+    <w:p>
+      <w:pPr>
+        <w:pBdr>
+          <w:bottom w:val="single" w:color="CCCCCC" w:sz="1" w:space="4"/>
+        </w:pBdr>
+        <w:spacing w:after="80" w:before="80"/>
+      </w:pPr>
+    </w:p>
+    <w:p>
+      <w:pPr>
+        <w:pStyle w:val="Heading2"/>
+        <w:spacing w:after="120" w:before="200"/>
+      </w:pPr>
+      <w:r>
+        <w:rPr>
+          <w:rFonts w:ascii="Times New Roman" w:cs="Times New Roman" w:eastAsia="Times New Roman" w:hAnsi="Times New Roman"/>
+          <w:b/>
+          <w:bCs/>
+          <w:sz w:val="28"/>
+          <w:szCs w:val="28"/>
+        </w:rPr>
+        <w:t xml:space="preserve">3. Estrutura contratual: Item 2 vs. Item 3</w:t>
       </w:r>
     </w:p>
     <w:p>
@@ -1921,7 +2472,7 @@
           <w:sz w:val="28"/>
           <w:szCs w:val="28"/>
         </w:rPr>
-        <w:t xml:space="preserve">3. Sequência pós-adjudicação</w:t>
+        <w:t xml:space="preserve">4. Sequência pós-adjudicação</w:t>
       </w:r>
     </w:p>
     <w:p>
@@ -3301,7 +3852,7 @@
           <w:sz w:val="28"/>
           <w:szCs w:val="28"/>
         </w:rPr>
-        <w:t xml:space="preserve">4. Proteção da contratada</w:t>
+        <w:t xml:space="preserve">5. Proteção da contratada</w:t>
       </w:r>
     </w:p>
     <w:tbl>
@@ -3758,7 +4309,7 @@
           <w:sz w:val="28"/>
           <w:szCs w:val="28"/>
         </w:rPr>
-        <w:t xml:space="preserve">5. Cronograma estimado</w:t>
+        <w:t xml:space="preserve">6. Cronograma estimado</w:t>
       </w:r>
     </w:p>
     <w:tbl>
@@ -4175,7 +4726,7 @@
           <w:sz w:val="28"/>
           <w:szCs w:val="28"/>
         </w:rPr>
-        <w:t xml:space="preserve">6. Riscos</w:t>
+        <w:t xml:space="preserve">7. Riscos</w:t>
       </w:r>
     </w:p>
     <w:tbl>

</xml_diff>

<commit_message>
Remove seção de baseline e todas as menções ao termo
Seção 2 (O que é o baseline) removida integramente.
Substituições: baseline → termo de assunção ou registro das
condições iniciais, conforme o contexto. Renumera seções 2-6.

Co-Authored-By: Claude Opus 4.6 <noreply@anthropic.com>
Claude-Session: https://claude.ai/code/session_01JB8NzdiM6CkTNUriijoKhD
</commit_message>
<xml_diff>
--- a/licitacoes-14133/porto-ferreira/docs/ESTRATEGIA_termo_assuncao_ET08.docx
+++ b/licitacoes-14133/porto-ferreira/docs/ESTRATEGIA_termo_assuncao_ET08.docx
@@ -672,558 +672,7 @@
           <w:sz w:val="28"/>
           <w:szCs w:val="28"/>
         </w:rPr>
-        <w:t xml:space="preserve">2. O que é o baseline</w:t>
-      </w:r>
-    </w:p>
-    <w:p>
-      <w:pPr>
-        <w:spacing w:after="120" w:before="0" w:line="276"/>
-        <w:jc w:val="both"/>
-      </w:pPr>
-      <w:r>
-        <w:rPr>
-          <w:rFonts w:ascii="Times New Roman" w:cs="Times New Roman" w:eastAsia="Times New Roman" w:hAnsi="Times New Roman"/>
-          <w:sz w:val="24"/>
-          <w:szCs w:val="24"/>
-        </w:rPr>
-        <w:t xml:space="preserve">A resposta à 6.ª impugnação contém duas declarações (C-183, C-184):</w:t>
-      </w:r>
-    </w:p>
-    <w:p>
-      <w:pPr>
-        <w:spacing w:after="120" w:before="60" w:line="276"/>
-        <w:ind w:left="720"/>
-        <w:jc w:val="both"/>
-      </w:pPr>
-      <w:r>
-        <w:rPr>
-          <w:rFonts w:ascii="Times New Roman" w:cs="Times New Roman" w:eastAsia="Times New Roman" w:hAnsi="Times New Roman"/>
-          <w:i/>
-          <w:iCs/>
-          <w:sz w:val="24"/>
-          <w:szCs w:val="24"/>
-        </w:rPr>
-        <w:t xml:space="preserve">"a contratada não responderá por passivos ambientais, estruturais ou operacionais anteriores ao início da execução, o que será consignado expressamente"</w:t>
-      </w:r>
-    </w:p>
-    <w:p>
-      <w:pPr>
-        <w:spacing w:after="120" w:before="60" w:line="276"/>
-        <w:ind w:left="720"/>
-        <w:jc w:val="both"/>
-      </w:pPr>
-      <w:r>
-        <w:rPr>
-          <w:rFonts w:ascii="Times New Roman" w:cs="Times New Roman" w:eastAsia="Times New Roman" w:hAnsi="Times New Roman"/>
-          <w:i/>
-          <w:iCs/>
-          <w:sz w:val="24"/>
-          <w:szCs w:val="24"/>
-        </w:rPr>
-        <w:t xml:space="preserve">"registro das condições iniciais da unidade por ocasião da assunção"</w:t>
-      </w:r>
-    </w:p>
-    <w:p>
-      <w:pPr>
-        <w:spacing w:after="120" w:before="0" w:line="276"/>
-        <w:jc w:val="both"/>
-      </w:pPr>
-      <w:r>
-        <w:rPr>
-          <w:rFonts w:ascii="Times New Roman" w:cs="Times New Roman" w:eastAsia="Times New Roman" w:hAnsi="Times New Roman"/>
-          <w:sz w:val="24"/>
-          <w:szCs w:val="24"/>
-        </w:rPr>
-        <w:t xml:space="preserve">O baseline é esse registro: o estado da Vala 05 no momento em que a contratada assume a operação.</w:t>
-      </w:r>
-    </w:p>
-    <w:p>
-      <w:pPr>
-        <w:pStyle w:val="Heading3"/>
-        <w:spacing w:after="120" w:before="200"/>
-      </w:pPr>
-      <w:r>
-        <w:rPr>
-          <w:rFonts w:ascii="Times New Roman" w:cs="Times New Roman" w:eastAsia="Times New Roman" w:hAnsi="Times New Roman"/>
-          <w:b/>
-          <w:bCs/>
-          <w:sz w:val="26"/>
-          <w:szCs w:val="26"/>
-        </w:rPr>
-        <w:t xml:space="preserve">O que o edital reaberto não contém</w:t>
-      </w:r>
-    </w:p>
-    <w:tbl>
-      <w:tblPr>
-        <w:tblW w:type="dxa" w:w="9800"/>
-        <w:tblBorders>
-          <w:top w:val="single" w:color="auto" w:sz="4"/>
-          <w:left w:val="single" w:color="auto" w:sz="4"/>
-          <w:bottom w:val="single" w:color="auto" w:sz="4"/>
-          <w:right w:val="single" w:color="auto" w:sz="4"/>
-          <w:insideH w:val="single" w:color="auto" w:sz="4"/>
-          <w:insideV w:val="single" w:color="auto" w:sz="4"/>
-        </w:tblBorders>
-        <w:tblLayout w:type="fixed"/>
-      </w:tblPr>
-      <w:tblGrid>
-        <w:gridCol w:w="4800"/>
-        <w:gridCol w:w="5000"/>
-      </w:tblGrid>
-      <w:tr>
-        <w:trPr>
-          <w:tblHeader/>
-        </w:trPr>
-        <w:tc>
-          <w:tcPr>
-            <w:tcW w:type="dxa" w:w="4800"/>
-            <w:tcBorders>
-              <w:top w:val="single" w:color="999999" w:sz="1"/>
-              <w:left w:val="single" w:color="999999" w:sz="1"/>
-              <w:bottom w:val="single" w:color="999999" w:sz="1"/>
-              <w:right w:val="single" w:color="999999" w:sz="1"/>
-            </w:tcBorders>
-            <w:shd w:fill="1F3864" w:color="auto" w:val="clear"/>
-          </w:tcPr>
-          <w:p>
-            <w:pPr>
-              <w:spacing w:after="40" w:before="40"/>
-              <w:jc w:val="left"/>
-            </w:pPr>
-            <w:r>
-              <w:rPr>
-                <w:rFonts w:ascii="Times New Roman" w:cs="Times New Roman" w:eastAsia="Times New Roman" w:hAnsi="Times New Roman"/>
-                <w:b/>
-                <w:bCs/>
-                <w:color w:val="FFFFFF"/>
-                <w:sz w:val="20"/>
-                <w:szCs w:val="20"/>
-              </w:rPr>
-              <w:t xml:space="preserve">Elemento prometido</w:t>
-            </w:r>
-          </w:p>
-        </w:tc>
-        <w:tc>
-          <w:tcPr>
-            <w:tcW w:type="dxa" w:w="5000"/>
-            <w:tcBorders>
-              <w:top w:val="single" w:color="999999" w:sz="1"/>
-              <w:left w:val="single" w:color="999999" w:sz="1"/>
-              <w:bottom w:val="single" w:color="999999" w:sz="1"/>
-              <w:right w:val="single" w:color="999999" w:sz="1"/>
-            </w:tcBorders>
-            <w:shd w:fill="1F3864" w:color="auto" w:val="clear"/>
-          </w:tcPr>
-          <w:p>
-            <w:pPr>
-              <w:spacing w:after="40" w:before="40"/>
-              <w:jc w:val="left"/>
-            </w:pPr>
-            <w:r>
-              <w:rPr>
-                <w:rFonts w:ascii="Times New Roman" w:cs="Times New Roman" w:eastAsia="Times New Roman" w:hAnsi="Times New Roman"/>
-                <w:b/>
-                <w:bCs/>
-                <w:color w:val="FFFFFF"/>
-                <w:sz w:val="20"/>
-                <w:szCs w:val="20"/>
-              </w:rPr>
-              <w:t xml:space="preserve">Situação no edital reaberto</w:t>
-            </w:r>
-          </w:p>
-        </w:tc>
-      </w:tr>
-      <w:tr>
-        <w:tc>
-          <w:tcPr>
-            <w:tcW w:type="dxa" w:w="4800"/>
-            <w:tcBorders>
-              <w:top w:val="single" w:color="999999" w:sz="1"/>
-              <w:left w:val="single" w:color="999999" w:sz="1"/>
-              <w:bottom w:val="single" w:color="999999" w:sz="1"/>
-              <w:right w:val="single" w:color="999999" w:sz="1"/>
-            </w:tcBorders>
-          </w:tcPr>
-          <w:p>
-            <w:pPr>
-              <w:spacing w:after="40" w:before="40"/>
-              <w:jc w:val="left"/>
-            </w:pPr>
-            <w:r>
-              <w:rPr>
-                <w:rFonts w:ascii="Times New Roman" w:cs="Times New Roman" w:eastAsia="Times New Roman" w:hAnsi="Times New Roman"/>
-                <w:sz w:val="20"/>
-                <w:szCs w:val="20"/>
-              </w:rPr>
-              <w:t xml:space="preserve">Termo "passivo"</w:t>
-            </w:r>
-          </w:p>
-        </w:tc>
-        <w:tc>
-          <w:tcPr>
-            <w:tcW w:type="dxa" w:w="5000"/>
-            <w:tcBorders>
-              <w:top w:val="single" w:color="999999" w:sz="1"/>
-              <w:left w:val="single" w:color="999999" w:sz="1"/>
-              <w:bottom w:val="single" w:color="999999" w:sz="1"/>
-              <w:right w:val="single" w:color="999999" w:sz="1"/>
-            </w:tcBorders>
-          </w:tcPr>
-          <w:p>
-            <w:pPr>
-              <w:spacing w:after="40" w:before="40"/>
-              <w:jc w:val="left"/>
-            </w:pPr>
-            <w:r>
-              <w:rPr>
-                <w:rFonts w:ascii="Times New Roman" w:cs="Times New Roman" w:eastAsia="Times New Roman" w:hAnsi="Times New Roman"/>
-                <w:sz w:val="20"/>
-                <w:szCs w:val="20"/>
-              </w:rPr>
-              <w:t xml:space="preserve">Não aparece em nenhum dispositivo</w:t>
-            </w:r>
-          </w:p>
-        </w:tc>
-      </w:tr>
-      <w:tr>
-        <w:tc>
-          <w:tcPr>
-            <w:tcW w:type="dxa" w:w="4800"/>
-            <w:tcBorders>
-              <w:top w:val="single" w:color="999999" w:sz="1"/>
-              <w:left w:val="single" w:color="999999" w:sz="1"/>
-              <w:bottom w:val="single" w:color="999999" w:sz="1"/>
-              <w:right w:val="single" w:color="999999" w:sz="1"/>
-            </w:tcBorders>
-          </w:tcPr>
-          <w:p>
-            <w:pPr>
-              <w:spacing w:after="40" w:before="40"/>
-              <w:jc w:val="left"/>
-            </w:pPr>
-            <w:r>
-              <w:rPr>
-                <w:rFonts w:ascii="Times New Roman" w:cs="Times New Roman" w:eastAsia="Times New Roman" w:hAnsi="Times New Roman"/>
-                <w:sz w:val="20"/>
-                <w:szCs w:val="20"/>
-              </w:rPr>
-              <w:t xml:space="preserve">Cláusula de não responsabilização por passivos anteriores</w:t>
-            </w:r>
-          </w:p>
-        </w:tc>
-        <w:tc>
-          <w:tcPr>
-            <w:tcW w:type="dxa" w:w="5000"/>
-            <w:tcBorders>
-              <w:top w:val="single" w:color="999999" w:sz="1"/>
-              <w:left w:val="single" w:color="999999" w:sz="1"/>
-              <w:bottom w:val="single" w:color="999999" w:sz="1"/>
-              <w:right w:val="single" w:color="999999" w:sz="1"/>
-            </w:tcBorders>
-          </w:tcPr>
-          <w:p>
-            <w:pPr>
-              <w:spacing w:after="40" w:before="40"/>
-              <w:jc w:val="left"/>
-            </w:pPr>
-            <w:r>
-              <w:rPr>
-                <w:rFonts w:ascii="Times New Roman" w:cs="Times New Roman" w:eastAsia="Times New Roman" w:hAnsi="Times New Roman"/>
-                <w:sz w:val="20"/>
-                <w:szCs w:val="20"/>
-              </w:rPr>
-              <w:t xml:space="preserve">Inexistente</w:t>
-            </w:r>
-          </w:p>
-        </w:tc>
-      </w:tr>
-      <w:tr>
-        <w:tc>
-          <w:tcPr>
-            <w:tcW w:type="dxa" w:w="4800"/>
-            <w:tcBorders>
-              <w:top w:val="single" w:color="999999" w:sz="1"/>
-              <w:left w:val="single" w:color="999999" w:sz="1"/>
-              <w:bottom w:val="single" w:color="999999" w:sz="1"/>
-              <w:right w:val="single" w:color="999999" w:sz="1"/>
-            </w:tcBorders>
-          </w:tcPr>
-          <w:p>
-            <w:pPr>
-              <w:spacing w:after="40" w:before="40"/>
-              <w:jc w:val="left"/>
-            </w:pPr>
-            <w:r>
-              <w:rPr>
-                <w:rFonts w:ascii="Times New Roman" w:cs="Times New Roman" w:eastAsia="Times New Roman" w:hAnsi="Times New Roman"/>
-                <w:sz w:val="20"/>
-                <w:szCs w:val="20"/>
-              </w:rPr>
-              <w:t xml:space="preserve">Vistoria conjunta</w:t>
-            </w:r>
-          </w:p>
-        </w:tc>
-        <w:tc>
-          <w:tcPr>
-            <w:tcW w:type="dxa" w:w="5000"/>
-            <w:tcBorders>
-              <w:top w:val="single" w:color="999999" w:sz="1"/>
-              <w:left w:val="single" w:color="999999" w:sz="1"/>
-              <w:bottom w:val="single" w:color="999999" w:sz="1"/>
-              <w:right w:val="single" w:color="999999" w:sz="1"/>
-            </w:tcBorders>
-          </w:tcPr>
-          <w:p>
-            <w:pPr>
-              <w:spacing w:after="40" w:before="40"/>
-              <w:jc w:val="left"/>
-            </w:pPr>
-            <w:r>
-              <w:rPr>
-                <w:rFonts w:ascii="Times New Roman" w:cs="Times New Roman" w:eastAsia="Times New Roman" w:hAnsi="Times New Roman"/>
-                <w:sz w:val="20"/>
-                <w:szCs w:val="20"/>
-              </w:rPr>
-              <w:t xml:space="preserve">Não prevista</w:t>
-            </w:r>
-          </w:p>
-        </w:tc>
-      </w:tr>
-      <w:tr>
-        <w:tc>
-          <w:tcPr>
-            <w:tcW w:type="dxa" w:w="4800"/>
-            <w:tcBorders>
-              <w:top w:val="single" w:color="999999" w:sz="1"/>
-              <w:left w:val="single" w:color="999999" w:sz="1"/>
-              <w:bottom w:val="single" w:color="999999" w:sz="1"/>
-              <w:right w:val="single" w:color="999999" w:sz="1"/>
-            </w:tcBorders>
-          </w:tcPr>
-          <w:p>
-            <w:pPr>
-              <w:spacing w:after="40" w:before="40"/>
-              <w:jc w:val="left"/>
-            </w:pPr>
-            <w:r>
-              <w:rPr>
-                <w:rFonts w:ascii="Times New Roman" w:cs="Times New Roman" w:eastAsia="Times New Roman" w:hAnsi="Times New Roman"/>
-                <w:sz w:val="20"/>
-                <w:szCs w:val="20"/>
-              </w:rPr>
-              <w:t xml:space="preserve">Inventário de condições iniciais</w:t>
-            </w:r>
-          </w:p>
-        </w:tc>
-        <w:tc>
-          <w:tcPr>
-            <w:tcW w:type="dxa" w:w="5000"/>
-            <w:tcBorders>
-              <w:top w:val="single" w:color="999999" w:sz="1"/>
-              <w:left w:val="single" w:color="999999" w:sz="1"/>
-              <w:bottom w:val="single" w:color="999999" w:sz="1"/>
-              <w:right w:val="single" w:color="999999" w:sz="1"/>
-            </w:tcBorders>
-          </w:tcPr>
-          <w:p>
-            <w:pPr>
-              <w:spacing w:after="40" w:before="40"/>
-              <w:jc w:val="left"/>
-            </w:pPr>
-            <w:r>
-              <w:rPr>
-                <w:rFonts w:ascii="Times New Roman" w:cs="Times New Roman" w:eastAsia="Times New Roman" w:hAnsi="Times New Roman"/>
-                <w:sz w:val="20"/>
-                <w:szCs w:val="20"/>
-              </w:rPr>
-              <w:t xml:space="preserve">Não previsto</w:t>
-            </w:r>
-          </w:p>
-        </w:tc>
-      </w:tr>
-      <w:tr>
-        <w:tc>
-          <w:tcPr>
-            <w:tcW w:type="dxa" w:w="4800"/>
-            <w:tcBorders>
-              <w:top w:val="single" w:color="999999" w:sz="1"/>
-              <w:left w:val="single" w:color="999999" w:sz="1"/>
-              <w:bottom w:val="single" w:color="999999" w:sz="1"/>
-              <w:right w:val="single" w:color="999999" w:sz="1"/>
-            </w:tcBorders>
-          </w:tcPr>
-          <w:p>
-            <w:pPr>
-              <w:spacing w:after="40" w:before="40"/>
-              <w:jc w:val="left"/>
-            </w:pPr>
-            <w:r>
-              <w:rPr>
-                <w:rFonts w:ascii="Times New Roman" w:cs="Times New Roman" w:eastAsia="Times New Roman" w:hAnsi="Times New Roman"/>
-                <w:sz w:val="20"/>
-                <w:szCs w:val="20"/>
-              </w:rPr>
-              <w:t xml:space="preserve">Termo de assunção operacional</w:t>
-            </w:r>
-          </w:p>
-        </w:tc>
-        <w:tc>
-          <w:tcPr>
-            <w:tcW w:type="dxa" w:w="5000"/>
-            <w:tcBorders>
-              <w:top w:val="single" w:color="999999" w:sz="1"/>
-              <w:left w:val="single" w:color="999999" w:sz="1"/>
-              <w:bottom w:val="single" w:color="999999" w:sz="1"/>
-              <w:right w:val="single" w:color="999999" w:sz="1"/>
-            </w:tcBorders>
-          </w:tcPr>
-          <w:p>
-            <w:pPr>
-              <w:spacing w:after="40" w:before="40"/>
-              <w:jc w:val="left"/>
-            </w:pPr>
-            <w:r>
-              <w:rPr>
-                <w:rFonts w:ascii="Times New Roman" w:cs="Times New Roman" w:eastAsia="Times New Roman" w:hAnsi="Times New Roman"/>
-                <w:sz w:val="20"/>
-                <w:szCs w:val="20"/>
-              </w:rPr>
-              <w:t xml:space="preserve">Não previsto</w:t>
-            </w:r>
-          </w:p>
-        </w:tc>
-      </w:tr>
-    </w:tbl>
-    <w:p>
-      <w:pPr>
-        <w:pStyle w:val="Heading3"/>
-        <w:spacing w:after="120" w:before="200"/>
-      </w:pPr>
-      <w:r>
-        <w:rPr>
-          <w:rFonts w:ascii="Times New Roman" w:cs="Times New Roman" w:eastAsia="Times New Roman" w:hAnsi="Times New Roman"/>
-          <w:b/>
-          <w:bCs/>
-          <w:sz w:val="26"/>
-          <w:szCs w:val="26"/>
-        </w:rPr>
-        <w:t xml:space="preserve">O que o TR exige da contratada sem esse registro</w:t>
-      </w:r>
-    </w:p>
-    <w:p>
-      <w:pPr>
-        <w:spacing w:after="120" w:before="0" w:line="276"/>
-        <w:jc w:val="both"/>
-      </w:pPr>
-      <w:r>
-        <w:rPr>
-          <w:rFonts w:ascii="Times New Roman" w:cs="Times New Roman" w:eastAsia="Times New Roman" w:hAnsi="Times New Roman"/>
-          <w:sz w:val="24"/>
-          <w:szCs w:val="24"/>
-        </w:rPr>
-        <w:t xml:space="preserve">O TR atribui à contratada a obrigação de "garantir que o Aterro Sanitário possua uma camada de impermeabilização de base, constituída de geomembrana de polietileno de alta densidade – PEAD" e os sistemas de drenagem de chorume e de gases (TR 5.5.5–5.5.15; C-190) — sistemas que a contratada não projetou nem construiu, sem laudo de estado inicial nem inventário de passivos.</w:t>
-      </w:r>
-    </w:p>
-    <w:p>
-      <w:pPr>
-        <w:spacing w:after="120" w:before="0" w:line="276"/>
-        <w:jc w:val="both"/>
-      </w:pPr>
-      <w:r>
-        <w:rPr>
-          <w:rFonts w:ascii="Times New Roman" w:cs="Times New Roman" w:eastAsia="Times New Roman" w:hAnsi="Times New Roman"/>
-          <w:sz w:val="24"/>
-          <w:szCs w:val="24"/>
-        </w:rPr>
-        <w:t xml:space="preserve">A ET-08 da LO exige a implantação "em </w:t>
-      </w:r>
-      <w:r>
-        <w:rPr>
-          <w:rFonts w:ascii="Times New Roman" w:cs="Times New Roman" w:eastAsia="Times New Roman" w:hAnsi="Times New Roman"/>
-          <w:b/>
-          <w:bCs/>
-          <w:sz w:val="24"/>
-          <w:szCs w:val="24"/>
-        </w:rPr>
-        <w:t xml:space="preserve">toda</w:t>
-      </w:r>
-      <w:r>
-        <w:rPr>
-          <w:rFonts w:ascii="Times New Roman" w:cs="Times New Roman" w:eastAsia="Times New Roman" w:hAnsi="Times New Roman"/>
-          <w:sz w:val="24"/>
-          <w:szCs w:val="24"/>
-        </w:rPr>
-        <w:t xml:space="preserve"> a Vala nº 05" desses mesmos três sistemas: drenagem de chorume, impermeabilização com manta PEAD e drenagem de gases. A contratada assume a obrigação de garantir uma infraestrutura preexistente sem saber em que estado essa infraestrutura se encontra.</w:t>
-      </w:r>
-    </w:p>
-    <w:p>
-      <w:pPr>
-        <w:pStyle w:val="Heading3"/>
-        <w:spacing w:after="120" w:before="200"/>
-      </w:pPr>
-      <w:r>
-        <w:rPr>
-          <w:rFonts w:ascii="Times New Roman" w:cs="Times New Roman" w:eastAsia="Times New Roman" w:hAnsi="Times New Roman"/>
-          <w:b/>
-          <w:bCs/>
-          <w:sz w:val="26"/>
-          <w:szCs w:val="26"/>
-        </w:rPr>
-        <w:t xml:space="preserve">Por que a resposta à 6.ª impugnação vincula</w:t>
-      </w:r>
-    </w:p>
-    <w:p>
-      <w:pPr>
-        <w:spacing w:after="120" w:before="0" w:line="276"/>
-        <w:jc w:val="both"/>
-      </w:pPr>
-      <w:r>
-        <w:rPr>
-          <w:rFonts w:ascii="Times New Roman" w:cs="Times New Roman" w:eastAsia="Times New Roman" w:hAnsi="Times New Roman"/>
-          <w:sz w:val="24"/>
-          <w:szCs w:val="24"/>
-        </w:rPr>
-        <w:t xml:space="preserve">Art. 164, parágrafo único, da Lei n.º 14.133/2021: a resposta à impugnação vincula a Administração. A Administração reconheceu a necessidade do registro das condições iniciais e da cláusula de não responsabilização — e não incorporou nenhuma das duas ao edital reaberto (T15, C-063).</w:t>
-      </w:r>
-    </w:p>
-    <w:p>
-      <w:pPr>
-        <w:spacing w:after="200" w:before="60" w:line="276"/>
-        <w:jc w:val="both"/>
-      </w:pPr>
-      <w:r>
-        <w:rPr>
-          <w:rFonts w:ascii="Times New Roman" w:cs="Times New Roman" w:eastAsia="Times New Roman" w:hAnsi="Times New Roman"/>
-          <w:i/>
-          <w:iCs/>
-          <w:sz w:val="24"/>
-          <w:szCs w:val="24"/>
-        </w:rPr>
-        <w:t xml:space="preserve">O termo de assunção operacional (Seção 4, Etapa 1) é a cobrança dessas duas declarações no D+1 do contrato.</w:t>
-      </w:r>
-    </w:p>
-    <w:p>
-      <w:pPr>
-        <w:pBdr>
-          <w:bottom w:val="single" w:color="CCCCCC" w:sz="1" w:space="4"/>
-        </w:pBdr>
-        <w:spacing w:after="80" w:before="80"/>
-      </w:pPr>
-    </w:p>
-    <w:p>
-      <w:pPr>
-        <w:pStyle w:val="Heading2"/>
-        <w:spacing w:after="120" w:before="200"/>
-      </w:pPr>
-      <w:r>
-        <w:rPr>
-          <w:rFonts w:ascii="Times New Roman" w:cs="Times New Roman" w:eastAsia="Times New Roman" w:hAnsi="Times New Roman"/>
-          <w:b/>
-          <w:bCs/>
-          <w:sz w:val="28"/>
-          <w:szCs w:val="28"/>
-        </w:rPr>
-        <w:t xml:space="preserve">3. Estrutura contratual: Item 2 vs. Item 3</w:t>
+        <w:t xml:space="preserve">2. Estrutura contratual: Item 2 vs. Item 3</w:t>
       </w:r>
     </w:p>
     <w:p>
@@ -2472,7 +1921,7 @@
           <w:sz w:val="28"/>
           <w:szCs w:val="28"/>
         </w:rPr>
-        <w:t xml:space="preserve">4. Sequência pós-adjudicação</w:t>
+        <w:t xml:space="preserve">3. Sequência pós-adjudicação</w:t>
       </w:r>
     </w:p>
     <w:p>
@@ -3299,7 +2748,7 @@
           <w:sz w:val="20"/>
           <w:szCs w:val="20"/>
         </w:rPr>
-        <w:t xml:space="preserve">o não atendimento da ET-08 é anterior à assunção — documentado no baseline, é passivo do titular do ativo (Município), conforme o compromisso da 6.ª impugnação.</w:t>
+        <w:t xml:space="preserve">o não atendimento da ET-08 é anterior à assunção — documentado no termo de assunção, é passivo do titular do ativo (Município), conforme o compromisso da 6.ª impugnação.</w:t>
       </w:r>
     </w:p>
     <w:p>
@@ -3773,7 +3222,7 @@
                 <w:sz w:val="20"/>
                 <w:szCs w:val="20"/>
               </w:rPr>
-              <w:t xml:space="preserve">A contratada registra o risco, opera conforme a orientação formal do CONTRATANTE, com o baseline nos autos — a responsabilidade está segregada</w:t>
+              <w:t xml:space="preserve">A contratada registra o risco, opera conforme a orientação formal do CONTRATANTE, com o termo de assunção nos autos — a responsabilidade está segregada</w:t>
             </w:r>
           </w:p>
         </w:tc>
@@ -3852,7 +3301,7 @@
           <w:sz w:val="28"/>
           <w:szCs w:val="28"/>
         </w:rPr>
-        <w:t xml:space="preserve">5. Proteção da contratada</w:t>
+        <w:t xml:space="preserve">4. Proteção da contratada</w:t>
       </w:r>
     </w:p>
     <w:tbl>
@@ -4114,7 +3563,7 @@
                 <w:sz w:val="20"/>
                 <w:szCs w:val="20"/>
               </w:rPr>
-              <w:t xml:space="preserve">Baseline: condições preexistentes documentadas; responsabilidade propter rem segregada</w:t>
+              <w:t xml:space="preserve">Condições preexistentes documentadas; responsabilidade segregada</w:t>
             </w:r>
           </w:p>
         </w:tc>
@@ -4309,7 +3758,7 @@
           <w:sz w:val="28"/>
           <w:szCs w:val="28"/>
         </w:rPr>
-        <w:t xml:space="preserve">6. Cronograma estimado</w:t>
+        <w:t xml:space="preserve">5. Cronograma estimado</w:t>
       </w:r>
     </w:p>
     <w:tbl>
@@ -4726,7 +4175,7 @@
           <w:sz w:val="28"/>
           <w:szCs w:val="28"/>
         </w:rPr>
-        <w:t xml:space="preserve">7. Riscos</w:t>
+        <w:t xml:space="preserve">6. Riscos</w:t>
       </w:r>
     </w:p>
     <w:tbl>
@@ -4908,7 +4357,7 @@
                 <w:sz w:val="20"/>
                 <w:szCs w:val="20"/>
               </w:rPr>
-              <w:t xml:space="preserve">A contratada não tinha acesso aos dados técnicos (T9 — dados não divulgados); a visita técnica facultada não substitui levantamento de engenharia; a própria Administração reconheceu a necessidade de baseline na 6.ª impugnação</w:t>
+              <w:t xml:space="preserve">A contratada não tinha acesso aos dados técnicos (T9 — dados não divulgados); a visita técnica facultada não substitui levantamento de engenharia; a própria Administração reconheceu a necessidade de registro das condições iniciais na 6.ª impugnação</w:t>
             </w:r>
           </w:p>
         </w:tc>
@@ -4960,7 +4409,7 @@
                 <w:sz w:val="20"/>
                 <w:szCs w:val="20"/>
               </w:rPr>
-              <w:t xml:space="preserve">A contratada opera conforme a orientação formal do CONTRATANTE, com o registro do baseline nos autos — segregação de responsabilidade documentada no termo de assunção</w:t>
+              <w:t xml:space="preserve">A contratada opera conforme a orientação formal do CONTRATANTE, com o termo de assunção nos autos — segregação de responsabilidade documentada</w:t>
             </w:r>
           </w:p>
         </w:tc>

</xml_diff>

<commit_message>
Reescreve Seção 3 (Sequência pós-adjudicação) em texto corrido
Remove formatação Quando/Como/Fundamento/Conteúdo e tabela de
vistoria. Cada etapa agora é um parágrafo descrevendo o passo.
Incorpora na Etapa 3 a distinção entre implantar (obrigação do
titular da licença) e garantir (TR 5.5.5-5.5.15).

Co-Authored-By: Claude Opus 4.6 <noreply@anthropic.com>
Claude-Session: https://claude.ai/code/session_01JB8NzdiM6CkTNUriijoKhD
</commit_message>
<xml_diff>
--- a/licitacoes-14133/porto-ferreira/docs/ESTRATEGIA_termo_assuncao_ET08.docx
+++ b/licitacoes-14133/porto-ferreira/docs/ESTRATEGIA_termo_assuncao_ET08.docx
@@ -1962,12 +1962,108 @@
       <w:r>
         <w:rPr>
           <w:rFonts w:ascii="Times New Roman" w:cs="Times New Roman" w:eastAsia="Times New Roman" w:hAnsi="Times New Roman"/>
+          <w:sz w:val="24"/>
+          <w:szCs w:val="24"/>
+        </w:rPr>
+        <w:t xml:space="preserve">Ofício ao CONTRATANTE solicitando a lavratura do termo de assunção operacional, nos termos do compromisso da resposta à 6.ª impugnação (art. 164, parágrafo único, da Lei n.º 14.133/2021). O ofício referencia a resposta à 6.ª impugnação e propõe vistoria conjunta (CONTRATANTE + CONTRATADA + engenheiro RT) para registrar o estado da Vala 05: levantamento planialtimétrico, impermeabilização de base (manta PEAD), sistemas de drenagem de chorume e de gases, capacidade volumétrica remanescente, condicionantes ativas da LO e registro fotográfico georreferenciado.</w:t>
+      </w:r>
+    </w:p>
+    <w:p>
+      <w:pPr>
+        <w:spacing w:after="120" w:before="0" w:line="276"/>
+        <w:jc w:val="both"/>
+      </w:pPr>
+      <w:r>
+        <w:rPr>
+          <w:rFonts w:ascii="Times New Roman" w:cs="Times New Roman" w:eastAsia="Times New Roman" w:hAnsi="Times New Roman"/>
+          <w:sz w:val="24"/>
+          <w:szCs w:val="24"/>
+        </w:rPr>
+        <w:t xml:space="preserve">Se o Município protelar, a contratada reitera o ofício e, se necessário, realiza o levantamento por conta própria (laudo com ART/RRT), notificando o CONTRATANTE para acompanhar.</w:t>
+      </w:r>
+    </w:p>
+    <w:p>
+      <w:pPr>
+        <w:pStyle w:val="Heading3"/>
+        <w:spacing w:after="120" w:before="200"/>
+      </w:pPr>
+      <w:r>
+        <w:rPr>
+          <w:rFonts w:ascii="Times New Roman" w:cs="Times New Roman" w:eastAsia="Times New Roman" w:hAnsi="Times New Roman"/>
+          <w:b/>
+          <w:bCs/>
+          <w:sz w:val="26"/>
+          <w:szCs w:val="26"/>
+        </w:rPr>
+        <w:t xml:space="preserve">Etapa 2 — Vistoria e lavratura do termo</w:t>
+      </w:r>
+    </w:p>
+    <w:p>
+      <w:pPr>
+        <w:spacing w:after="120" w:before="0" w:line="276"/>
+        <w:jc w:val="both"/>
+      </w:pPr>
+      <w:r>
+        <w:rPr>
+          <w:rFonts w:ascii="Times New Roman" w:cs="Times New Roman" w:eastAsia="Times New Roman" w:hAnsi="Times New Roman"/>
+          <w:sz w:val="24"/>
+          <w:szCs w:val="24"/>
+        </w:rPr>
+        <w:t xml:space="preserve">Vistoria técnica na Vala 05 pela equipe de engenharia da contratada, preferencialmente acompanhada do fiscal do contrato. Registra: presença e integridade da impermeabilização (PEAD) em toda a vala; existência, dimensionamento e funcionamento dos sistemas de drenagem de chorume e de gases; levantamento planialtimétrico e capacidade remanescente; estado da cobertura diária (ET-01), da drenagem pluvial (ET-04) e de passivos aparentes (chorume aflorante, erosão, vetores).</w:t>
+      </w:r>
+    </w:p>
+    <w:p>
+      <w:pPr>
+        <w:spacing w:after="120" w:before="0" w:line="276"/>
+        <w:jc w:val="both"/>
+      </w:pPr>
+      <w:r>
+        <w:rPr>
+          <w:rFonts w:ascii="Times New Roman" w:cs="Times New Roman" w:eastAsia="Times New Roman" w:hAnsi="Times New Roman"/>
+          <w:sz w:val="24"/>
+          <w:szCs w:val="24"/>
+        </w:rPr>
+        <w:t xml:space="preserve">O resultado é um laudo técnico com ART/RRT, formalizado como Termo de Assunção Operacional e entregue ao CONTRATANTE por protocolo.</w:t>
+      </w:r>
+    </w:p>
+    <w:p>
+      <w:pPr>
+        <w:pStyle w:val="Heading3"/>
+        <w:spacing w:after="120" w:before="200"/>
+      </w:pPr>
+      <w:r>
+        <w:rPr>
+          <w:rFonts w:ascii="Times New Roman" w:cs="Times New Roman" w:eastAsia="Times New Roman" w:hAnsi="Times New Roman"/>
+          <w:b/>
+          <w:bCs/>
+          <w:sz w:val="26"/>
+          <w:szCs w:val="26"/>
+        </w:rPr>
+        <w:t xml:space="preserve">Etapa 3 — Constatação do não atendimento da ET-08</w:t>
+      </w:r>
+    </w:p>
+    <w:p>
+      <w:pPr>
+        <w:spacing w:after="120" w:before="0" w:line="276"/>
+        <w:jc w:val="both"/>
+      </w:pPr>
+      <w:r>
+        <w:rPr>
+          <w:rFonts w:ascii="Times New Roman" w:cs="Times New Roman" w:eastAsia="Times New Roman" w:hAnsi="Times New Roman"/>
+          <w:sz w:val="24"/>
+          <w:szCs w:val="24"/>
+        </w:rPr>
+        <w:t xml:space="preserve">A ET-08 da LO exige a implantação "em </w:t>
+      </w:r>
+      <w:r>
+        <w:rPr>
+          <w:rFonts w:ascii="Times New Roman" w:cs="Times New Roman" w:eastAsia="Times New Roman" w:hAnsi="Times New Roman"/>
           <w:b/>
           <w:bCs/>
           <w:sz w:val="24"/>
           <w:szCs w:val="24"/>
         </w:rPr>
-        <w:t xml:space="preserve">Quando: </w:t>
+        <w:t xml:space="preserve">toda</w:t>
       </w:r>
       <w:r>
         <w:rPr>
@@ -1975,7 +2071,7 @@
           <w:sz w:val="24"/>
           <w:szCs w:val="24"/>
         </w:rPr>
-        <w:t xml:space="preserve">imediatamente após a assinatura do contrato.</w:t>
+        <w:t xml:space="preserve"> a Vala nº 05" de três sistemas: drenagem de chorume, impermeabilização com manta PEAD e drenagem de gases. A implantação retroativa desses sistemas em trechos já aterrados é tecnicamente inviável. A vala não atende a ET-08. A obrigação de implantar esses sistemas é do titular da licença (Município) — o TR transfere à contratada a obrigação de "garantir" (TR 5.5.5–5.5.15), não de implantar.</w:t>
       </w:r>
     </w:p>
     <w:p>
@@ -1986,140 +2082,10 @@
       <w:r>
         <w:rPr>
           <w:rFonts w:ascii="Times New Roman" w:cs="Times New Roman" w:eastAsia="Times New Roman" w:hAnsi="Times New Roman"/>
-          <w:b/>
-          <w:bCs/>
           <w:sz w:val="24"/>
           <w:szCs w:val="24"/>
         </w:rPr>
-        <w:t xml:space="preserve">Como: </w:t>
-      </w:r>
-      <w:r>
-        <w:rPr>
-          <w:rFonts w:ascii="Times New Roman" w:cs="Times New Roman" w:eastAsia="Times New Roman" w:hAnsi="Times New Roman"/>
-          <w:sz w:val="24"/>
-          <w:szCs w:val="24"/>
-        </w:rPr>
-        <w:t xml:space="preserve">ofício formal ao CONTRATANTE solicitando a lavratura do termo de assunção operacional, nos termos do compromisso da resposta à 6.ª impugnação.</w:t>
-      </w:r>
-    </w:p>
-    <w:p>
-      <w:pPr>
-        <w:spacing w:after="120" w:before="0" w:line="276"/>
-        <w:jc w:val="both"/>
-      </w:pPr>
-      <w:r>
-        <w:rPr>
-          <w:rFonts w:ascii="Times New Roman" w:cs="Times New Roman" w:eastAsia="Times New Roman" w:hAnsi="Times New Roman"/>
-          <w:b/>
-          <w:bCs/>
-          <w:sz w:val="24"/>
-          <w:szCs w:val="24"/>
-        </w:rPr>
-        <w:t xml:space="preserve">Fundamento: </w:t>
-      </w:r>
-      <w:r>
-        <w:rPr>
-          <w:rFonts w:ascii="Times New Roman" w:cs="Times New Roman" w:eastAsia="Times New Roman" w:hAnsi="Times New Roman"/>
-          <w:sz w:val="24"/>
-          <w:szCs w:val="24"/>
-        </w:rPr>
-        <w:t xml:space="preserve">art. 5.º da Lei n.º 14.133/2021 (boa-fé, vinculação ao edital); art. 164, parágrafo único (vinculação da resposta); art. 92, XIV (responsabilidades das partes).</w:t>
-      </w:r>
-    </w:p>
-    <w:p>
-      <w:pPr>
-        <w:spacing w:after="120" w:before="0" w:line="276"/>
-        <w:jc w:val="both"/>
-      </w:pPr>
-      <w:r>
-        <w:rPr>
-          <w:rFonts w:ascii="Times New Roman" w:cs="Times New Roman" w:eastAsia="Times New Roman" w:hAnsi="Times New Roman"/>
-          <w:b/>
-          <w:bCs/>
-          <w:sz w:val="24"/>
-          <w:szCs w:val="24"/>
-        </w:rPr>
-        <w:t xml:space="preserve">Conteúdo do ofício:</w:t>
-      </w:r>
-    </w:p>
-    <w:p>
-      <w:pPr>
-        <w:spacing w:after="60"/>
-        <w:ind w:left="360"/>
-      </w:pPr>
-      <w:r>
-        <w:rPr>
-          <w:rFonts w:ascii="Times New Roman" w:cs="Times New Roman" w:eastAsia="Times New Roman" w:hAnsi="Times New Roman"/>
-          <w:sz w:val="20"/>
-          <w:szCs w:val="20"/>
-        </w:rPr>
-        <w:t xml:space="preserve">•  </w:t>
-      </w:r>
-      <w:r>
-        <w:rPr>
-          <w:rFonts w:ascii="Times New Roman" w:cs="Times New Roman" w:eastAsia="Times New Roman" w:hAnsi="Times New Roman"/>
-          <w:sz w:val="20"/>
-          <w:szCs w:val="20"/>
-        </w:rPr>
-        <w:t xml:space="preserve">Referência à resposta à 6.ª impugnação;</w:t>
-      </w:r>
-    </w:p>
-    <w:p>
-      <w:pPr>
-        <w:spacing w:after="60"/>
-        <w:ind w:left="360"/>
-      </w:pPr>
-      <w:r>
-        <w:rPr>
-          <w:rFonts w:ascii="Times New Roman" w:cs="Times New Roman" w:eastAsia="Times New Roman" w:hAnsi="Times New Roman"/>
-          <w:sz w:val="20"/>
-          <w:szCs w:val="20"/>
-        </w:rPr>
-        <w:t xml:space="preserve">•  </w:t>
-      </w:r>
-      <w:r>
-        <w:rPr>
-          <w:rFonts w:ascii="Times New Roman" w:cs="Times New Roman" w:eastAsia="Times New Roman" w:hAnsi="Times New Roman"/>
-          <w:sz w:val="20"/>
-          <w:szCs w:val="20"/>
-        </w:rPr>
-        <w:t xml:space="preserve">Rol de itens a registrar: (a) levantamento planialtimétrico da Vala 05; (b) estado da impermeabilização de base (manta PEAD); (c) estado dos sistemas de drenagem de chorume; (d) estado dos sistemas de drenagem de gases; (e) capacidade volumétrica remanescente; (f) condicionantes ativas da LO; (g) registro fotográfico georreferenciado;</w:t>
-      </w:r>
-    </w:p>
-    <w:p>
-      <w:pPr>
-        <w:spacing w:after="60"/>
-        <w:ind w:left="360"/>
-      </w:pPr>
-      <w:r>
-        <w:rPr>
-          <w:rFonts w:ascii="Times New Roman" w:cs="Times New Roman" w:eastAsia="Times New Roman" w:hAnsi="Times New Roman"/>
-          <w:sz w:val="20"/>
-          <w:szCs w:val="20"/>
-        </w:rPr>
-        <w:t xml:space="preserve">•  </w:t>
-      </w:r>
-      <w:r>
-        <w:rPr>
-          <w:rFonts w:ascii="Times New Roman" w:cs="Times New Roman" w:eastAsia="Times New Roman" w:hAnsi="Times New Roman"/>
-          <w:sz w:val="20"/>
-          <w:szCs w:val="20"/>
-        </w:rPr>
-        <w:t xml:space="preserve">Proposta de vistoria conjunta (CONTRATANTE + CONTRATADA + engenheiro RT).</w:t>
-      </w:r>
-    </w:p>
-    <w:p>
-      <w:pPr>
-        <w:spacing w:after="120" w:before="0" w:line="276"/>
-        <w:jc w:val="both"/>
-      </w:pPr>
-      <w:r>
-        <w:rPr>
-          <w:rFonts w:ascii="Times New Roman" w:cs="Times New Roman" w:eastAsia="Times New Roman" w:hAnsi="Times New Roman"/>
-          <w:sz w:val="24"/>
-          <w:szCs w:val="24"/>
-        </w:rPr>
-        <w:t xml:space="preserve">Se o Município protelar, a contratada reitera o ofício e, se necessário, realiza o levantamento por conta própria (laudo com ART/RRT), notificando o CONTRATANTE para acompanhar — preserva a boa-fé e documenta o estado independentemente da adesão do fiscal.</w:t>
+        <w:t xml:space="preserve">O laudo documenta essa não conformidade e cumpre duas funções: (1) segregação de responsabilidade — o não atendimento da ET-08 é anterior à assunção, é passivo do Município, conforme o compromisso da 6.ª impugnação; (2) inviabilidade da operação pelo Item 2 — se a vala não atende as exigências técnicas da LO, a disposição de resíduos ali não pode prosseguir sem regularização pelo titular da licença.</w:t>
       </w:r>
     </w:p>
     <w:p>
@@ -2135,7 +2101,7 @@
           <w:sz w:val="26"/>
           <w:szCs w:val="26"/>
         </w:rPr>
-        <w:t xml:space="preserve">Etapa 2 — Vistoria e lavratura do termo</w:t>
+        <w:t xml:space="preserve">Etapa 4 — Comunicação ao CONTRATANTE e transição ao Item 3</w:t>
       </w:r>
     </w:p>
     <w:p>
@@ -2146,849 +2112,10 @@
       <w:r>
         <w:rPr>
           <w:rFonts w:ascii="Times New Roman" w:cs="Times New Roman" w:eastAsia="Times New Roman" w:hAnsi="Times New Roman"/>
-          <w:b/>
-          <w:bCs/>
           <w:sz w:val="24"/>
           <w:szCs w:val="24"/>
         </w:rPr>
-        <w:t xml:space="preserve">Quando: </w:t>
-      </w:r>
-      <w:r>
-        <w:rPr>
-          <w:rFonts w:ascii="Times New Roman" w:cs="Times New Roman" w:eastAsia="Times New Roman" w:hAnsi="Times New Roman"/>
-          <w:sz w:val="24"/>
-          <w:szCs w:val="24"/>
-        </w:rPr>
-        <w:t xml:space="preserve">primeiros 15–30 dias de contrato (antes do início efetivo da operação da vala, se possível).</w:t>
-      </w:r>
-    </w:p>
-    <w:p>
-      <w:pPr>
-        <w:spacing w:after="120" w:before="0" w:line="276"/>
-        <w:jc w:val="both"/>
-      </w:pPr>
-      <w:r>
-        <w:rPr>
-          <w:rFonts w:ascii="Times New Roman" w:cs="Times New Roman" w:eastAsia="Times New Roman" w:hAnsi="Times New Roman"/>
-          <w:b/>
-          <w:bCs/>
-          <w:sz w:val="24"/>
-          <w:szCs w:val="24"/>
-        </w:rPr>
-        <w:t xml:space="preserve">Execução: </w:t>
-      </w:r>
-      <w:r>
-        <w:rPr>
-          <w:rFonts w:ascii="Times New Roman" w:cs="Times New Roman" w:eastAsia="Times New Roman" w:hAnsi="Times New Roman"/>
-          <w:sz w:val="24"/>
-          <w:szCs w:val="24"/>
-        </w:rPr>
-        <w:t xml:space="preserve">equipe de engenharia da contratada, preferencialmente acompanhada do fiscal do contrato, realiza vistoria técnica na Vala 05:</w:t>
-      </w:r>
-    </w:p>
-    <w:tbl>
-      <w:tblPr>
-        <w:tblW w:type="dxa" w:w="9800"/>
-        <w:tblBorders>
-          <w:top w:val="single" w:color="auto" w:sz="4"/>
-          <w:left w:val="single" w:color="auto" w:sz="4"/>
-          <w:bottom w:val="single" w:color="auto" w:sz="4"/>
-          <w:right w:val="single" w:color="auto" w:sz="4"/>
-          <w:insideH w:val="single" w:color="auto" w:sz="4"/>
-          <w:insideV w:val="single" w:color="auto" w:sz="4"/>
-        </w:tblBorders>
-        <w:tblLayout w:type="fixed"/>
-      </w:tblPr>
-      <w:tblGrid>
-        <w:gridCol w:w="3200"/>
-        <w:gridCol w:w="6600"/>
-      </w:tblGrid>
-      <w:tr>
-        <w:trPr>
-          <w:tblHeader/>
-        </w:trPr>
-        <w:tc>
-          <w:tcPr>
-            <w:tcW w:type="dxa" w:w="3200"/>
-            <w:tcBorders>
-              <w:top w:val="single" w:color="999999" w:sz="1"/>
-              <w:left w:val="single" w:color="999999" w:sz="1"/>
-              <w:bottom w:val="single" w:color="999999" w:sz="1"/>
-              <w:right w:val="single" w:color="999999" w:sz="1"/>
-            </w:tcBorders>
-            <w:shd w:fill="1F3864" w:color="auto" w:val="clear"/>
-          </w:tcPr>
-          <w:p>
-            <w:pPr>
-              <w:spacing w:after="40" w:before="40"/>
-              <w:jc w:val="left"/>
-            </w:pPr>
-            <w:r>
-              <w:rPr>
-                <w:rFonts w:ascii="Times New Roman" w:cs="Times New Roman" w:eastAsia="Times New Roman" w:hAnsi="Times New Roman"/>
-                <w:b/>
-                <w:bCs/>
-                <w:color w:val="FFFFFF"/>
-                <w:sz w:val="20"/>
-                <w:szCs w:val="20"/>
-              </w:rPr>
-              <w:t xml:space="preserve">Item</w:t>
-            </w:r>
-          </w:p>
-        </w:tc>
-        <w:tc>
-          <w:tcPr>
-            <w:tcW w:type="dxa" w:w="6600"/>
-            <w:tcBorders>
-              <w:top w:val="single" w:color="999999" w:sz="1"/>
-              <w:left w:val="single" w:color="999999" w:sz="1"/>
-              <w:bottom w:val="single" w:color="999999" w:sz="1"/>
-              <w:right w:val="single" w:color="999999" w:sz="1"/>
-            </w:tcBorders>
-            <w:shd w:fill="1F3864" w:color="auto" w:val="clear"/>
-          </w:tcPr>
-          <w:p>
-            <w:pPr>
-              <w:spacing w:after="40" w:before="40"/>
-              <w:jc w:val="left"/>
-            </w:pPr>
-            <w:r>
-              <w:rPr>
-                <w:rFonts w:ascii="Times New Roman" w:cs="Times New Roman" w:eastAsia="Times New Roman" w:hAnsi="Times New Roman"/>
-                <w:b/>
-                <w:bCs/>
-                <w:color w:val="FFFFFF"/>
-                <w:sz w:val="20"/>
-                <w:szCs w:val="20"/>
-              </w:rPr>
-              <w:t xml:space="preserve">O que registrar</w:t>
-            </w:r>
-          </w:p>
-        </w:tc>
-      </w:tr>
-      <w:tr>
-        <w:tc>
-          <w:tcPr>
-            <w:tcW w:type="dxa" w:w="3200"/>
-            <w:tcBorders>
-              <w:top w:val="single" w:color="999999" w:sz="1"/>
-              <w:left w:val="single" w:color="999999" w:sz="1"/>
-              <w:bottom w:val="single" w:color="999999" w:sz="1"/>
-              <w:right w:val="single" w:color="999999" w:sz="1"/>
-            </w:tcBorders>
-          </w:tcPr>
-          <w:p>
-            <w:pPr>
-              <w:spacing w:after="40" w:before="40"/>
-              <w:jc w:val="left"/>
-            </w:pPr>
-            <w:r>
-              <w:rPr>
-                <w:rFonts w:ascii="Times New Roman" w:cs="Times New Roman" w:eastAsia="Times New Roman" w:hAnsi="Times New Roman"/>
-                <w:sz w:val="20"/>
-                <w:szCs w:val="20"/>
-              </w:rPr>
-              <w:t xml:space="preserve">Impermeabilização (PEAD)</w:t>
-            </w:r>
-          </w:p>
-        </w:tc>
-        <w:tc>
-          <w:tcPr>
-            <w:tcW w:type="dxa" w:w="6600"/>
-            <w:tcBorders>
-              <w:top w:val="single" w:color="999999" w:sz="1"/>
-              <w:left w:val="single" w:color="999999" w:sz="1"/>
-              <w:bottom w:val="single" w:color="999999" w:sz="1"/>
-              <w:right w:val="single" w:color="999999" w:sz="1"/>
-            </w:tcBorders>
-          </w:tcPr>
-          <w:p>
-            <w:pPr>
-              <w:spacing w:after="40" w:before="40"/>
-              <w:jc w:val="left"/>
-            </w:pPr>
-            <w:r>
-              <w:rPr>
-                <w:rFonts w:ascii="Times New Roman" w:cs="Times New Roman" w:eastAsia="Times New Roman" w:hAnsi="Times New Roman"/>
-                <w:sz w:val="20"/>
-                <w:szCs w:val="20"/>
-              </w:rPr>
-              <w:t xml:space="preserve">Presença/ausência em toda a vala; integridade; trechos sem cobertura</w:t>
-            </w:r>
-          </w:p>
-        </w:tc>
-      </w:tr>
-      <w:tr>
-        <w:tc>
-          <w:tcPr>
-            <w:tcW w:type="dxa" w:w="3200"/>
-            <w:tcBorders>
-              <w:top w:val="single" w:color="999999" w:sz="1"/>
-              <w:left w:val="single" w:color="999999" w:sz="1"/>
-              <w:bottom w:val="single" w:color="999999" w:sz="1"/>
-              <w:right w:val="single" w:color="999999" w:sz="1"/>
-            </w:tcBorders>
-          </w:tcPr>
-          <w:p>
-            <w:pPr>
-              <w:spacing w:after="40" w:before="40"/>
-              <w:jc w:val="left"/>
-            </w:pPr>
-            <w:r>
-              <w:rPr>
-                <w:rFonts w:ascii="Times New Roman" w:cs="Times New Roman" w:eastAsia="Times New Roman" w:hAnsi="Times New Roman"/>
-                <w:sz w:val="20"/>
-                <w:szCs w:val="20"/>
-              </w:rPr>
-              <w:t xml:space="preserve">Drenagem de chorume</w:t>
-            </w:r>
-          </w:p>
-        </w:tc>
-        <w:tc>
-          <w:tcPr>
-            <w:tcW w:type="dxa" w:w="6600"/>
-            <w:tcBorders>
-              <w:top w:val="single" w:color="999999" w:sz="1"/>
-              <w:left w:val="single" w:color="999999" w:sz="1"/>
-              <w:bottom w:val="single" w:color="999999" w:sz="1"/>
-              <w:right w:val="single" w:color="999999" w:sz="1"/>
-            </w:tcBorders>
-          </w:tcPr>
-          <w:p>
-            <w:pPr>
-              <w:spacing w:after="40" w:before="40"/>
-              <w:jc w:val="left"/>
-            </w:pPr>
-            <w:r>
-              <w:rPr>
-                <w:rFonts w:ascii="Times New Roman" w:cs="Times New Roman" w:eastAsia="Times New Roman" w:hAnsi="Times New Roman"/>
-                <w:sz w:val="20"/>
-                <w:szCs w:val="20"/>
-              </w:rPr>
-              <w:t xml:space="preserve">Existência; dimensionamento; estado; funcionamento</w:t>
-            </w:r>
-          </w:p>
-        </w:tc>
-      </w:tr>
-      <w:tr>
-        <w:tc>
-          <w:tcPr>
-            <w:tcW w:type="dxa" w:w="3200"/>
-            <w:tcBorders>
-              <w:top w:val="single" w:color="999999" w:sz="1"/>
-              <w:left w:val="single" w:color="999999" w:sz="1"/>
-              <w:bottom w:val="single" w:color="999999" w:sz="1"/>
-              <w:right w:val="single" w:color="999999" w:sz="1"/>
-            </w:tcBorders>
-          </w:tcPr>
-          <w:p>
-            <w:pPr>
-              <w:spacing w:after="40" w:before="40"/>
-              <w:jc w:val="left"/>
-            </w:pPr>
-            <w:r>
-              <w:rPr>
-                <w:rFonts w:ascii="Times New Roman" w:cs="Times New Roman" w:eastAsia="Times New Roman" w:hAnsi="Times New Roman"/>
-                <w:sz w:val="20"/>
-                <w:szCs w:val="20"/>
-              </w:rPr>
-              <w:t xml:space="preserve">Drenagem de gases</w:t>
-            </w:r>
-          </w:p>
-        </w:tc>
-        <w:tc>
-          <w:tcPr>
-            <w:tcW w:type="dxa" w:w="6600"/>
-            <w:tcBorders>
-              <w:top w:val="single" w:color="999999" w:sz="1"/>
-              <w:left w:val="single" w:color="999999" w:sz="1"/>
-              <w:bottom w:val="single" w:color="999999" w:sz="1"/>
-              <w:right w:val="single" w:color="999999" w:sz="1"/>
-            </w:tcBorders>
-          </w:tcPr>
-          <w:p>
-            <w:pPr>
-              <w:spacing w:after="40" w:before="40"/>
-              <w:jc w:val="left"/>
-            </w:pPr>
-            <w:r>
-              <w:rPr>
-                <w:rFonts w:ascii="Times New Roman" w:cs="Times New Roman" w:eastAsia="Times New Roman" w:hAnsi="Times New Roman"/>
-                <w:sz w:val="20"/>
-                <w:szCs w:val="20"/>
-              </w:rPr>
-              <w:t xml:space="preserve">Existência de drenos; espaçamento; funcionamento</w:t>
-            </w:r>
-          </w:p>
-        </w:tc>
-      </w:tr>
-      <w:tr>
-        <w:tc>
-          <w:tcPr>
-            <w:tcW w:type="dxa" w:w="3200"/>
-            <w:tcBorders>
-              <w:top w:val="single" w:color="999999" w:sz="1"/>
-              <w:left w:val="single" w:color="999999" w:sz="1"/>
-              <w:bottom w:val="single" w:color="999999" w:sz="1"/>
-              <w:right w:val="single" w:color="999999" w:sz="1"/>
-            </w:tcBorders>
-          </w:tcPr>
-          <w:p>
-            <w:pPr>
-              <w:spacing w:after="40" w:before="40"/>
-              <w:jc w:val="left"/>
-            </w:pPr>
-            <w:r>
-              <w:rPr>
-                <w:rFonts w:ascii="Times New Roman" w:cs="Times New Roman" w:eastAsia="Times New Roman" w:hAnsi="Times New Roman"/>
-                <w:sz w:val="20"/>
-                <w:szCs w:val="20"/>
-              </w:rPr>
-              <w:t xml:space="preserve">Topografia</w:t>
-            </w:r>
-          </w:p>
-        </w:tc>
-        <w:tc>
-          <w:tcPr>
-            <w:tcW w:type="dxa" w:w="6600"/>
-            <w:tcBorders>
-              <w:top w:val="single" w:color="999999" w:sz="1"/>
-              <w:left w:val="single" w:color="999999" w:sz="1"/>
-              <w:bottom w:val="single" w:color="999999" w:sz="1"/>
-              <w:right w:val="single" w:color="999999" w:sz="1"/>
-            </w:tcBorders>
-          </w:tcPr>
-          <w:p>
-            <w:pPr>
-              <w:spacing w:after="40" w:before="40"/>
-              <w:jc w:val="left"/>
-            </w:pPr>
-            <w:r>
-              <w:rPr>
-                <w:rFonts w:ascii="Times New Roman" w:cs="Times New Roman" w:eastAsia="Times New Roman" w:hAnsi="Times New Roman"/>
-                <w:sz w:val="20"/>
-                <w:szCs w:val="20"/>
-              </w:rPr>
-              <w:t xml:space="preserve">Levantamento planialtimétrico; capacidade remanescente</w:t>
-            </w:r>
-          </w:p>
-        </w:tc>
-      </w:tr>
-      <w:tr>
-        <w:tc>
-          <w:tcPr>
-            <w:tcW w:type="dxa" w:w="3200"/>
-            <w:tcBorders>
-              <w:top w:val="single" w:color="999999" w:sz="1"/>
-              <w:left w:val="single" w:color="999999" w:sz="1"/>
-              <w:bottom w:val="single" w:color="999999" w:sz="1"/>
-              <w:right w:val="single" w:color="999999" w:sz="1"/>
-            </w:tcBorders>
-          </w:tcPr>
-          <w:p>
-            <w:pPr>
-              <w:spacing w:after="40" w:before="40"/>
-              <w:jc w:val="left"/>
-            </w:pPr>
-            <w:r>
-              <w:rPr>
-                <w:rFonts w:ascii="Times New Roman" w:cs="Times New Roman" w:eastAsia="Times New Roman" w:hAnsi="Times New Roman"/>
-                <w:sz w:val="20"/>
-                <w:szCs w:val="20"/>
-              </w:rPr>
-              <w:t xml:space="preserve">Cobertura diária</w:t>
-            </w:r>
-          </w:p>
-        </w:tc>
-        <w:tc>
-          <w:tcPr>
-            <w:tcW w:type="dxa" w:w="6600"/>
-            <w:tcBorders>
-              <w:top w:val="single" w:color="999999" w:sz="1"/>
-              <w:left w:val="single" w:color="999999" w:sz="1"/>
-              <w:bottom w:val="single" w:color="999999" w:sz="1"/>
-              <w:right w:val="single" w:color="999999" w:sz="1"/>
-            </w:tcBorders>
-          </w:tcPr>
-          <w:p>
-            <w:pPr>
-              <w:spacing w:after="40" w:before="40"/>
-              <w:jc w:val="left"/>
-            </w:pPr>
-            <w:r>
-              <w:rPr>
-                <w:rFonts w:ascii="Times New Roman" w:cs="Times New Roman" w:eastAsia="Times New Roman" w:hAnsi="Times New Roman"/>
-                <w:sz w:val="20"/>
-                <w:szCs w:val="20"/>
-              </w:rPr>
-              <w:t xml:space="preserve">Camada sobre resíduos expostos (ET-01)</w:t>
-            </w:r>
-          </w:p>
-        </w:tc>
-      </w:tr>
-      <w:tr>
-        <w:tc>
-          <w:tcPr>
-            <w:tcW w:type="dxa" w:w="3200"/>
-            <w:tcBorders>
-              <w:top w:val="single" w:color="999999" w:sz="1"/>
-              <w:left w:val="single" w:color="999999" w:sz="1"/>
-              <w:bottom w:val="single" w:color="999999" w:sz="1"/>
-              <w:right w:val="single" w:color="999999" w:sz="1"/>
-            </w:tcBorders>
-          </w:tcPr>
-          <w:p>
-            <w:pPr>
-              <w:spacing w:after="40" w:before="40"/>
-              <w:jc w:val="left"/>
-            </w:pPr>
-            <w:r>
-              <w:rPr>
-                <w:rFonts w:ascii="Times New Roman" w:cs="Times New Roman" w:eastAsia="Times New Roman" w:hAnsi="Times New Roman"/>
-                <w:sz w:val="20"/>
-                <w:szCs w:val="20"/>
-              </w:rPr>
-              <w:t xml:space="preserve">Drenagem pluvial</w:t>
-            </w:r>
-          </w:p>
-        </w:tc>
-        <w:tc>
-          <w:tcPr>
-            <w:tcW w:type="dxa" w:w="6600"/>
-            <w:tcBorders>
-              <w:top w:val="single" w:color="999999" w:sz="1"/>
-              <w:left w:val="single" w:color="999999" w:sz="1"/>
-              <w:bottom w:val="single" w:color="999999" w:sz="1"/>
-              <w:right w:val="single" w:color="999999" w:sz="1"/>
-            </w:tcBorders>
-          </w:tcPr>
-          <w:p>
-            <w:pPr>
-              <w:spacing w:after="40" w:before="40"/>
-              <w:jc w:val="left"/>
-            </w:pPr>
-            <w:r>
-              <w:rPr>
-                <w:rFonts w:ascii="Times New Roman" w:cs="Times New Roman" w:eastAsia="Times New Roman" w:hAnsi="Times New Roman"/>
-                <w:sz w:val="20"/>
-                <w:szCs w:val="20"/>
-              </w:rPr>
-              <w:t xml:space="preserve">Estado do sistema (ET-04)</w:t>
-            </w:r>
-          </w:p>
-        </w:tc>
-      </w:tr>
-      <w:tr>
-        <w:tc>
-          <w:tcPr>
-            <w:tcW w:type="dxa" w:w="3200"/>
-            <w:tcBorders>
-              <w:top w:val="single" w:color="999999" w:sz="1"/>
-              <w:left w:val="single" w:color="999999" w:sz="1"/>
-              <w:bottom w:val="single" w:color="999999" w:sz="1"/>
-              <w:right w:val="single" w:color="999999" w:sz="1"/>
-            </w:tcBorders>
-          </w:tcPr>
-          <w:p>
-            <w:pPr>
-              <w:spacing w:after="40" w:before="40"/>
-              <w:jc w:val="left"/>
-            </w:pPr>
-            <w:r>
-              <w:rPr>
-                <w:rFonts w:ascii="Times New Roman" w:cs="Times New Roman" w:eastAsia="Times New Roman" w:hAnsi="Times New Roman"/>
-                <w:sz w:val="20"/>
-                <w:szCs w:val="20"/>
-              </w:rPr>
-              <w:t xml:space="preserve">Passivos aparentes</w:t>
-            </w:r>
-          </w:p>
-        </w:tc>
-        <w:tc>
-          <w:tcPr>
-            <w:tcW w:type="dxa" w:w="6600"/>
-            <w:tcBorders>
-              <w:top w:val="single" w:color="999999" w:sz="1"/>
-              <w:left w:val="single" w:color="999999" w:sz="1"/>
-              <w:bottom w:val="single" w:color="999999" w:sz="1"/>
-              <w:right w:val="single" w:color="999999" w:sz="1"/>
-            </w:tcBorders>
-          </w:tcPr>
-          <w:p>
-            <w:pPr>
-              <w:spacing w:after="40" w:before="40"/>
-              <w:jc w:val="left"/>
-            </w:pPr>
-            <w:r>
-              <w:rPr>
-                <w:rFonts w:ascii="Times New Roman" w:cs="Times New Roman" w:eastAsia="Times New Roman" w:hAnsi="Times New Roman"/>
-                <w:sz w:val="20"/>
-                <w:szCs w:val="20"/>
-              </w:rPr>
-              <w:t xml:space="preserve">Chorume aflorante, erosão, vetores, situação geral</w:t>
-            </w:r>
-          </w:p>
-        </w:tc>
-      </w:tr>
-    </w:tbl>
-    <w:p>
-      <w:pPr>
-        <w:spacing w:after="120" w:before="120" w:line="276"/>
-        <w:jc w:val="both"/>
-      </w:pPr>
-      <w:r>
-        <w:rPr>
-          <w:rFonts w:ascii="Times New Roman" w:cs="Times New Roman" w:eastAsia="Times New Roman" w:hAnsi="Times New Roman"/>
-          <w:b/>
-          <w:bCs/>
-          <w:sz w:val="24"/>
-          <w:szCs w:val="24"/>
-        </w:rPr>
-        <w:t xml:space="preserve">Output: </w:t>
-      </w:r>
-      <w:r>
-        <w:rPr>
-          <w:rFonts w:ascii="Times New Roman" w:cs="Times New Roman" w:eastAsia="Times New Roman" w:hAnsi="Times New Roman"/>
-          <w:sz w:val="24"/>
-          <w:szCs w:val="24"/>
-        </w:rPr>
-        <w:t xml:space="preserve">laudo técnico com ART/RRT, formalizado como Termo de Assunção Operacional, entregue ao CONTRATANTE por protocolo.</w:t>
-      </w:r>
-    </w:p>
-    <w:p>
-      <w:pPr>
-        <w:pStyle w:val="Heading3"/>
-        <w:spacing w:after="120" w:before="200"/>
-      </w:pPr>
-      <w:r>
-        <w:rPr>
-          <w:rFonts w:ascii="Times New Roman" w:cs="Times New Roman" w:eastAsia="Times New Roman" w:hAnsi="Times New Roman"/>
-          <w:b/>
-          <w:bCs/>
-          <w:sz w:val="26"/>
-          <w:szCs w:val="26"/>
-        </w:rPr>
-        <w:t xml:space="preserve">Etapa 3 — Constatação do não atendimento da ET-08</w:t>
-      </w:r>
-    </w:p>
-    <w:p>
-      <w:pPr>
-        <w:spacing w:after="120" w:before="0" w:line="276"/>
-        <w:jc w:val="both"/>
-      </w:pPr>
-      <w:r>
-        <w:rPr>
-          <w:rFonts w:ascii="Times New Roman" w:cs="Times New Roman" w:eastAsia="Times New Roman" w:hAnsi="Times New Roman"/>
-          <w:sz w:val="24"/>
-          <w:szCs w:val="24"/>
-        </w:rPr>
-        <w:t xml:space="preserve">A ET-08 exige implantação "em </w:t>
-      </w:r>
-      <w:r>
-        <w:rPr>
-          <w:rFonts w:ascii="Times New Roman" w:cs="Times New Roman" w:eastAsia="Times New Roman" w:hAnsi="Times New Roman"/>
-          <w:b/>
-          <w:bCs/>
-          <w:sz w:val="24"/>
-          <w:szCs w:val="24"/>
-        </w:rPr>
-        <w:t xml:space="preserve">toda</w:t>
-      </w:r>
-      <w:r>
-        <w:rPr>
-          <w:rFonts w:ascii="Times New Roman" w:cs="Times New Roman" w:eastAsia="Times New Roman" w:hAnsi="Times New Roman"/>
-          <w:sz w:val="24"/>
-          <w:szCs w:val="24"/>
-        </w:rPr>
-        <w:t xml:space="preserve"> a Vala nº 05" de três sistemas: drenagem de chorume, impermeabilização com manta PEAD e drenagem de gases. A implantação retroativa desses sistemas em trechos já aterrados é tecnicamente inviável. A vala não atende integralmente a ET-08.</w:t>
-      </w:r>
-    </w:p>
-    <w:p>
-      <w:pPr>
-        <w:spacing w:after="120" w:before="0" w:line="276"/>
-        <w:jc w:val="both"/>
-      </w:pPr>
-      <w:r>
-        <w:rPr>
-          <w:rFonts w:ascii="Times New Roman" w:cs="Times New Roman" w:eastAsia="Times New Roman" w:hAnsi="Times New Roman"/>
-          <w:sz w:val="24"/>
-          <w:szCs w:val="24"/>
-        </w:rPr>
-        <w:t xml:space="preserve">O laudo do termo de assunção documentará essa não conformidade. O registro cumpre duas funções:</w:t>
-      </w:r>
-    </w:p>
-    <w:p>
-      <w:pPr>
-        <w:spacing w:after="60"/>
-        <w:ind w:left="360"/>
-      </w:pPr>
-      <w:r>
-        <w:rPr>
-          <w:rFonts w:ascii="Times New Roman" w:cs="Times New Roman" w:eastAsia="Times New Roman" w:hAnsi="Times New Roman"/>
-          <w:b/>
-          <w:bCs/>
-          <w:sz w:val="20"/>
-          <w:szCs w:val="20"/>
-        </w:rPr>
-        <w:t xml:space="preserve">1. </w:t>
-      </w:r>
-      <w:r>
-        <w:rPr>
-          <w:rFonts w:ascii="Times New Roman" w:cs="Times New Roman" w:eastAsia="Times New Roman" w:hAnsi="Times New Roman"/>
-          <w:b/>
-          <w:bCs/>
-          <w:sz w:val="20"/>
-          <w:szCs w:val="20"/>
-        </w:rPr>
-        <w:t xml:space="preserve">Segregação de responsabilidade: </w:t>
-      </w:r>
-      <w:r>
-        <w:rPr>
-          <w:rFonts w:ascii="Times New Roman" w:cs="Times New Roman" w:eastAsia="Times New Roman" w:hAnsi="Times New Roman"/>
-          <w:sz w:val="20"/>
-          <w:szCs w:val="20"/>
-        </w:rPr>
-        <w:t xml:space="preserve">o não atendimento da ET-08 é anterior à assunção — documentado no termo de assunção, é passivo do titular do ativo (Município), conforme o compromisso da 6.ª impugnação.</w:t>
-      </w:r>
-    </w:p>
-    <w:p>
-      <w:pPr>
-        <w:spacing w:after="60"/>
-        <w:ind w:left="360"/>
-      </w:pPr>
-      <w:r>
-        <w:rPr>
-          <w:rFonts w:ascii="Times New Roman" w:cs="Times New Roman" w:eastAsia="Times New Roman" w:hAnsi="Times New Roman"/>
-          <w:b/>
-          <w:bCs/>
-          <w:sz w:val="20"/>
-          <w:szCs w:val="20"/>
-        </w:rPr>
-        <w:t xml:space="preserve">2. </w:t>
-      </w:r>
-      <w:r>
-        <w:rPr>
-          <w:rFonts w:ascii="Times New Roman" w:cs="Times New Roman" w:eastAsia="Times New Roman" w:hAnsi="Times New Roman"/>
-          <w:b/>
-          <w:bCs/>
-          <w:sz w:val="20"/>
-          <w:szCs w:val="20"/>
-        </w:rPr>
-        <w:t xml:space="preserve">Inviabilidade da operação pelo Item 2: </w:t>
-      </w:r>
-      <w:r>
-        <w:rPr>
-          <w:rFonts w:ascii="Times New Roman" w:cs="Times New Roman" w:eastAsia="Times New Roman" w:hAnsi="Times New Roman"/>
-          <w:sz w:val="20"/>
-          <w:szCs w:val="20"/>
-        </w:rPr>
-        <w:t xml:space="preserve">se a vala não atende as exigências técnicas da LO, a disposição de resíduos ali não pode prosseguir sem regularização pelo titular da licença. A contratada não pode operar em desacordo com as condicionantes da licença ambiental.</w:t>
-      </w:r>
-    </w:p>
-    <w:p>
-      <w:pPr>
-        <w:pStyle w:val="Heading3"/>
-        <w:spacing w:after="120" w:before="200"/>
-      </w:pPr>
-      <w:r>
-        <w:rPr>
-          <w:rFonts w:ascii="Times New Roman" w:cs="Times New Roman" w:eastAsia="Times New Roman" w:hAnsi="Times New Roman"/>
-          <w:b/>
-          <w:bCs/>
-          <w:sz w:val="26"/>
-          <w:szCs w:val="26"/>
-        </w:rPr>
-        <w:t xml:space="preserve">Etapa 4 — Comunicação ao CONTRATANTE e transição ao Item 3</w:t>
-      </w:r>
-    </w:p>
-    <w:p>
-      <w:pPr>
-        <w:spacing w:after="120" w:before="0" w:line="276"/>
-        <w:jc w:val="both"/>
-      </w:pPr>
-      <w:r>
-        <w:rPr>
-          <w:rFonts w:ascii="Times New Roman" w:cs="Times New Roman" w:eastAsia="Times New Roman" w:hAnsi="Times New Roman"/>
-          <w:b/>
-          <w:bCs/>
-          <w:sz w:val="24"/>
-          <w:szCs w:val="24"/>
-        </w:rPr>
-        <w:t xml:space="preserve">Quando: </w:t>
-      </w:r>
-      <w:r>
-        <w:rPr>
-          <w:rFonts w:ascii="Times New Roman" w:cs="Times New Roman" w:eastAsia="Times New Roman" w:hAnsi="Times New Roman"/>
-          <w:sz w:val="24"/>
-          <w:szCs w:val="24"/>
-        </w:rPr>
-        <w:t xml:space="preserve">após a conclusão do laudo.</w:t>
-      </w:r>
-    </w:p>
-    <w:p>
-      <w:pPr>
-        <w:spacing w:after="120" w:before="0" w:line="276"/>
-        <w:jc w:val="both"/>
-      </w:pPr>
-      <w:r>
-        <w:rPr>
-          <w:rFonts w:ascii="Times New Roman" w:cs="Times New Roman" w:eastAsia="Times New Roman" w:hAnsi="Times New Roman"/>
-          <w:sz w:val="24"/>
-          <w:szCs w:val="24"/>
-        </w:rPr>
-        <w:t xml:space="preserve">Ofício ao CONTRATANTE comunicando os achados do termo de assunção e a consequência contratual. Tom cooperativo — a contratada está compartilhando o resultado do levantamento e solicitando a transição prevista no contrato.</w:t>
-      </w:r>
-    </w:p>
-    <w:p>
-      <w:pPr>
-        <w:spacing w:after="120" w:before="0" w:line="276"/>
-        <w:jc w:val="both"/>
-      </w:pPr>
-      <w:r>
-        <w:rPr>
-          <w:rFonts w:ascii="Times New Roman" w:cs="Times New Roman" w:eastAsia="Times New Roman" w:hAnsi="Times New Roman"/>
-          <w:b/>
-          <w:bCs/>
-          <w:sz w:val="24"/>
-          <w:szCs w:val="24"/>
-        </w:rPr>
-        <w:t xml:space="preserve">O ofício:</w:t>
-      </w:r>
-    </w:p>
-    <w:p>
-      <w:pPr>
-        <w:spacing w:after="60"/>
-        <w:ind w:left="360"/>
-      </w:pPr>
-      <w:r>
-        <w:rPr>
-          <w:rFonts w:ascii="Times New Roman" w:cs="Times New Roman" w:eastAsia="Times New Roman" w:hAnsi="Times New Roman"/>
-          <w:b/>
-          <w:bCs/>
-          <w:sz w:val="20"/>
-          <w:szCs w:val="20"/>
-        </w:rPr>
-        <w:t xml:space="preserve">1. </w:t>
-      </w:r>
-      <w:r>
-        <w:rPr>
-          <w:rFonts w:ascii="Times New Roman" w:cs="Times New Roman" w:eastAsia="Times New Roman" w:hAnsi="Times New Roman"/>
-          <w:sz w:val="20"/>
-          <w:szCs w:val="20"/>
-        </w:rPr>
-        <w:t xml:space="preserve">Apresenta os achados do termo de assunção quanto à ET-08;</w:t>
-      </w:r>
-    </w:p>
-    <w:p>
-      <w:pPr>
-        <w:spacing w:after="60"/>
-        <w:ind w:left="360"/>
-      </w:pPr>
-      <w:r>
-        <w:rPr>
-          <w:rFonts w:ascii="Times New Roman" w:cs="Times New Roman" w:eastAsia="Times New Roman" w:hAnsi="Times New Roman"/>
-          <w:b/>
-          <w:bCs/>
-          <w:sz w:val="20"/>
-          <w:szCs w:val="20"/>
-        </w:rPr>
-        <w:t xml:space="preserve">2. </w:t>
-      </w:r>
-      <w:r>
-        <w:rPr>
-          <w:rFonts w:ascii="Times New Roman" w:cs="Times New Roman" w:eastAsia="Times New Roman" w:hAnsi="Times New Roman"/>
-          <w:sz w:val="20"/>
-          <w:szCs w:val="20"/>
-        </w:rPr>
-        <w:t xml:space="preserve">Registra que a vala não atende as exigências técnicas da LO, e que operar nessas condições expõe tanto a contratada quanto o Município;</w:t>
-      </w:r>
-    </w:p>
-    <w:p>
-      <w:pPr>
-        <w:spacing w:after="60"/>
-        <w:ind w:left="360"/>
-      </w:pPr>
-      <w:r>
-        <w:rPr>
-          <w:rFonts w:ascii="Times New Roman" w:cs="Times New Roman" w:eastAsia="Times New Roman" w:hAnsi="Times New Roman"/>
-          <w:b/>
-          <w:bCs/>
-          <w:sz w:val="20"/>
-          <w:szCs w:val="20"/>
-        </w:rPr>
-        <w:t xml:space="preserve">3. </w:t>
-      </w:r>
-      <w:r>
-        <w:rPr>
-          <w:rFonts w:ascii="Times New Roman" w:cs="Times New Roman" w:eastAsia="Times New Roman" w:hAnsi="Times New Roman"/>
-          <w:sz w:val="20"/>
-          <w:szCs w:val="20"/>
-        </w:rPr>
-        <w:t xml:space="preserve">Registra que, sendo o Município o titular da LO e do ativo, a regularização de condicionantes preexistentes é de sua competência;</w:t>
-      </w:r>
-    </w:p>
-    <w:p>
-      <w:pPr>
-        <w:spacing w:after="60"/>
-        <w:ind w:left="360"/>
-      </w:pPr>
-      <w:r>
-        <w:rPr>
-          <w:rFonts w:ascii="Times New Roman" w:cs="Times New Roman" w:eastAsia="Times New Roman" w:hAnsi="Times New Roman"/>
-          <w:b/>
-          <w:bCs/>
-          <w:sz w:val="20"/>
-          <w:szCs w:val="20"/>
-        </w:rPr>
-        <w:t xml:space="preserve">4. </w:t>
-      </w:r>
-      <w:r>
-        <w:rPr>
-          <w:rFonts w:ascii="Times New Roman" w:cs="Times New Roman" w:eastAsia="Times New Roman" w:hAnsi="Times New Roman"/>
-          <w:sz w:val="20"/>
-          <w:szCs w:val="20"/>
-        </w:rPr>
-        <w:t xml:space="preserve">Conclui que, não sendo possível a disposição na Vala 05 nas condições atuais, a operação deve transitar para o Item 3 (destinação externa), nos termos do contrato;</w:t>
-      </w:r>
-    </w:p>
-    <w:p>
-      <w:pPr>
-        <w:spacing w:after="60"/>
-        <w:ind w:left="360"/>
-      </w:pPr>
-      <w:r>
-        <w:rPr>
-          <w:rFonts w:ascii="Times New Roman" w:cs="Times New Roman" w:eastAsia="Times New Roman" w:hAnsi="Times New Roman"/>
-          <w:b/>
-          <w:bCs/>
-          <w:sz w:val="20"/>
-          <w:szCs w:val="20"/>
-        </w:rPr>
-        <w:t xml:space="preserve">5. </w:t>
-      </w:r>
-      <w:r>
-        <w:rPr>
-          <w:rFonts w:ascii="Times New Roman" w:cs="Times New Roman" w:eastAsia="Times New Roman" w:hAnsi="Times New Roman"/>
-          <w:sz w:val="20"/>
-          <w:szCs w:val="20"/>
-        </w:rPr>
-        <w:t xml:space="preserve">Solicita orientação formal do CONTRATANTE para a transição.</w:t>
-      </w:r>
-    </w:p>
-    <w:p>
-      <w:pPr>
-        <w:spacing w:after="120" w:before="120" w:line="276"/>
-        <w:jc w:val="both"/>
-      </w:pPr>
-      <w:r>
-        <w:rPr>
-          <w:rFonts w:ascii="Times New Roman" w:cs="Times New Roman" w:eastAsia="Times New Roman" w:hAnsi="Times New Roman"/>
-          <w:b/>
-          <w:bCs/>
-          <w:sz w:val="24"/>
-          <w:szCs w:val="24"/>
-        </w:rPr>
-        <w:t xml:space="preserve">Desdobramentos possíveis:</w:t>
+        <w:t xml:space="preserve">Ofício ao CONTRATANTE comunicando os achados do termo de assunção e a consequência contratual. A contratada apresenta os achados quanto à ET-08, registra que a operação na vala nas condições atuais expõe ambas as partes, que a regularização de condicionantes preexistentes é competência do titular da LO (Município), e solicita orientação formal para a transição ao Item 3.</w:t>
       </w:r>
     </w:p>
     <w:tbl>

</xml_diff>

<commit_message>
Adiciona tabela com as 8 exigências técnicas da LO na Etapa 3
Lista completa das ETs da LO CETESB n.º 4011055 (ET-01 a ET-08)
inserida antes da discussão específica da ET-08.

Co-Authored-By: Claude Opus 4.6 <noreply@anthropic.com>
Claude-Session: https://claude.ai/code/session_01JB8NzdiM6CkTNUriijoKhD
</commit_message>
<xml_diff>
--- a/licitacoes-14133/porto-ferreira/docs/ESTRATEGIA_termo_assuncao_ET08.docx
+++ b/licitacoes-14133/porto-ferreira/docs/ESTRATEGIA_termo_assuncao_ET08.docx
@@ -2053,7 +2053,518 @@
           <w:sz w:val="24"/>
           <w:szCs w:val="24"/>
         </w:rPr>
-        <w:t xml:space="preserve">A ET-08 da LO exige a implantação "em </w:t>
+        <w:t xml:space="preserve">Exigências técnicas da LO CETESB n.º 4011055:</w:t>
+      </w:r>
+    </w:p>
+    <w:tbl>
+      <w:tblPr>
+        <w:tblW w:type="dxa" w:w="9800"/>
+        <w:tblBorders>
+          <w:top w:val="single" w:color="auto" w:sz="4"/>
+          <w:left w:val="single" w:color="auto" w:sz="4"/>
+          <w:bottom w:val="single" w:color="auto" w:sz="4"/>
+          <w:right w:val="single" w:color="auto" w:sz="4"/>
+          <w:insideH w:val="single" w:color="auto" w:sz="4"/>
+          <w:insideV w:val="single" w:color="auto" w:sz="4"/>
+        </w:tblBorders>
+        <w:tblLayout w:type="fixed"/>
+      </w:tblPr>
+      <w:tblGrid>
+        <w:gridCol w:w="600"/>
+        <w:gridCol w:w="9200"/>
+      </w:tblGrid>
+      <w:tr>
+        <w:trPr>
+          <w:tblHeader/>
+        </w:trPr>
+        <w:tc>
+          <w:tcPr>
+            <w:tcW w:type="dxa" w:w="600"/>
+            <w:tcBorders>
+              <w:top w:val="single" w:color="999999" w:sz="1"/>
+              <w:left w:val="single" w:color="999999" w:sz="1"/>
+              <w:bottom w:val="single" w:color="999999" w:sz="1"/>
+              <w:right w:val="single" w:color="999999" w:sz="1"/>
+            </w:tcBorders>
+            <w:shd w:fill="1F3864" w:color="auto" w:val="clear"/>
+          </w:tcPr>
+          <w:p>
+            <w:pPr>
+              <w:spacing w:after="40" w:before="40"/>
+              <w:jc w:val="left"/>
+            </w:pPr>
+            <w:r>
+              <w:rPr>
+                <w:rFonts w:ascii="Times New Roman" w:cs="Times New Roman" w:eastAsia="Times New Roman" w:hAnsi="Times New Roman"/>
+                <w:b/>
+                <w:bCs/>
+                <w:color w:val="FFFFFF"/>
+                <w:sz w:val="20"/>
+                <w:szCs w:val="20"/>
+              </w:rPr>
+              <w:t xml:space="preserve">ET</w:t>
+            </w:r>
+          </w:p>
+        </w:tc>
+        <w:tc>
+          <w:tcPr>
+            <w:tcW w:type="dxa" w:w="9200"/>
+            <w:tcBorders>
+              <w:top w:val="single" w:color="999999" w:sz="1"/>
+              <w:left w:val="single" w:color="999999" w:sz="1"/>
+              <w:bottom w:val="single" w:color="999999" w:sz="1"/>
+              <w:right w:val="single" w:color="999999" w:sz="1"/>
+            </w:tcBorders>
+            <w:shd w:fill="1F3864" w:color="auto" w:val="clear"/>
+          </w:tcPr>
+          <w:p>
+            <w:pPr>
+              <w:spacing w:after="40" w:before="40"/>
+              <w:jc w:val="left"/>
+            </w:pPr>
+            <w:r>
+              <w:rPr>
+                <w:rFonts w:ascii="Times New Roman" w:cs="Times New Roman" w:eastAsia="Times New Roman" w:hAnsi="Times New Roman"/>
+                <w:b/>
+                <w:bCs/>
+                <w:color w:val="FFFFFF"/>
+                <w:sz w:val="20"/>
+                <w:szCs w:val="20"/>
+              </w:rPr>
+              <w:t xml:space="preserve">Exigência</w:t>
+            </w:r>
+          </w:p>
+        </w:tc>
+      </w:tr>
+      <w:tr>
+        <w:tc>
+          <w:tcPr>
+            <w:tcW w:type="dxa" w:w="600"/>
+            <w:tcBorders>
+              <w:top w:val="single" w:color="999999" w:sz="1"/>
+              <w:left w:val="single" w:color="999999" w:sz="1"/>
+              <w:bottom w:val="single" w:color="999999" w:sz="1"/>
+              <w:right w:val="single" w:color="999999" w:sz="1"/>
+            </w:tcBorders>
+          </w:tcPr>
+          <w:p>
+            <w:pPr>
+              <w:spacing w:after="40" w:before="40"/>
+              <w:jc w:val="left"/>
+            </w:pPr>
+            <w:r>
+              <w:rPr>
+                <w:rFonts w:ascii="Times New Roman" w:cs="Times New Roman" w:eastAsia="Times New Roman" w:hAnsi="Times New Roman"/>
+                <w:sz w:val="20"/>
+                <w:szCs w:val="20"/>
+              </w:rPr>
+              <w:t xml:space="preserve">01</w:t>
+            </w:r>
+          </w:p>
+        </w:tc>
+        <w:tc>
+          <w:tcPr>
+            <w:tcW w:type="dxa" w:w="9200"/>
+            <w:tcBorders>
+              <w:top w:val="single" w:color="999999" w:sz="1"/>
+              <w:left w:val="single" w:color="999999" w:sz="1"/>
+              <w:bottom w:val="single" w:color="999999" w:sz="1"/>
+              <w:right w:val="single" w:color="999999" w:sz="1"/>
+            </w:tcBorders>
+          </w:tcPr>
+          <w:p>
+            <w:pPr>
+              <w:spacing w:after="40" w:before="40"/>
+              <w:jc w:val="left"/>
+            </w:pPr>
+            <w:r>
+              <w:rPr>
+                <w:rFonts w:ascii="Times New Roman" w:cs="Times New Roman" w:eastAsia="Times New Roman" w:hAnsi="Times New Roman"/>
+                <w:sz w:val="20"/>
+                <w:szCs w:val="20"/>
+              </w:rPr>
+              <w:t xml:space="preserve">Os Resíduos Sólidos Domiciliares destinados ao aterro deverão ser devidamente compactados e recobertos com camada de terra diariamente</w:t>
+            </w:r>
+          </w:p>
+        </w:tc>
+      </w:tr>
+      <w:tr>
+        <w:tc>
+          <w:tcPr>
+            <w:tcW w:type="dxa" w:w="600"/>
+            <w:tcBorders>
+              <w:top w:val="single" w:color="999999" w:sz="1"/>
+              <w:left w:val="single" w:color="999999" w:sz="1"/>
+              <w:bottom w:val="single" w:color="999999" w:sz="1"/>
+              <w:right w:val="single" w:color="999999" w:sz="1"/>
+            </w:tcBorders>
+          </w:tcPr>
+          <w:p>
+            <w:pPr>
+              <w:spacing w:after="40" w:before="40"/>
+              <w:jc w:val="left"/>
+            </w:pPr>
+            <w:r>
+              <w:rPr>
+                <w:rFonts w:ascii="Times New Roman" w:cs="Times New Roman" w:eastAsia="Times New Roman" w:hAnsi="Times New Roman"/>
+                <w:sz w:val="20"/>
+                <w:szCs w:val="20"/>
+              </w:rPr>
+              <w:t xml:space="preserve">02</w:t>
+            </w:r>
+          </w:p>
+        </w:tc>
+        <w:tc>
+          <w:tcPr>
+            <w:tcW w:type="dxa" w:w="9200"/>
+            <w:tcBorders>
+              <w:top w:val="single" w:color="999999" w:sz="1"/>
+              <w:left w:val="single" w:color="999999" w:sz="1"/>
+              <w:bottom w:val="single" w:color="999999" w:sz="1"/>
+              <w:right w:val="single" w:color="999999" w:sz="1"/>
+            </w:tcBorders>
+          </w:tcPr>
+          <w:p>
+            <w:pPr>
+              <w:spacing w:after="40" w:before="40"/>
+              <w:jc w:val="left"/>
+            </w:pPr>
+            <w:r>
+              <w:rPr>
+                <w:rFonts w:ascii="Times New Roman" w:cs="Times New Roman" w:eastAsia="Times New Roman" w:hAnsi="Times New Roman"/>
+                <w:sz w:val="20"/>
+                <w:szCs w:val="20"/>
+              </w:rPr>
+              <w:t xml:space="preserve">Deverão ser observados todos os aspectos previstos no Índice de Qualidade de Resíduos (IQR), de modo a manter as condições adequadas do empreendimento</w:t>
+            </w:r>
+          </w:p>
+        </w:tc>
+      </w:tr>
+      <w:tr>
+        <w:tc>
+          <w:tcPr>
+            <w:tcW w:type="dxa" w:w="600"/>
+            <w:tcBorders>
+              <w:top w:val="single" w:color="999999" w:sz="1"/>
+              <w:left w:val="single" w:color="999999" w:sz="1"/>
+              <w:bottom w:val="single" w:color="999999" w:sz="1"/>
+              <w:right w:val="single" w:color="999999" w:sz="1"/>
+            </w:tcBorders>
+          </w:tcPr>
+          <w:p>
+            <w:pPr>
+              <w:spacing w:after="40" w:before="40"/>
+              <w:jc w:val="left"/>
+            </w:pPr>
+            <w:r>
+              <w:rPr>
+                <w:rFonts w:ascii="Times New Roman" w:cs="Times New Roman" w:eastAsia="Times New Roman" w:hAnsi="Times New Roman"/>
+                <w:sz w:val="20"/>
+                <w:szCs w:val="20"/>
+              </w:rPr>
+              <w:t xml:space="preserve">03</w:t>
+            </w:r>
+          </w:p>
+        </w:tc>
+        <w:tc>
+          <w:tcPr>
+            <w:tcW w:type="dxa" w:w="9200"/>
+            <w:tcBorders>
+              <w:top w:val="single" w:color="999999" w:sz="1"/>
+              <w:left w:val="single" w:color="999999" w:sz="1"/>
+              <w:bottom w:val="single" w:color="999999" w:sz="1"/>
+              <w:right w:val="single" w:color="999999" w:sz="1"/>
+            </w:tcBorders>
+          </w:tcPr>
+          <w:p>
+            <w:pPr>
+              <w:spacing w:after="40" w:before="40"/>
+              <w:jc w:val="left"/>
+            </w:pPr>
+            <w:r>
+              <w:rPr>
+                <w:rFonts w:ascii="Times New Roman" w:cs="Times New Roman" w:eastAsia="Times New Roman" w:hAnsi="Times New Roman"/>
+                <w:sz w:val="20"/>
+                <w:szCs w:val="20"/>
+              </w:rPr>
+              <w:t xml:space="preserve">Manter adequadamente a cortina vegetal existente com a finalidade de favorecer o isolamento visual do local</w:t>
+            </w:r>
+          </w:p>
+        </w:tc>
+      </w:tr>
+      <w:tr>
+        <w:tc>
+          <w:tcPr>
+            <w:tcW w:type="dxa" w:w="600"/>
+            <w:tcBorders>
+              <w:top w:val="single" w:color="999999" w:sz="1"/>
+              <w:left w:val="single" w:color="999999" w:sz="1"/>
+              <w:bottom w:val="single" w:color="999999" w:sz="1"/>
+              <w:right w:val="single" w:color="999999" w:sz="1"/>
+            </w:tcBorders>
+          </w:tcPr>
+          <w:p>
+            <w:pPr>
+              <w:spacing w:after="40" w:before="40"/>
+              <w:jc w:val="left"/>
+            </w:pPr>
+            <w:r>
+              <w:rPr>
+                <w:rFonts w:ascii="Times New Roman" w:cs="Times New Roman" w:eastAsia="Times New Roman" w:hAnsi="Times New Roman"/>
+                <w:sz w:val="20"/>
+                <w:szCs w:val="20"/>
+              </w:rPr>
+              <w:t xml:space="preserve">04</w:t>
+            </w:r>
+          </w:p>
+        </w:tc>
+        <w:tc>
+          <w:tcPr>
+            <w:tcW w:type="dxa" w:w="9200"/>
+            <w:tcBorders>
+              <w:top w:val="single" w:color="999999" w:sz="1"/>
+              <w:left w:val="single" w:color="999999" w:sz="1"/>
+              <w:bottom w:val="single" w:color="999999" w:sz="1"/>
+              <w:right w:val="single" w:color="999999" w:sz="1"/>
+            </w:tcBorders>
+          </w:tcPr>
+          <w:p>
+            <w:pPr>
+              <w:spacing w:after="40" w:before="40"/>
+              <w:jc w:val="left"/>
+            </w:pPr>
+            <w:r>
+              <w:rPr>
+                <w:rFonts w:ascii="Times New Roman" w:cs="Times New Roman" w:eastAsia="Times New Roman" w:hAnsi="Times New Roman"/>
+                <w:sz w:val="20"/>
+                <w:szCs w:val="20"/>
+              </w:rPr>
+              <w:t xml:space="preserve">Operar e manter adequadamente o sistema de coleta, armazenamento e drenagem de águas pluviais, de modo a evitar o extravasamento dessas águas para fora dos limites da área do empreendimento e formação de processos erosivos</w:t>
+            </w:r>
+          </w:p>
+        </w:tc>
+      </w:tr>
+      <w:tr>
+        <w:tc>
+          <w:tcPr>
+            <w:tcW w:type="dxa" w:w="600"/>
+            <w:tcBorders>
+              <w:top w:val="single" w:color="999999" w:sz="1"/>
+              <w:left w:val="single" w:color="999999" w:sz="1"/>
+              <w:bottom w:val="single" w:color="999999" w:sz="1"/>
+              <w:right w:val="single" w:color="999999" w:sz="1"/>
+            </w:tcBorders>
+          </w:tcPr>
+          <w:p>
+            <w:pPr>
+              <w:spacing w:after="40" w:before="40"/>
+              <w:jc w:val="left"/>
+            </w:pPr>
+            <w:r>
+              <w:rPr>
+                <w:rFonts w:ascii="Times New Roman" w:cs="Times New Roman" w:eastAsia="Times New Roman" w:hAnsi="Times New Roman"/>
+                <w:sz w:val="20"/>
+                <w:szCs w:val="20"/>
+              </w:rPr>
+              <w:t xml:space="preserve">05</w:t>
+            </w:r>
+          </w:p>
+        </w:tc>
+        <w:tc>
+          <w:tcPr>
+            <w:tcW w:type="dxa" w:w="9200"/>
+            <w:tcBorders>
+              <w:top w:val="single" w:color="999999" w:sz="1"/>
+              <w:left w:val="single" w:color="999999" w:sz="1"/>
+              <w:bottom w:val="single" w:color="999999" w:sz="1"/>
+              <w:right w:val="single" w:color="999999" w:sz="1"/>
+            </w:tcBorders>
+          </w:tcPr>
+          <w:p>
+            <w:pPr>
+              <w:spacing w:after="40" w:before="40"/>
+              <w:jc w:val="left"/>
+            </w:pPr>
+            <w:r>
+              <w:rPr>
+                <w:rFonts w:ascii="Times New Roman" w:cs="Times New Roman" w:eastAsia="Times New Roman" w:hAnsi="Times New Roman"/>
+                <w:sz w:val="20"/>
+                <w:szCs w:val="20"/>
+              </w:rPr>
+              <w:t xml:space="preserve">Ficam vedadas a disposição de poda de árvores e entulhos no interior das valas</w:t>
+            </w:r>
+          </w:p>
+        </w:tc>
+      </w:tr>
+      <w:tr>
+        <w:tc>
+          <w:tcPr>
+            <w:tcW w:type="dxa" w:w="600"/>
+            <w:tcBorders>
+              <w:top w:val="single" w:color="999999" w:sz="1"/>
+              <w:left w:val="single" w:color="999999" w:sz="1"/>
+              <w:bottom w:val="single" w:color="999999" w:sz="1"/>
+              <w:right w:val="single" w:color="999999" w:sz="1"/>
+            </w:tcBorders>
+          </w:tcPr>
+          <w:p>
+            <w:pPr>
+              <w:spacing w:after="40" w:before="40"/>
+              <w:jc w:val="left"/>
+            </w:pPr>
+            <w:r>
+              <w:rPr>
+                <w:rFonts w:ascii="Times New Roman" w:cs="Times New Roman" w:eastAsia="Times New Roman" w:hAnsi="Times New Roman"/>
+                <w:sz w:val="20"/>
+                <w:szCs w:val="20"/>
+              </w:rPr>
+              <w:t xml:space="preserve">06</w:t>
+            </w:r>
+          </w:p>
+        </w:tc>
+        <w:tc>
+          <w:tcPr>
+            <w:tcW w:type="dxa" w:w="9200"/>
+            <w:tcBorders>
+              <w:top w:val="single" w:color="999999" w:sz="1"/>
+              <w:left w:val="single" w:color="999999" w:sz="1"/>
+              <w:bottom w:val="single" w:color="999999" w:sz="1"/>
+              <w:right w:val="single" w:color="999999" w:sz="1"/>
+            </w:tcBorders>
+          </w:tcPr>
+          <w:p>
+            <w:pPr>
+              <w:spacing w:after="40" w:before="40"/>
+              <w:jc w:val="left"/>
+            </w:pPr>
+            <w:r>
+              <w:rPr>
+                <w:rFonts w:ascii="Times New Roman" w:cs="Times New Roman" w:eastAsia="Times New Roman" w:hAnsi="Times New Roman"/>
+                <w:sz w:val="20"/>
+                <w:szCs w:val="20"/>
+              </w:rPr>
+              <w:t xml:space="preserve">Fica proibida a disposição de resíduos de serviço de saúde e/ou industriais no aterro</w:t>
+            </w:r>
+          </w:p>
+        </w:tc>
+      </w:tr>
+      <w:tr>
+        <w:tc>
+          <w:tcPr>
+            <w:tcW w:type="dxa" w:w="600"/>
+            <w:tcBorders>
+              <w:top w:val="single" w:color="999999" w:sz="1"/>
+              <w:left w:val="single" w:color="999999" w:sz="1"/>
+              <w:bottom w:val="single" w:color="999999" w:sz="1"/>
+              <w:right w:val="single" w:color="999999" w:sz="1"/>
+            </w:tcBorders>
+          </w:tcPr>
+          <w:p>
+            <w:pPr>
+              <w:spacing w:after="40" w:before="40"/>
+              <w:jc w:val="left"/>
+            </w:pPr>
+            <w:r>
+              <w:rPr>
+                <w:rFonts w:ascii="Times New Roman" w:cs="Times New Roman" w:eastAsia="Times New Roman" w:hAnsi="Times New Roman"/>
+                <w:sz w:val="20"/>
+                <w:szCs w:val="20"/>
+              </w:rPr>
+              <w:t xml:space="preserve">07</w:t>
+            </w:r>
+          </w:p>
+        </w:tc>
+        <w:tc>
+          <w:tcPr>
+            <w:tcW w:type="dxa" w:w="9200"/>
+            <w:tcBorders>
+              <w:top w:val="single" w:color="999999" w:sz="1"/>
+              <w:left w:val="single" w:color="999999" w:sz="1"/>
+              <w:bottom w:val="single" w:color="999999" w:sz="1"/>
+              <w:right w:val="single" w:color="999999" w:sz="1"/>
+            </w:tcBorders>
+          </w:tcPr>
+          <w:p>
+            <w:pPr>
+              <w:spacing w:after="40" w:before="40"/>
+              <w:jc w:val="left"/>
+            </w:pPr>
+            <w:r>
+              <w:rPr>
+                <w:rFonts w:ascii="Times New Roman" w:cs="Times New Roman" w:eastAsia="Times New Roman" w:hAnsi="Times New Roman"/>
+                <w:sz w:val="20"/>
+                <w:szCs w:val="20"/>
+              </w:rPr>
+              <w:t xml:space="preserve">Fica proibida a queima de resíduos a céu aberto de qualquer natureza</w:t>
+            </w:r>
+          </w:p>
+        </w:tc>
+      </w:tr>
+      <w:tr>
+        <w:tc>
+          <w:tcPr>
+            <w:tcW w:type="dxa" w:w="600"/>
+            <w:tcBorders>
+              <w:top w:val="single" w:color="999999" w:sz="1"/>
+              <w:left w:val="single" w:color="999999" w:sz="1"/>
+              <w:bottom w:val="single" w:color="999999" w:sz="1"/>
+              <w:right w:val="single" w:color="999999" w:sz="1"/>
+            </w:tcBorders>
+          </w:tcPr>
+          <w:p>
+            <w:pPr>
+              <w:spacing w:after="40" w:before="40"/>
+              <w:jc w:val="left"/>
+            </w:pPr>
+            <w:r>
+              <w:rPr>
+                <w:rFonts w:ascii="Times New Roman" w:cs="Times New Roman" w:eastAsia="Times New Roman" w:hAnsi="Times New Roman"/>
+                <w:sz w:val="20"/>
+                <w:szCs w:val="20"/>
+              </w:rPr>
+              <w:t xml:space="preserve">08</w:t>
+            </w:r>
+          </w:p>
+        </w:tc>
+        <w:tc>
+          <w:tcPr>
+            <w:tcW w:type="dxa" w:w="9200"/>
+            <w:tcBorders>
+              <w:top w:val="single" w:color="999999" w:sz="1"/>
+              <w:left w:val="single" w:color="999999" w:sz="1"/>
+              <w:bottom w:val="single" w:color="999999" w:sz="1"/>
+              <w:right w:val="single" w:color="999999" w:sz="1"/>
+            </w:tcBorders>
+          </w:tcPr>
+          <w:p>
+            <w:pPr>
+              <w:spacing w:after="40" w:before="40"/>
+              <w:jc w:val="left"/>
+            </w:pPr>
+            <w:r>
+              <w:rPr>
+                <w:rFonts w:ascii="Times New Roman" w:cs="Times New Roman" w:eastAsia="Times New Roman" w:hAnsi="Times New Roman"/>
+                <w:sz w:val="20"/>
+                <w:szCs w:val="20"/>
+              </w:rPr>
+              <w:t xml:space="preserve">Implantar em toda a Vala nº 05 sistema de drenagem de chorume, impermeabilização (manta de PEAD) e drenagem de gases</w:t>
+            </w:r>
+          </w:p>
+        </w:tc>
+      </w:tr>
+    </w:tbl>
+    <w:p>
+      <w:pPr>
+        <w:spacing w:after="120" w:before="0" w:line="276"/>
+        <w:jc w:val="both"/>
+      </w:pPr>
+      <w:r>
+        <w:rPr>
+          <w:rFonts w:ascii="Times New Roman" w:cs="Times New Roman" w:eastAsia="Times New Roman" w:hAnsi="Times New Roman"/>
+          <w:sz w:val="24"/>
+          <w:szCs w:val="24"/>
+        </w:rPr>
+        <w:t xml:space="preserve">A ET-08 exige a implantação "em </w:t>
       </w:r>
       <w:r>
         <w:rPr>

</xml_diff>